<commit_message>
Integrate updated Chapter 5 deck
</commit_message>
<xml_diff>
--- a/public/chapter-5/Chapter5 Mécanisme de Stress.docx
+++ b/public/chapter-5/Chapter5 Mécanisme de Stress.docx
@@ -1,6 +1,6 @@
 
 <file path=word/document.xml><?xml version="1.0" encoding="utf-8"?>
-<w:document xmlns:wpc="http://schemas.microsoft.com/office/word/2010/wordprocessingCanvas" xmlns:cx="http://schemas.microsoft.com/office/drawing/2014/chartex" xmlns:cx1="http://schemas.microsoft.com/office/drawing/2015/9/8/chartex" xmlns:cx2="http://schemas.microsoft.com/office/drawing/2015/10/21/chartex" xmlns:cx3="http://schemas.microsoft.com/office/drawing/2016/5/9/chartex" xmlns:cx4="http://schemas.microsoft.com/office/drawing/2016/5/10/chartex" xmlns:cx5="http://schemas.microsoft.com/office/drawing/2016/5/11/chartex" xmlns:cx6="http://schemas.microsoft.com/office/drawing/2016/5/12/chartex" xmlns:cx7="http://schemas.microsoft.com/office/drawing/2016/5/13/chartex" xmlns:cx8="http://schemas.microsoft.com/office/drawing/2016/5/14/chartex" xmlns:mc="http://schemas.openxmlformats.org/markup-compatibility/2006" xmlns:aink="http://schemas.microsoft.com/office/drawing/2016/ink" xmlns:am3d="http://schemas.microsoft.com/office/drawing/2017/model3d" xmlns:o="urn:schemas-microsoft-com:office:office" xmlns:oel="http://schemas.microsoft.com/office/2019/extlst" xmlns:r="http://schemas.openxmlformats.org/officeDocument/2006/relationships" xmlns:m="http://schemas.openxmlformats.org/officeDocument/2006/math" xmlns:v="urn:schemas-microsoft-com:vml" xmlns:wp14="http://schemas.microsoft.com/office/word/2010/wordprocessingDrawing" xmlns:wp="http://schemas.openxmlformats.org/drawingml/2006/wordprocessingDrawing" xmlns:w10="urn:schemas-microsoft-com:office:word" xmlns:w="http://schemas.openxmlformats.org/wordprocessingml/2006/main" xmlns:w14="http://schemas.microsoft.com/office/word/2010/wordml" xmlns:w15="http://schemas.microsoft.com/office/word/2012/wordml" xmlns:w16cex="http://schemas.microsoft.com/office/word/2018/wordml/cex" xmlns:w16cid="http://schemas.microsoft.com/office/word/2016/wordml/cid" xmlns:w16="http://schemas.microsoft.com/office/word/2018/wordml" xmlns:w16du="http://schemas.microsoft.com/office/word/2023/wordml/word16du" xmlns:w16sdtdh="http://schemas.microsoft.com/office/word/2020/wordml/sdtdatahash" xmlns:w16sdtfl="http://schemas.microsoft.com/office/word/2024/wordml/sdtformatlock" xmlns:w16se="http://schemas.microsoft.com/office/word/2015/wordml/symex" xmlns:wpg="http://schemas.microsoft.com/office/word/2010/wordprocessingGroup" xmlns:wpi="http://schemas.microsoft.com/office/word/2010/wordprocessingInk" xmlns:wne="http://schemas.microsoft.com/office/word/2006/wordml" xmlns:wps="http://schemas.microsoft.com/office/word/2010/wordprocessingShape" mc:Ignorable="w14 w15 w16se w16cid w16 w16cex w16sdtdh w16sdtfl w16du wp14">
+<w:document xmlns:wpc="http://schemas.microsoft.com/office/word/2010/wordprocessingCanvas" xmlns:cx="http://schemas.microsoft.com/office/drawing/2014/chartex" xmlns:cx1="http://schemas.microsoft.com/office/drawing/2015/9/8/chartex" xmlns:cx2="http://schemas.microsoft.com/office/drawing/2015/10/21/chartex" xmlns:cx3="http://schemas.microsoft.com/office/drawing/2016/5/9/chartex" xmlns:cx4="http://schemas.microsoft.com/office/drawing/2016/5/10/chartex" xmlns:cx5="http://schemas.microsoft.com/office/drawing/2016/5/11/chartex" xmlns:cx6="http://schemas.microsoft.com/office/drawing/2016/5/12/chartex" xmlns:cx7="http://schemas.microsoft.com/office/drawing/2016/5/13/chartex" xmlns:cx8="http://schemas.microsoft.com/office/drawing/2016/5/14/chartex" xmlns:mc="http://schemas.openxmlformats.org/markup-compatibility/2006" xmlns:aink="http://schemas.microsoft.com/office/drawing/2016/ink" xmlns:am3d="http://schemas.microsoft.com/office/drawing/2017/model3d" xmlns:o="urn:schemas-microsoft-com:office:office" xmlns:oel="http://schemas.microsoft.com/office/2019/extlst" xmlns:r="http://schemas.openxmlformats.org/officeDocument/2006/relationships" xmlns:m="http://schemas.openxmlformats.org/officeDocument/2006/math" xmlns:v="urn:schemas-microsoft-com:vml" xmlns:wp14="http://schemas.microsoft.com/office/word/2010/wordprocessingDrawing" xmlns:wp="http://schemas.openxmlformats.org/drawingml/2006/wordprocessingDrawing" xmlns:w10="urn:schemas-microsoft-com:office:word" xmlns:w="http://schemas.openxmlformats.org/wordprocessingml/2006/main" xmlns:w14="http://schemas.microsoft.com/office/word/2010/wordml" xmlns:w15="http://schemas.microsoft.com/office/word/2012/wordml" xmlns:w16cei="http://schemas.microsoft.com/office/word/2026/wordml/cei" xmlns:w16cex="http://schemas.microsoft.com/office/word/2018/wordml/cex" xmlns:w16cid="http://schemas.microsoft.com/office/word/2016/wordml/cid" xmlns:w16="http://schemas.microsoft.com/office/word/2018/wordml" xmlns:w16du="http://schemas.microsoft.com/office/word/2023/wordml/word16du" xmlns:w16sdtdh="http://schemas.microsoft.com/office/word/2020/wordml/sdtdatahash" xmlns:w16sdtfl="http://schemas.microsoft.com/office/word/2024/wordml/sdtformatlock" xmlns:w16se="http://schemas.microsoft.com/office/word/2015/wordml/symex" xmlns:wpg="http://schemas.microsoft.com/office/word/2010/wordprocessingGroup" xmlns:wpi="http://schemas.microsoft.com/office/word/2010/wordprocessingInk" xmlns:wne="http://schemas.microsoft.com/office/word/2006/wordml" xmlns:wps="http://schemas.microsoft.com/office/word/2010/wordprocessingShape" mc:Ignorable="w14 w15 w16se w16cid w16 w16cex w16sdtdh w16sdtfl w16du wp14">
   <w:body>
     <w:p>
       <w:pPr>
@@ -886,7 +886,7 @@
           <w:sz w:val="24"/>
           <w:szCs w:val="24"/>
         </w:rPr>
-        <w:t xml:space="preserve"> Système nerveux autonome, page…)</w:t>
+        <w:t xml:space="preserve"> Système nerveux autonome)</w:t>
       </w:r>
       <w:r>
         <w:rPr>
@@ -979,7 +979,7 @@
           <w:sz w:val="24"/>
           <w:szCs w:val="24"/>
         </w:rPr>
-        <w:t>Système nerveux central, Page …)</w:t>
+        <w:t>Système nerveux central, Page)</w:t>
       </w:r>
       <w:r>
         <w:rPr>
@@ -1006,24 +1006,32 @@
           <w:sz w:val="24"/>
           <w:szCs w:val="24"/>
         </w:rPr>
+        <w:t>Le mécanisme de stress est un phénomène protecteur fondamental de la vie auquel nous sommes tous soumis et pour lequel nou</w:t>
+      </w:r>
+      <w:r>
+        <w:rPr>
+          <w:rFonts w:ascii="Times New Roman" w:hAnsi="Times New Roman" w:cs="Times New Roman"/>
+          <w:sz w:val="24"/>
+          <w:szCs w:val="24"/>
+        </w:rPr>
+        <w:t>s sommes biologiquement prépar</w:t>
+      </w:r>
+      <w:r>
+        <w:rPr>
+          <w:rFonts w:ascii="Times New Roman" w:hAnsi="Times New Roman" w:cs="Times New Roman"/>
+          <w:sz w:val="24"/>
+          <w:szCs w:val="24"/>
+        </w:rPr>
+        <w:t xml:space="preserve">és. A court terme, le </w:t>
+      </w:r>
+      <w:r>
+        <w:rPr>
+          <w:rFonts w:ascii="Times New Roman" w:hAnsi="Times New Roman" w:cs="Times New Roman"/>
+          <w:sz w:val="24"/>
+          <w:szCs w:val="24"/>
+        </w:rPr>
         <w:lastRenderedPageBreak/>
-        <w:t>Le mécanisme de stress est un phénomène protecteur fondamental de la vie auquel nous sommes tous soumis et pour lequel nou</w:t>
-      </w:r>
-      <w:r>
-        <w:rPr>
-          <w:rFonts w:ascii="Times New Roman" w:hAnsi="Times New Roman" w:cs="Times New Roman"/>
-          <w:sz w:val="24"/>
-          <w:szCs w:val="24"/>
-        </w:rPr>
-        <w:t>s sommes biologiquement prépar</w:t>
-      </w:r>
-      <w:r>
-        <w:rPr>
-          <w:rFonts w:ascii="Times New Roman" w:hAnsi="Times New Roman" w:cs="Times New Roman"/>
-          <w:sz w:val="24"/>
-          <w:szCs w:val="24"/>
-        </w:rPr>
-        <w:t>és. A court terme, le mécanisme de stress est protecteur en vue du retour à l’</w:t>
+        <w:t>mécanisme de stress est protecteur en vue du retour à l’</w:t>
       </w:r>
       <w:r>
         <w:rPr>
@@ -1858,159 +1866,8 @@
           <w:sz w:val="24"/>
           <w:szCs w:val="24"/>
         </w:rPr>
-        <w:t xml:space="preserve">pouvant soutenir une réponse adaptative favorable à court </w:t>
-      </w:r>
-      <w:proofErr w:type="gramStart"/>
-      <w:r>
-        <w:rPr>
-          <w:rFonts w:ascii="Times New Roman" w:hAnsi="Times New Roman" w:cs="Times New Roman"/>
-          <w:sz w:val="24"/>
-          <w:szCs w:val="24"/>
-        </w:rPr>
-        <w:t>terme.</w:t>
-      </w:r>
-      <w:r>
-        <w:rPr>
-          <w:rFonts w:ascii="Times New Roman" w:hAnsi="Times New Roman" w:cs="Times New Roman"/>
-          <w:sz w:val="24"/>
-          <w:szCs w:val="24"/>
-        </w:rPr>
-        <w:t>.</w:t>
-      </w:r>
-      <w:proofErr w:type="gramEnd"/>
-    </w:p>
-    <w:p>
-      <w:pPr>
-        <w:pStyle w:val="ListParagraph"/>
-        <w:ind w:left="426"/>
-        <w:jc w:val="both"/>
-        <w:rPr>
-          <w:rFonts w:ascii="Times New Roman" w:hAnsi="Times New Roman" w:cs="Times New Roman"/>
-          <w:b/>
-          <w:sz w:val="24"/>
-          <w:szCs w:val="24"/>
-        </w:rPr>
-      </w:pPr>
-      <w:r>
-        <w:rPr>
-          <w:rFonts w:ascii="Times New Roman" w:hAnsi="Times New Roman" w:cs="Times New Roman"/>
-          <w:b/>
-          <w:noProof/>
-          <w:sz w:val="24"/>
-          <w:szCs w:val="24"/>
-        </w:rPr>
-        <w:drawing>
-          <wp:inline distT="0" distB="0" distL="0" distR="0" wp14:anchorId="7CA496B8" wp14:editId="041E4198">
-            <wp:extent cx="4801224" cy="3200400"/>
-            <wp:effectExtent l="19050" t="0" r="0" b="0"/>
-            <wp:docPr id="15" name="Image 13" descr="C:\Users\guybo\Desktop\WhatsApp Image 2026-05-11 at 09.12.12.jpeg"/>
-            <wp:cNvGraphicFramePr>
-              <a:graphicFrameLocks xmlns:a="http://schemas.openxmlformats.org/drawingml/2006/main" noChangeAspect="1"/>
-            </wp:cNvGraphicFramePr>
-            <a:graphic xmlns:a="http://schemas.openxmlformats.org/drawingml/2006/main">
-              <a:graphicData uri="http://schemas.openxmlformats.org/drawingml/2006/picture">
-                <pic:pic xmlns:pic="http://schemas.openxmlformats.org/drawingml/2006/picture">
-                  <pic:nvPicPr>
-                    <pic:cNvPr id="0" name="Picture 13" descr="C:\Users\guybo\Desktop\WhatsApp Image 2026-05-11 at 09.12.12.jpeg"/>
-                    <pic:cNvPicPr>
-                      <a:picLocks noChangeAspect="1" noChangeArrowheads="1"/>
-                    </pic:cNvPicPr>
-                  </pic:nvPicPr>
-                  <pic:blipFill>
-                    <a:blip r:embed="rId7" cstate="print"/>
-                    <a:srcRect/>
-                    <a:stretch>
-                      <a:fillRect/>
-                    </a:stretch>
-                  </pic:blipFill>
-                  <pic:spPr bwMode="auto">
-                    <a:xfrm>
-                      <a:off x="0" y="0"/>
-                      <a:ext cx="4801224" cy="3200400"/>
-                    </a:xfrm>
-                    <a:prstGeom prst="rect">
-                      <a:avLst/>
-                    </a:prstGeom>
-                    <a:noFill/>
-                    <a:ln w="9525">
-                      <a:noFill/>
-                      <a:miter lim="800000"/>
-                      <a:headEnd/>
-                      <a:tailEnd/>
-                    </a:ln>
-                  </pic:spPr>
-                </pic:pic>
-              </a:graphicData>
-            </a:graphic>
-          </wp:inline>
-        </w:drawing>
-      </w:r>
-    </w:p>
-    <w:p>
-      <w:pPr>
-        <w:pStyle w:val="ListParagraph"/>
-        <w:ind w:left="426"/>
-        <w:jc w:val="both"/>
-        <w:rPr>
-          <w:rFonts w:ascii="Times New Roman" w:hAnsi="Times New Roman" w:cs="Times New Roman"/>
-          <w:b/>
-          <w:sz w:val="24"/>
-          <w:szCs w:val="24"/>
-        </w:rPr>
-      </w:pPr>
-      <w:r>
-        <w:rPr>
-          <w:rFonts w:ascii="Times New Roman" w:hAnsi="Times New Roman" w:cs="Times New Roman"/>
-          <w:b/>
-          <w:sz w:val="24"/>
-          <w:szCs w:val="24"/>
-        </w:rPr>
-        <w:t>Figure 5.1.</w:t>
-      </w:r>
-      <w:r>
-        <w:rPr>
-          <w:rFonts w:ascii="Times New Roman" w:hAnsi="Times New Roman" w:cs="Times New Roman"/>
-          <w:b/>
-          <w:sz w:val="24"/>
-          <w:szCs w:val="24"/>
-        </w:rPr>
-        <w:t> </w:t>
-      </w:r>
-      <w:r>
-        <w:rPr>
-          <w:rFonts w:ascii="Times New Roman" w:hAnsi="Times New Roman" w:cs="Times New Roman"/>
-          <w:sz w:val="24"/>
-          <w:szCs w:val="24"/>
-        </w:rPr>
-        <w:t>:</w:t>
-      </w:r>
-      <w:r>
-        <w:rPr>
-          <w:rFonts w:ascii="Times New Roman" w:hAnsi="Times New Roman" w:cs="Times New Roman"/>
-          <w:b/>
-          <w:sz w:val="24"/>
-          <w:szCs w:val="24"/>
-        </w:rPr>
-        <w:t xml:space="preserve"> </w:t>
-      </w:r>
-      <w:r>
-        <w:rPr>
-          <w:rFonts w:ascii="Times New Roman" w:hAnsi="Times New Roman" w:cs="Times New Roman"/>
-          <w:sz w:val="24"/>
-          <w:szCs w:val="24"/>
-        </w:rPr>
-        <w:t xml:space="preserve">Les trois grands </w:t>
-      </w:r>
-      <w:proofErr w:type="spellStart"/>
-      <w:r>
-        <w:rPr>
-          <w:rFonts w:ascii="Times New Roman" w:hAnsi="Times New Roman" w:cs="Times New Roman"/>
-          <w:sz w:val="24"/>
-          <w:szCs w:val="24"/>
-        </w:rPr>
-        <w:t>stresseurs</w:t>
-      </w:r>
-      <w:proofErr w:type="spellEnd"/>
+        <w:t>pouvant soutenir une réponse adaptative favorable à court terme.</w:t>
+      </w:r>
     </w:p>
     <w:p>
       <w:pPr>
@@ -2034,7 +1891,6 @@
           <w:sz w:val="24"/>
           <w:szCs w:val="24"/>
         </w:rPr>
-        <w:lastRenderedPageBreak/>
         <w:t>T</w:t>
       </w:r>
       <w:r>
@@ -2144,68 +2000,11 @@
       <w:r>
         <w:rPr>
           <w:rFonts w:ascii="Times New Roman" w:hAnsi="Times New Roman" w:cs="Times New Roman"/>
-          <w:sz w:val="24"/>
-          <w:szCs w:val="24"/>
-        </w:rPr>
-        <w:t> </w:t>
-      </w:r>
-      <w:r>
-        <w:rPr>
-          <w:rFonts w:ascii="Times New Roman" w:hAnsi="Times New Roman" w:cs="Times New Roman"/>
-          <w:b/>
-          <w:sz w:val="24"/>
-          <w:szCs w:val="24"/>
-        </w:rPr>
-        <w:t>:</w:t>
-      </w:r>
-      <w:r>
-        <w:rPr>
-          <w:rFonts w:ascii="Times New Roman" w:hAnsi="Times New Roman" w:cs="Times New Roman"/>
-          <w:b/>
-          <w:sz w:val="24"/>
-          <w:szCs w:val="24"/>
-        </w:rPr>
-        <w:t xml:space="preserve"> </w:t>
-      </w:r>
-      <w:r>
-        <w:rPr>
-          <w:rFonts w:ascii="Times New Roman" w:hAnsi="Times New Roman" w:cs="Times New Roman"/>
-          <w:b/>
-          <w:color w:val="FF0000"/>
-          <w:sz w:val="24"/>
-          <w:szCs w:val="24"/>
-        </w:rPr>
-        <w:t>(figure 5</w:t>
-      </w:r>
-      <w:r>
-        <w:rPr>
-          <w:rFonts w:ascii="Times New Roman" w:hAnsi="Times New Roman" w:cs="Times New Roman"/>
-          <w:b/>
-          <w:color w:val="FF0000"/>
-          <w:sz w:val="24"/>
-          <w:szCs w:val="24"/>
-        </w:rPr>
-        <w:t>.1</w:t>
-      </w:r>
-      <w:r>
-        <w:rPr>
-          <w:rFonts w:ascii="Times New Roman" w:hAnsi="Times New Roman" w:cs="Times New Roman"/>
-          <w:b/>
-          <w:color w:val="FF0000"/>
-          <w:sz w:val="24"/>
-          <w:szCs w:val="24"/>
-        </w:rPr>
-        <w:t>)</w:t>
-      </w:r>
-      <w:r>
-        <w:rPr>
-          <w:rFonts w:ascii="Times New Roman" w:hAnsi="Times New Roman" w:cs="Times New Roman"/>
-          <w:b/>
-          <w:color w:val="FF0000"/>
-          <w:sz w:val="24"/>
-          <w:szCs w:val="24"/>
-        </w:rPr>
-        <w:t xml:space="preserve"> </w:t>
+          <w:b/>
+          <w:sz w:val="24"/>
+          <w:szCs w:val="24"/>
+        </w:rPr>
+        <w:t>.</w:t>
       </w:r>
     </w:p>
     <w:p>
@@ -2710,7 +2509,16 @@
           <w:sz w:val="24"/>
           <w:szCs w:val="24"/>
         </w:rPr>
-        <w:t>l’idée qu’il se fait de la menace réelle ou supposée. En d’autres terme</w:t>
+        <w:t xml:space="preserve">l’idée qu’il se fait de la menace </w:t>
+      </w:r>
+      <w:r>
+        <w:rPr>
+          <w:rFonts w:ascii="Times New Roman" w:hAnsi="Times New Roman" w:cs="Times New Roman"/>
+          <w:sz w:val="24"/>
+          <w:szCs w:val="24"/>
+        </w:rPr>
+        <w:lastRenderedPageBreak/>
+        <w:t>réelle ou supposée. En d’autres terme</w:t>
       </w:r>
       <w:r>
         <w:rPr>
@@ -3536,115 +3344,18 @@
           <w:szCs w:val="24"/>
         </w:rPr>
       </w:pPr>
-      <w:r>
-        <w:rPr>
-          <w:rFonts w:ascii="Times New Roman" w:hAnsi="Times New Roman" w:cs="Times New Roman"/>
-          <w:noProof/>
-          <w:sz w:val="24"/>
-          <w:szCs w:val="24"/>
-          <w:lang w:eastAsia="fr-FR"/>
-        </w:rPr>
-        <w:lastRenderedPageBreak/>
-        <w:drawing>
-          <wp:inline distT="0" distB="0" distL="0" distR="0" wp14:anchorId="48F1C6F8" wp14:editId="797B0275">
-            <wp:extent cx="4918710" cy="6950406"/>
-            <wp:effectExtent l="0" t="0" r="0" b="0"/>
-            <wp:docPr id="11" name="Image 11" descr="C:\Users\guybo\Desktop\WhatsApp Image 2026-05-11 at 15.20.46.jpeg"/>
-            <wp:cNvGraphicFramePr>
-              <a:graphicFrameLocks xmlns:a="http://schemas.openxmlformats.org/drawingml/2006/main" noChangeAspect="1"/>
-            </wp:cNvGraphicFramePr>
-            <a:graphic xmlns:a="http://schemas.openxmlformats.org/drawingml/2006/main">
-              <a:graphicData uri="http://schemas.openxmlformats.org/drawingml/2006/picture">
-                <pic:pic xmlns:pic="http://schemas.openxmlformats.org/drawingml/2006/picture">
-                  <pic:nvPicPr>
-                    <pic:cNvPr id="0" name="Picture 11" descr="C:\Users\guybo\Desktop\WhatsApp Image 2026-05-11 at 15.20.46.jpeg"/>
-                    <pic:cNvPicPr>
-                      <a:picLocks noChangeAspect="1" noChangeArrowheads="1"/>
-                    </pic:cNvPicPr>
-                  </pic:nvPicPr>
-                  <pic:blipFill>
-                    <a:blip r:embed="rId8"/>
-                    <a:srcRect/>
-                    <a:stretch>
-                      <a:fillRect/>
-                    </a:stretch>
-                  </pic:blipFill>
-                  <pic:spPr bwMode="auto">
-                    <a:xfrm>
-                      <a:off x="0" y="0"/>
-                      <a:ext cx="4924119" cy="6958049"/>
-                    </a:xfrm>
-                    <a:prstGeom prst="rect">
-                      <a:avLst/>
-                    </a:prstGeom>
-                    <a:noFill/>
-                    <a:ln w="9525">
-                      <a:noFill/>
-                      <a:miter lim="800000"/>
-                      <a:headEnd/>
-                      <a:tailEnd/>
-                    </a:ln>
-                  </pic:spPr>
-                </pic:pic>
-              </a:graphicData>
-            </a:graphic>
-          </wp:inline>
-        </w:drawing>
-      </w:r>
-    </w:p>
-    <w:p>
-      <w:pPr>
-        <w:pStyle w:val="ListParagraph"/>
-        <w:jc w:val="both"/>
-        <w:rPr>
-          <w:rFonts w:ascii="Times New Roman" w:hAnsi="Times New Roman" w:cs="Times New Roman"/>
-          <w:sz w:val="24"/>
-          <w:szCs w:val="24"/>
-        </w:rPr>
-      </w:pPr>
-      <w:r>
-        <w:rPr>
-          <w:rFonts w:ascii="Times New Roman" w:hAnsi="Times New Roman" w:cs="Times New Roman"/>
-          <w:b/>
-          <w:sz w:val="24"/>
-          <w:szCs w:val="24"/>
-        </w:rPr>
-        <w:t>Figure 5.2</w:t>
-      </w:r>
-      <w:r>
-        <w:rPr>
-          <w:rFonts w:ascii="Times New Roman" w:hAnsi="Times New Roman" w:cs="Times New Roman"/>
-          <w:sz w:val="24"/>
-          <w:szCs w:val="24"/>
-        </w:rPr>
-        <w:t>.</w:t>
-      </w:r>
-      <w:r>
-        <w:rPr>
-          <w:rFonts w:ascii="Times New Roman" w:hAnsi="Times New Roman" w:cs="Times New Roman"/>
-          <w:sz w:val="24"/>
-          <w:szCs w:val="24"/>
-        </w:rPr>
-        <w:t xml:space="preserve"> : </w:t>
-      </w:r>
-      <w:r>
-        <w:rPr>
-          <w:rFonts w:ascii="Times New Roman" w:hAnsi="Times New Roman" w:cs="Times New Roman"/>
-          <w:sz w:val="24"/>
-          <w:szCs w:val="24"/>
-        </w:rPr>
-        <w:t xml:space="preserve">Effet cumulatif des </w:t>
-      </w:r>
       <w:proofErr w:type="spellStart"/>
-      <w:r>
-        <w:rPr>
-          <w:rFonts w:ascii="Times New Roman" w:hAnsi="Times New Roman" w:cs="Times New Roman"/>
-          <w:sz w:val="24"/>
-          <w:szCs w:val="24"/>
-        </w:rPr>
-        <w:t>stresseurs</w:t>
+      <w:proofErr w:type="gramStart"/>
+      <w:r>
+        <w:rPr>
+          <w:rFonts w:ascii="Times New Roman" w:hAnsi="Times New Roman" w:cs="Times New Roman"/>
+          <w:sz w:val="24"/>
+          <w:szCs w:val="24"/>
+        </w:rPr>
+        <w:t>rs</w:t>
       </w:r>
       <w:proofErr w:type="spellEnd"/>
+      <w:proofErr w:type="gramEnd"/>
     </w:p>
     <w:p>
       <w:pPr>
@@ -3722,143 +3433,6 @@
           <w:szCs w:val="24"/>
         </w:rPr>
         <w:t xml:space="preserve"> </w:t>
-      </w:r>
-      <w:r>
-        <w:rPr>
-          <w:rFonts w:ascii="Times New Roman" w:hAnsi="Times New Roman" w:cs="Times New Roman"/>
-          <w:b/>
-          <w:color w:val="FF0000"/>
-          <w:sz w:val="24"/>
-          <w:szCs w:val="24"/>
-        </w:rPr>
-        <w:t>(</w:t>
-      </w:r>
-      <w:proofErr w:type="gramStart"/>
-      <w:r>
-        <w:rPr>
-          <w:rFonts w:ascii="Times New Roman" w:hAnsi="Times New Roman" w:cs="Times New Roman"/>
-          <w:b/>
-          <w:color w:val="FF0000"/>
-          <w:sz w:val="24"/>
-          <w:szCs w:val="24"/>
-        </w:rPr>
-        <w:t>figure</w:t>
-      </w:r>
-      <w:proofErr w:type="gramEnd"/>
-      <w:r>
-        <w:rPr>
-          <w:rFonts w:ascii="Times New Roman" w:hAnsi="Times New Roman" w:cs="Times New Roman"/>
-          <w:b/>
-          <w:color w:val="FF0000"/>
-          <w:sz w:val="24"/>
-          <w:szCs w:val="24"/>
-        </w:rPr>
-        <w:t xml:space="preserve"> 5</w:t>
-      </w:r>
-      <w:r>
-        <w:rPr>
-          <w:rFonts w:ascii="Times New Roman" w:hAnsi="Times New Roman" w:cs="Times New Roman"/>
-          <w:b/>
-          <w:color w:val="FF0000"/>
-          <w:sz w:val="24"/>
-          <w:szCs w:val="24"/>
-        </w:rPr>
-        <w:t>.3</w:t>
-      </w:r>
-      <w:r>
-        <w:rPr>
-          <w:rFonts w:ascii="Times New Roman" w:hAnsi="Times New Roman" w:cs="Times New Roman"/>
-          <w:b/>
-          <w:color w:val="FF0000"/>
-          <w:sz w:val="24"/>
-          <w:szCs w:val="24"/>
-        </w:rPr>
-        <w:t>)</w:t>
-      </w:r>
-    </w:p>
-    <w:p>
-      <w:pPr>
-        <w:ind w:left="360"/>
-        <w:jc w:val="both"/>
-        <w:rPr>
-          <w:rFonts w:ascii="Times New Roman" w:hAnsi="Times New Roman" w:cs="Times New Roman"/>
-          <w:sz w:val="24"/>
-          <w:szCs w:val="24"/>
-        </w:rPr>
-      </w:pPr>
-      <w:r>
-        <w:rPr>
-          <w:rFonts w:ascii="Times New Roman" w:hAnsi="Times New Roman" w:cs="Times New Roman"/>
-          <w:noProof/>
-          <w:sz w:val="24"/>
-          <w:szCs w:val="24"/>
-          <w:lang w:eastAsia="fr-FR"/>
-        </w:rPr>
-        <w:lastRenderedPageBreak/>
-        <w:drawing>
-          <wp:inline distT="0" distB="0" distL="0" distR="0" wp14:anchorId="66466136" wp14:editId="350C4995">
-            <wp:extent cx="4154439" cy="5870448"/>
-            <wp:effectExtent l="19050" t="0" r="0" b="0"/>
-            <wp:docPr id="17" name="Image 17" descr="C:\Users\guybo\Desktop\WhatsApp Image 2026-05-11 at 14.59.24.jpeg"/>
-            <wp:cNvGraphicFramePr>
-              <a:graphicFrameLocks xmlns:a="http://schemas.openxmlformats.org/drawingml/2006/main" noChangeAspect="1"/>
-            </wp:cNvGraphicFramePr>
-            <a:graphic xmlns:a="http://schemas.openxmlformats.org/drawingml/2006/main">
-              <a:graphicData uri="http://schemas.openxmlformats.org/drawingml/2006/picture">
-                <pic:pic xmlns:pic="http://schemas.openxmlformats.org/drawingml/2006/picture">
-                  <pic:nvPicPr>
-                    <pic:cNvPr id="0" name="Picture 17" descr="C:\Users\guybo\Desktop\WhatsApp Image 2026-05-11 at 14.59.24.jpeg"/>
-                    <pic:cNvPicPr>
-                      <a:picLocks noChangeAspect="1" noChangeArrowheads="1"/>
-                    </pic:cNvPicPr>
-                  </pic:nvPicPr>
-                  <pic:blipFill>
-                    <a:blip r:embed="rId9"/>
-                    <a:srcRect/>
-                    <a:stretch>
-                      <a:fillRect/>
-                    </a:stretch>
-                  </pic:blipFill>
-                  <pic:spPr bwMode="auto">
-                    <a:xfrm>
-                      <a:off x="0" y="0"/>
-                      <a:ext cx="4155486" cy="5871927"/>
-                    </a:xfrm>
-                    <a:prstGeom prst="rect">
-                      <a:avLst/>
-                    </a:prstGeom>
-                    <a:noFill/>
-                    <a:ln w="9525">
-                      <a:noFill/>
-                      <a:miter lim="800000"/>
-                      <a:headEnd/>
-                      <a:tailEnd/>
-                    </a:ln>
-                  </pic:spPr>
-                </pic:pic>
-              </a:graphicData>
-            </a:graphic>
-          </wp:inline>
-        </w:drawing>
-      </w:r>
-    </w:p>
-    <w:p>
-      <w:pPr>
-        <w:ind w:left="360"/>
-        <w:jc w:val="both"/>
-        <w:rPr>
-          <w:rFonts w:ascii="Times New Roman" w:hAnsi="Times New Roman" w:cs="Times New Roman"/>
-          <w:sz w:val="24"/>
-          <w:szCs w:val="24"/>
-        </w:rPr>
-      </w:pPr>
-      <w:r>
-        <w:rPr>
-          <w:rFonts w:ascii="Times New Roman" w:hAnsi="Times New Roman" w:cs="Times New Roman"/>
-          <w:sz w:val="24"/>
-          <w:szCs w:val="24"/>
-        </w:rPr>
-        <w:t>Figure 5.3. : Les quatre phases du syndrome de stress</w:t>
       </w:r>
     </w:p>
     <w:p>
@@ -4030,27 +3604,7 @@
           <w:sz w:val="24"/>
           <w:szCs w:val="24"/>
         </w:rPr>
-        <w:t>Système nerveux central, page</w:t>
-      </w:r>
-      <w:r>
-        <w:rPr>
-          <w:rFonts w:ascii="Times New Roman" w:hAnsi="Times New Roman" w:cs="Times New Roman"/>
-          <w:b/>
-          <w:color w:val="FF0000"/>
-          <w:sz w:val="24"/>
-          <w:szCs w:val="24"/>
-        </w:rPr>
-        <w:t>…</w:t>
-      </w:r>
-      <w:r>
-        <w:rPr>
-          <w:rFonts w:ascii="Times New Roman" w:hAnsi="Times New Roman" w:cs="Times New Roman"/>
-          <w:b/>
-          <w:color w:val="FF0000"/>
-          <w:sz w:val="24"/>
-          <w:szCs w:val="24"/>
-        </w:rPr>
-        <w:t>)</w:t>
+        <w:t>Système nerveux central)</w:t>
       </w:r>
     </w:p>
     <w:p>
@@ -4074,6 +3628,7 @@
           <w:sz w:val="24"/>
           <w:szCs w:val="24"/>
         </w:rPr>
+        <w:lastRenderedPageBreak/>
         <w:t>L</w:t>
       </w:r>
       <w:r>
@@ -4160,110 +3715,6 @@
           <w:szCs w:val="24"/>
         </w:rPr>
         <w:t>et les circuits corticaux participent à la modulation de la réponse émotionnelle, avant que l’information n’atteigne le cortex préfrontal, où elle est analysée et rendue consciente.</w:t>
-      </w:r>
-    </w:p>
-    <w:p>
-      <w:pPr>
-        <w:pStyle w:val="ListParagraph"/>
-        <w:spacing w:after="120"/>
-        <w:ind w:left="786"/>
-        <w:rPr>
-          <w:rFonts w:ascii="Times New Roman" w:hAnsi="Times New Roman" w:cs="Times New Roman"/>
-          <w:sz w:val="24"/>
-          <w:szCs w:val="24"/>
-        </w:rPr>
-      </w:pPr>
-      <w:r>
-        <w:rPr>
-          <w:rFonts w:ascii="Times New Roman" w:hAnsi="Times New Roman" w:cs="Times New Roman"/>
-          <w:noProof/>
-          <w:sz w:val="24"/>
-          <w:szCs w:val="24"/>
-          <w:lang w:eastAsia="fr-FR"/>
-        </w:rPr>
-        <w:lastRenderedPageBreak/>
-        <w:drawing>
-          <wp:inline distT="0" distB="0" distL="0" distR="0" wp14:anchorId="336FA15C" wp14:editId="5C8E2428">
-            <wp:extent cx="5760720" cy="3839980"/>
-            <wp:effectExtent l="19050" t="0" r="0" b="0"/>
-            <wp:docPr id="18" name="Image 18" descr="C:\Users\guybo\Desktop\WhatsApp Image 2026-05-11 at 09.23.43.jpeg"/>
-            <wp:cNvGraphicFramePr>
-              <a:graphicFrameLocks xmlns:a="http://schemas.openxmlformats.org/drawingml/2006/main" noChangeAspect="1"/>
-            </wp:cNvGraphicFramePr>
-            <a:graphic xmlns:a="http://schemas.openxmlformats.org/drawingml/2006/main">
-              <a:graphicData uri="http://schemas.openxmlformats.org/drawingml/2006/picture">
-                <pic:pic xmlns:pic="http://schemas.openxmlformats.org/drawingml/2006/picture">
-                  <pic:nvPicPr>
-                    <pic:cNvPr id="0" name="Picture 18" descr="C:\Users\guybo\Desktop\WhatsApp Image 2026-05-11 at 09.23.43.jpeg"/>
-                    <pic:cNvPicPr>
-                      <a:picLocks noChangeAspect="1" noChangeArrowheads="1"/>
-                    </pic:cNvPicPr>
-                  </pic:nvPicPr>
-                  <pic:blipFill>
-                    <a:blip r:embed="rId10"/>
-                    <a:srcRect/>
-                    <a:stretch>
-                      <a:fillRect/>
-                    </a:stretch>
-                  </pic:blipFill>
-                  <pic:spPr bwMode="auto">
-                    <a:xfrm>
-                      <a:off x="0" y="0"/>
-                      <a:ext cx="5760720" cy="3839980"/>
-                    </a:xfrm>
-                    <a:prstGeom prst="rect">
-                      <a:avLst/>
-                    </a:prstGeom>
-                    <a:noFill/>
-                    <a:ln w="9525">
-                      <a:noFill/>
-                      <a:miter lim="800000"/>
-                      <a:headEnd/>
-                      <a:tailEnd/>
-                    </a:ln>
-                  </pic:spPr>
-                </pic:pic>
-              </a:graphicData>
-            </a:graphic>
-          </wp:inline>
-        </w:drawing>
-      </w:r>
-    </w:p>
-    <w:p>
-      <w:pPr>
-        <w:pStyle w:val="ListParagraph"/>
-        <w:spacing w:after="120"/>
-        <w:ind w:left="786"/>
-        <w:rPr>
-          <w:rFonts w:ascii="Times New Roman" w:hAnsi="Times New Roman" w:cs="Times New Roman"/>
-          <w:sz w:val="24"/>
-          <w:szCs w:val="24"/>
-        </w:rPr>
-      </w:pPr>
-      <w:r>
-        <w:rPr>
-          <w:rFonts w:ascii="Times New Roman" w:hAnsi="Times New Roman" w:cs="Times New Roman"/>
-          <w:b/>
-          <w:sz w:val="24"/>
-          <w:szCs w:val="24"/>
-        </w:rPr>
-        <w:t>Figure 5.4.</w:t>
-      </w:r>
-      <w:r>
-        <w:rPr>
-          <w:rFonts w:ascii="Times New Roman" w:hAnsi="Times New Roman" w:cs="Times New Roman"/>
-          <w:sz w:val="24"/>
-          <w:szCs w:val="24"/>
-        </w:rPr>
-        <w:t xml:space="preserve"> : </w:t>
-      </w:r>
-      <w:r>
-        <w:rPr>
-          <w:rFonts w:ascii="Times New Roman" w:hAnsi="Times New Roman" w:cs="Times New Roman"/>
-          <w:sz w:val="24"/>
-          <w:szCs w:val="24"/>
-        </w:rPr>
-        <w:t>Axes neurologique SAM et hormonal HHS</w:t>
       </w:r>
     </w:p>
     <w:p>
@@ -4305,6 +3756,8 @@
       <w:r>
         <w:rPr>
           <w:rFonts w:ascii="Times New Roman" w:hAnsi="Times New Roman" w:cs="Times New Roman"/>
+          <w:b/>
+          <w:color w:val="FF0000"/>
           <w:sz w:val="24"/>
           <w:szCs w:val="24"/>
         </w:rPr>
@@ -4313,78 +3766,10 @@
       <w:r>
         <w:rPr>
           <w:rFonts w:ascii="Times New Roman" w:hAnsi="Times New Roman" w:cs="Times New Roman"/>
-          <w:b/>
-          <w:color w:val="FF0000"/>
-          <w:sz w:val="24"/>
-          <w:szCs w:val="24"/>
-        </w:rPr>
-        <w:t>(figure</w:t>
-      </w:r>
-      <w:r>
-        <w:rPr>
-          <w:rFonts w:ascii="Times New Roman" w:hAnsi="Times New Roman" w:cs="Times New Roman"/>
-          <w:b/>
-          <w:color w:val="FF0000"/>
-          <w:sz w:val="24"/>
-          <w:szCs w:val="24"/>
-        </w:rPr>
-        <w:t xml:space="preserve"> 5</w:t>
-      </w:r>
-      <w:r>
-        <w:rPr>
-          <w:rFonts w:ascii="Times New Roman" w:hAnsi="Times New Roman" w:cs="Times New Roman"/>
-          <w:b/>
-          <w:color w:val="FF0000"/>
-          <w:sz w:val="24"/>
-          <w:szCs w:val="24"/>
-        </w:rPr>
-        <w:t>.4</w:t>
-      </w:r>
-      <w:r>
-        <w:rPr>
-          <w:rFonts w:ascii="Times New Roman" w:hAnsi="Times New Roman" w:cs="Times New Roman"/>
-          <w:b/>
-          <w:color w:val="FF0000"/>
-          <w:sz w:val="24"/>
-          <w:szCs w:val="24"/>
-        </w:rPr>
-        <w:t>)</w:t>
-      </w:r>
-      <w:proofErr w:type="gramStart"/>
-      <w:r>
-        <w:rPr>
-          <w:rFonts w:ascii="Times New Roman" w:hAnsi="Times New Roman" w:cs="Times New Roman"/>
-          <w:color w:val="FF0000"/>
-          <w:sz w:val="24"/>
-          <w:szCs w:val="24"/>
-        </w:rPr>
-        <w:t xml:space="preserve"> </w:t>
-      </w:r>
-      <w:r>
-        <w:rPr>
-          <w:rFonts w:ascii="Times New Roman" w:hAnsi="Times New Roman" w:cs="Times New Roman"/>
-          <w:color w:val="FF0000"/>
-          <w:sz w:val="24"/>
-          <w:szCs w:val="24"/>
-        </w:rPr>
-        <w:t xml:space="preserve"> </w:t>
-      </w:r>
-      <w:r>
-        <w:rPr>
-          <w:rFonts w:ascii="Times New Roman" w:hAnsi="Times New Roman" w:cs="Times New Roman"/>
-          <w:sz w:val="24"/>
-          <w:szCs w:val="24"/>
-        </w:rPr>
-        <w:t> :</w:t>
-      </w:r>
-      <w:proofErr w:type="gramEnd"/>
-      <w:r>
-        <w:rPr>
-          <w:rFonts w:ascii="Times New Roman" w:hAnsi="Times New Roman" w:cs="Times New Roman"/>
-          <w:sz w:val="24"/>
-          <w:szCs w:val="24"/>
-        </w:rPr>
-        <w:t xml:space="preserve"> </w:t>
+          <w:sz w:val="24"/>
+          <w:szCs w:val="24"/>
+        </w:rPr>
+        <w:t xml:space="preserve">: </w:t>
       </w:r>
       <w:r>
         <w:rPr>
@@ -5027,7 +4412,7 @@
       <w:r>
         <w:rPr>
           <w:rFonts w:ascii="Times New Roman" w:hAnsi="Times New Roman" w:cs="Times New Roman"/>
-          <w:i/>
+          <w:b/>
           <w:sz w:val="24"/>
           <w:szCs w:val="24"/>
         </w:rPr>
@@ -5036,45 +4421,6 @@
       <w:r>
         <w:rPr>
           <w:rFonts w:ascii="Times New Roman" w:hAnsi="Times New Roman" w:cs="Times New Roman"/>
-          <w:b/>
-          <w:color w:val="FF0000"/>
-          <w:sz w:val="24"/>
-          <w:szCs w:val="24"/>
-        </w:rPr>
-        <w:t>(figure 5</w:t>
-      </w:r>
-      <w:r>
-        <w:rPr>
-          <w:rFonts w:ascii="Times New Roman" w:hAnsi="Times New Roman" w:cs="Times New Roman"/>
-          <w:b/>
-          <w:color w:val="FF0000"/>
-          <w:sz w:val="24"/>
-          <w:szCs w:val="24"/>
-        </w:rPr>
-        <w:t>.4</w:t>
-      </w:r>
-      <w:r>
-        <w:rPr>
-          <w:rFonts w:ascii="Times New Roman" w:hAnsi="Times New Roman" w:cs="Times New Roman"/>
-          <w:b/>
-          <w:color w:val="FF0000"/>
-          <w:sz w:val="24"/>
-          <w:szCs w:val="24"/>
-        </w:rPr>
-        <w:t>)</w:t>
-      </w:r>
-      <w:r>
-        <w:rPr>
-          <w:rFonts w:ascii="Times New Roman" w:hAnsi="Times New Roman" w:cs="Times New Roman"/>
-          <w:b/>
-          <w:sz w:val="24"/>
-          <w:szCs w:val="24"/>
-        </w:rPr>
-        <w:t xml:space="preserve"> </w:t>
-      </w:r>
-      <w:r>
-        <w:rPr>
-          <w:rFonts w:ascii="Times New Roman" w:hAnsi="Times New Roman" w:cs="Times New Roman"/>
           <w:sz w:val="24"/>
           <w:szCs w:val="24"/>
         </w:rPr>
@@ -5158,16 +4504,7 @@
           <w:sz w:val="24"/>
           <w:szCs w:val="24"/>
         </w:rPr>
-        <w:t xml:space="preserve">surrénales. </w:t>
-      </w:r>
-      <w:r>
-        <w:rPr>
-          <w:rFonts w:ascii="Times New Roman" w:hAnsi="Times New Roman" w:cs="Times New Roman"/>
-          <w:sz w:val="24"/>
-          <w:szCs w:val="24"/>
-        </w:rPr>
-        <w:lastRenderedPageBreak/>
-        <w:t>Cette cascade hormonale li</w:t>
+        <w:t>surrénales. Cette cascade hormonale li</w:t>
       </w:r>
       <w:r>
         <w:rPr>
@@ -5725,6 +5062,7 @@
           <w:sz w:val="24"/>
           <w:szCs w:val="24"/>
         </w:rPr>
+        <w:lastRenderedPageBreak/>
         <w:t xml:space="preserve"> La dysfonction</w:t>
       </w:r>
       <w:r>
@@ -5791,58 +5129,6 @@
           <w:szCs w:val="24"/>
         </w:rPr>
         <w:t xml:space="preserve"> </w:t>
-      </w:r>
-      <w:r>
-        <w:rPr>
-          <w:rFonts w:ascii="Times New Roman" w:hAnsi="Times New Roman" w:cs="Times New Roman"/>
-          <w:b/>
-          <w:color w:val="FF0000"/>
-          <w:sz w:val="24"/>
-          <w:szCs w:val="24"/>
-        </w:rPr>
-        <w:t>(</w:t>
-      </w:r>
-      <w:proofErr w:type="gramStart"/>
-      <w:r>
-        <w:rPr>
-          <w:rFonts w:ascii="Times New Roman" w:hAnsi="Times New Roman" w:cs="Times New Roman"/>
-          <w:b/>
-          <w:color w:val="FF0000"/>
-          <w:sz w:val="24"/>
-          <w:szCs w:val="24"/>
-        </w:rPr>
-        <w:t>figure</w:t>
-      </w:r>
-      <w:proofErr w:type="gramEnd"/>
-      <w:r>
-        <w:rPr>
-          <w:rFonts w:ascii="Times New Roman" w:hAnsi="Times New Roman" w:cs="Times New Roman"/>
-          <w:b/>
-          <w:color w:val="FF0000"/>
-          <w:sz w:val="24"/>
-          <w:szCs w:val="24"/>
-        </w:rPr>
-        <w:t xml:space="preserve"> 5</w:t>
-      </w:r>
-      <w:r>
-        <w:rPr>
-          <w:rFonts w:ascii="Times New Roman" w:hAnsi="Times New Roman" w:cs="Times New Roman"/>
-          <w:b/>
-          <w:color w:val="FF0000"/>
-          <w:sz w:val="24"/>
-          <w:szCs w:val="24"/>
-        </w:rPr>
-        <w:t>.3</w:t>
-      </w:r>
-      <w:r>
-        <w:rPr>
-          <w:rFonts w:ascii="Times New Roman" w:hAnsi="Times New Roman" w:cs="Times New Roman"/>
-          <w:b/>
-          <w:color w:val="FF0000"/>
-          <w:sz w:val="24"/>
-          <w:szCs w:val="24"/>
-        </w:rPr>
-        <w:t>)</w:t>
       </w:r>
     </w:p>
     <w:p>
@@ -6395,16 +5681,7 @@
           <w:sz w:val="24"/>
           <w:szCs w:val="24"/>
         </w:rPr>
-        <w:t xml:space="preserve">p intense, ni </w:t>
-      </w:r>
-      <w:r>
-        <w:rPr>
-          <w:rFonts w:ascii="Times New Roman" w:hAnsi="Times New Roman" w:cs="Times New Roman"/>
-          <w:sz w:val="24"/>
-          <w:szCs w:val="24"/>
-        </w:rPr>
-        <w:lastRenderedPageBreak/>
-        <w:t>trop fréquent afin de</w:t>
+        <w:t>p intense, ni trop fréquent afin de</w:t>
       </w:r>
       <w:r>
         <w:rPr>
@@ -6881,6 +6158,7 @@
           <w:sz w:val="24"/>
           <w:szCs w:val="24"/>
         </w:rPr>
+        <w:lastRenderedPageBreak/>
         <w:t>Axe</w:t>
       </w:r>
       <w:r>
@@ -8217,7 +7495,6 @@
           <w:sz w:val="24"/>
           <w:szCs w:val="24"/>
         </w:rPr>
-        <w:lastRenderedPageBreak/>
         <w:t>Dysbiose et altération de la barrière intestinale parfois mises en lien avec des phénomènes auto-immun</w:t>
       </w:r>
       <w:r>
@@ -8749,6 +8026,7 @@
           <w:sz w:val="24"/>
           <w:szCs w:val="24"/>
         </w:rPr>
+        <w:lastRenderedPageBreak/>
         <w:t>Hypo insulinémie</w:t>
       </w:r>
       <w:r>
@@ -9515,16 +8793,7 @@
           <w:sz w:val="24"/>
           <w:szCs w:val="24"/>
         </w:rPr>
-        <w:t xml:space="preserve">endant le stade d’adaptation-compensation, la ROP, comme toutes les thérapies non médicamenteuses, a toute sa place pour aborder les pathologies fonctionnelles réversibles. Mais avec l’évolution vers la chronicité et l’irréversibilité partielle ou </w:t>
-      </w:r>
-      <w:r>
-        <w:rPr>
-          <w:rFonts w:ascii="Times New Roman" w:hAnsi="Times New Roman" w:cs="Times New Roman"/>
-          <w:sz w:val="24"/>
-          <w:szCs w:val="24"/>
-        </w:rPr>
-        <w:lastRenderedPageBreak/>
-        <w:t>totale, les thérapies fonctionnelles</w:t>
+        <w:t>endant le stade d’adaptation-compensation, la ROP, comme toutes les thérapies non médicamenteuses, a toute sa place pour aborder les pathologies fonctionnelles réversibles. Mais avec l’évolution vers la chronicité et l’irréversibilité partielle ou totale, les thérapies fonctionnelles</w:t>
       </w:r>
       <w:r>
         <w:rPr>
@@ -10231,6 +9500,7 @@
           <w:sz w:val="24"/>
           <w:szCs w:val="24"/>
         </w:rPr>
+        <w:lastRenderedPageBreak/>
         <w:t>Pathologies chroniques</w:t>
       </w:r>
     </w:p>
@@ -10683,7 +9953,7 @@
         <w:rPr>
           <w:color w:val="auto"/>
         </w:rPr>
-        <w:t>ROP du Mécanisme de stress</w:t>
+        <w:t>Zones reflexes podales</w:t>
       </w:r>
       <w:r>
         <w:rPr>
@@ -10756,16 +10026,6 @@
         </w:rPr>
         <w:t xml:space="preserve"> </w:t>
       </w:r>
-      <w:r>
-        <w:rPr>
-          <w:rFonts w:ascii="Times New Roman" w:hAnsi="Times New Roman" w:cs="Times New Roman"/>
-          <w:b/>
-          <w:color w:val="FF0000"/>
-          <w:sz w:val="24"/>
-          <w:szCs w:val="24"/>
-        </w:rPr>
-        <w:t>(figure 5.5)</w:t>
-      </w:r>
     </w:p>
     <w:p>
       <w:pPr>
@@ -10952,7 +10212,6 @@
           <w:sz w:val="24"/>
           <w:szCs w:val="24"/>
         </w:rPr>
-        <w:lastRenderedPageBreak/>
         <w:t>Colonne vertébrale </w:t>
       </w:r>
       <w:r>
@@ -11051,7 +10310,7 @@
           <w:sz w:val="24"/>
           <w:szCs w:val="24"/>
         </w:rPr>
-        <w:t xml:space="preserve">C3-C4-C5 </w:t>
+        <w:t>C3-C4-C5 et</w:t>
       </w:r>
       <w:r>
         <w:rPr>
@@ -11061,34 +10320,6 @@
           <w:sz w:val="24"/>
           <w:szCs w:val="24"/>
         </w:rPr>
-        <w:t>(figures 4.23 et</w:t>
-      </w:r>
-      <w:r>
-        <w:rPr>
-          <w:rFonts w:ascii="Times New Roman" w:hAnsi="Times New Roman" w:cs="Times New Roman"/>
-          <w:b/>
-          <w:color w:val="FF0000"/>
-          <w:sz w:val="24"/>
-          <w:szCs w:val="24"/>
-        </w:rPr>
-        <w:t xml:space="preserve"> 8.5) </w:t>
-      </w:r>
-      <w:r>
-        <w:rPr>
-          <w:rFonts w:ascii="Times New Roman" w:hAnsi="Times New Roman" w:cs="Times New Roman"/>
-          <w:sz w:val="24"/>
-          <w:szCs w:val="24"/>
-        </w:rPr>
-        <w:t>et</w:t>
-      </w:r>
-      <w:r>
-        <w:rPr>
-          <w:rFonts w:ascii="Times New Roman" w:hAnsi="Times New Roman" w:cs="Times New Roman"/>
-          <w:b/>
-          <w:color w:val="FF0000"/>
-          <w:sz w:val="24"/>
-          <w:szCs w:val="24"/>
-        </w:rPr>
         <w:t xml:space="preserve"> </w:t>
       </w:r>
       <w:r>
@@ -11101,7 +10332,6 @@
         <w:t xml:space="preserve">Triangle de </w:t>
       </w:r>
       <w:proofErr w:type="spellStart"/>
-      <w:proofErr w:type="gramStart"/>
       <w:r>
         <w:rPr>
           <w:rFonts w:ascii="Times New Roman" w:hAnsi="Times New Roman" w:cs="Times New Roman"/>
@@ -11119,27 +10349,6 @@
           <w:szCs w:val="24"/>
         </w:rPr>
         <w:t xml:space="preserve">  </w:t>
-      </w:r>
-      <w:r>
-        <w:rPr>
-          <w:rFonts w:ascii="Times New Roman" w:hAnsi="Times New Roman" w:cs="Times New Roman"/>
-          <w:b/>
-          <w:color w:val="FF0000"/>
-          <w:sz w:val="24"/>
-          <w:szCs w:val="24"/>
-        </w:rPr>
-        <w:t>(</w:t>
-      </w:r>
-      <w:proofErr w:type="gramEnd"/>
-      <w:r>
-        <w:rPr>
-          <w:rFonts w:ascii="Times New Roman" w:hAnsi="Times New Roman" w:cs="Times New Roman"/>
-          <w:b/>
-          <w:color w:val="FF0000"/>
-          <w:sz w:val="24"/>
-          <w:szCs w:val="24"/>
-        </w:rPr>
-        <w:t>figure 8.5)</w:t>
       </w:r>
     </w:p>
     <w:p>
@@ -11388,86 +10597,8 @@
         <w:t xml:space="preserve"> </w:t>
       </w:r>
     </w:p>
-    <w:p>
-      <w:pPr>
-        <w:pStyle w:val="NormalWeb"/>
-        <w:ind w:left="1440"/>
-      </w:pPr>
-      <w:r>
-        <w:rPr>
-          <w:noProof/>
-        </w:rPr>
-        <w:drawing>
-          <wp:inline distT="0" distB="0" distL="0" distR="0" wp14:anchorId="540DF549" wp14:editId="3687DACB">
-            <wp:extent cx="3007614" cy="4249921"/>
-            <wp:effectExtent l="19050" t="0" r="2286" b="0"/>
-            <wp:docPr id="19" name="Image 19" descr="C:\Users\guybo\Desktop\WhatsApp Image 2026-05-11 at 14.47.03.jpeg"/>
-            <wp:cNvGraphicFramePr>
-              <a:graphicFrameLocks xmlns:a="http://schemas.openxmlformats.org/drawingml/2006/main" noChangeAspect="1"/>
-            </wp:cNvGraphicFramePr>
-            <a:graphic xmlns:a="http://schemas.openxmlformats.org/drawingml/2006/main">
-              <a:graphicData uri="http://schemas.openxmlformats.org/drawingml/2006/picture">
-                <pic:pic xmlns:pic="http://schemas.openxmlformats.org/drawingml/2006/picture">
-                  <pic:nvPicPr>
-                    <pic:cNvPr id="0" name="Picture 19" descr="C:\Users\guybo\Desktop\WhatsApp Image 2026-05-11 at 14.47.03.jpeg"/>
-                    <pic:cNvPicPr>
-                      <a:picLocks noChangeAspect="1" noChangeArrowheads="1"/>
-                    </pic:cNvPicPr>
-                  </pic:nvPicPr>
-                  <pic:blipFill>
-                    <a:blip r:embed="rId11" cstate="print"/>
-                    <a:srcRect/>
-                    <a:stretch>
-                      <a:fillRect/>
-                    </a:stretch>
-                  </pic:blipFill>
-                  <pic:spPr bwMode="auto">
-                    <a:xfrm>
-                      <a:off x="0" y="0"/>
-                      <a:ext cx="3011923" cy="4256010"/>
-                    </a:xfrm>
-                    <a:prstGeom prst="rect">
-                      <a:avLst/>
-                    </a:prstGeom>
-                    <a:noFill/>
-                    <a:ln w="9525">
-                      <a:noFill/>
-                      <a:miter lim="800000"/>
-                      <a:headEnd/>
-                      <a:tailEnd/>
-                    </a:ln>
-                  </pic:spPr>
-                </pic:pic>
-              </a:graphicData>
-            </a:graphic>
-          </wp:inline>
-        </w:drawing>
-      </w:r>
-    </w:p>
-    <w:p>
-      <w:pPr>
-        <w:pStyle w:val="NormalWeb"/>
-        <w:ind w:left="1440"/>
-      </w:pPr>
-      <w:r>
-        <w:rPr>
-          <w:b/>
-        </w:rPr>
-        <w:t>Figure 5.5</w:t>
-      </w:r>
-      <w:r>
-        <w:t> : ROP du mécanisme de stress</w:t>
-      </w:r>
-    </w:p>
-    <w:p>
-      <w:pPr>
-        <w:pStyle w:val="NormalWeb"/>
-        <w:ind w:left="1440"/>
-      </w:pPr>
-    </w:p>
-    <w:p/>
     <w:sectPr>
-      <w:footerReference w:type="default" r:id="rId12"/>
+      <w:footerReference w:type="default" r:id="rId7"/>
       <w:pgSz w:w="11906" w:h="16838"/>
       <w:pgMar w:top="1417" w:right="1417" w:bottom="1417" w:left="1417" w:header="708" w:footer="708" w:gutter="0"/>
       <w:cols w:space="708"/>
@@ -11478,7 +10609,7 @@
 </file>
 
 <file path=word/endnotes.xml><?xml version="1.0" encoding="utf-8"?>
-<w:endnotes xmlns:wpc="http://schemas.microsoft.com/office/word/2010/wordprocessingCanvas" xmlns:cx="http://schemas.microsoft.com/office/drawing/2014/chartex" xmlns:cx1="http://schemas.microsoft.com/office/drawing/2015/9/8/chartex" xmlns:cx2="http://schemas.microsoft.com/office/drawing/2015/10/21/chartex" xmlns:cx3="http://schemas.microsoft.com/office/drawing/2016/5/9/chartex" xmlns:cx4="http://schemas.microsoft.com/office/drawing/2016/5/10/chartex" xmlns:cx5="http://schemas.microsoft.com/office/drawing/2016/5/11/chartex" xmlns:cx6="http://schemas.microsoft.com/office/drawing/2016/5/12/chartex" xmlns:cx7="http://schemas.microsoft.com/office/drawing/2016/5/13/chartex" xmlns:cx8="http://schemas.microsoft.com/office/drawing/2016/5/14/chartex" xmlns:mc="http://schemas.openxmlformats.org/markup-compatibility/2006" xmlns:aink="http://schemas.microsoft.com/office/drawing/2016/ink" xmlns:am3d="http://schemas.microsoft.com/office/drawing/2017/model3d" xmlns:o="urn:schemas-microsoft-com:office:office" xmlns:oel="http://schemas.microsoft.com/office/2019/extlst" xmlns:r="http://schemas.openxmlformats.org/officeDocument/2006/relationships" xmlns:m="http://schemas.openxmlformats.org/officeDocument/2006/math" xmlns:v="urn:schemas-microsoft-com:vml" xmlns:wp14="http://schemas.microsoft.com/office/word/2010/wordprocessingDrawing" xmlns:wp="http://schemas.openxmlformats.org/drawingml/2006/wordprocessingDrawing" xmlns:w10="urn:schemas-microsoft-com:office:word" xmlns:w="http://schemas.openxmlformats.org/wordprocessingml/2006/main" xmlns:w14="http://schemas.microsoft.com/office/word/2010/wordml" xmlns:w15="http://schemas.microsoft.com/office/word/2012/wordml" xmlns:w16cex="http://schemas.microsoft.com/office/word/2018/wordml/cex" xmlns:w16cid="http://schemas.microsoft.com/office/word/2016/wordml/cid" xmlns:w16="http://schemas.microsoft.com/office/word/2018/wordml" xmlns:w16du="http://schemas.microsoft.com/office/word/2023/wordml/word16du" xmlns:w16sdtdh="http://schemas.microsoft.com/office/word/2020/wordml/sdtdatahash" xmlns:w16sdtfl="http://schemas.microsoft.com/office/word/2024/wordml/sdtformatlock" xmlns:w16se="http://schemas.microsoft.com/office/word/2015/wordml/symex" xmlns:wpg="http://schemas.microsoft.com/office/word/2010/wordprocessingGroup" xmlns:wpi="http://schemas.microsoft.com/office/word/2010/wordprocessingInk" xmlns:wne="http://schemas.microsoft.com/office/word/2006/wordml" xmlns:wps="http://schemas.microsoft.com/office/word/2010/wordprocessingShape" mc:Ignorable="w14 w15 w16se w16cid w16 w16cex w16sdtdh w16sdtfl w16du wp14">
+<w:endnotes xmlns:wpc="http://schemas.microsoft.com/office/word/2010/wordprocessingCanvas" xmlns:cx="http://schemas.microsoft.com/office/drawing/2014/chartex" xmlns:cx1="http://schemas.microsoft.com/office/drawing/2015/9/8/chartex" xmlns:cx2="http://schemas.microsoft.com/office/drawing/2015/10/21/chartex" xmlns:cx3="http://schemas.microsoft.com/office/drawing/2016/5/9/chartex" xmlns:cx4="http://schemas.microsoft.com/office/drawing/2016/5/10/chartex" xmlns:cx5="http://schemas.microsoft.com/office/drawing/2016/5/11/chartex" xmlns:cx6="http://schemas.microsoft.com/office/drawing/2016/5/12/chartex" xmlns:cx7="http://schemas.microsoft.com/office/drawing/2016/5/13/chartex" xmlns:cx8="http://schemas.microsoft.com/office/drawing/2016/5/14/chartex" xmlns:mc="http://schemas.openxmlformats.org/markup-compatibility/2006" xmlns:aink="http://schemas.microsoft.com/office/drawing/2016/ink" xmlns:am3d="http://schemas.microsoft.com/office/drawing/2017/model3d" xmlns:o="urn:schemas-microsoft-com:office:office" xmlns:oel="http://schemas.microsoft.com/office/2019/extlst" xmlns:r="http://schemas.openxmlformats.org/officeDocument/2006/relationships" xmlns:m="http://schemas.openxmlformats.org/officeDocument/2006/math" xmlns:v="urn:schemas-microsoft-com:vml" xmlns:wp14="http://schemas.microsoft.com/office/word/2010/wordprocessingDrawing" xmlns:wp="http://schemas.openxmlformats.org/drawingml/2006/wordprocessingDrawing" xmlns:w10="urn:schemas-microsoft-com:office:word" xmlns:w="http://schemas.openxmlformats.org/wordprocessingml/2006/main" xmlns:w14="http://schemas.microsoft.com/office/word/2010/wordml" xmlns:w15="http://schemas.microsoft.com/office/word/2012/wordml" xmlns:w16cei="http://schemas.microsoft.com/office/word/2026/wordml/cei" xmlns:w16cex="http://schemas.microsoft.com/office/word/2018/wordml/cex" xmlns:w16cid="http://schemas.microsoft.com/office/word/2016/wordml/cid" xmlns:w16="http://schemas.microsoft.com/office/word/2018/wordml" xmlns:w16du="http://schemas.microsoft.com/office/word/2023/wordml/word16du" xmlns:w16sdtdh="http://schemas.microsoft.com/office/word/2020/wordml/sdtdatahash" xmlns:w16sdtfl="http://schemas.microsoft.com/office/word/2024/wordml/sdtformatlock" xmlns:w16se="http://schemas.microsoft.com/office/word/2015/wordml/symex" xmlns:wpg="http://schemas.microsoft.com/office/word/2010/wordprocessingGroup" xmlns:wpi="http://schemas.microsoft.com/office/word/2010/wordprocessingInk" xmlns:wne="http://schemas.microsoft.com/office/word/2006/wordml" xmlns:wps="http://schemas.microsoft.com/office/word/2010/wordprocessingShape" mc:Ignorable="w14 w15 w16se w16cid w16 w16cex w16sdtdh w16sdtfl w16du wp14">
   <w:endnote w:type="separator" w:id="-1">
     <w:p>
       <w:pPr>
@@ -11503,7 +10634,7 @@
 </file>
 
 <file path=word/footer1.xml><?xml version="1.0" encoding="utf-8"?>
-<w:ftr xmlns:wpc="http://schemas.microsoft.com/office/word/2010/wordprocessingCanvas" xmlns:cx="http://schemas.microsoft.com/office/drawing/2014/chartex" xmlns:cx1="http://schemas.microsoft.com/office/drawing/2015/9/8/chartex" xmlns:cx2="http://schemas.microsoft.com/office/drawing/2015/10/21/chartex" xmlns:cx3="http://schemas.microsoft.com/office/drawing/2016/5/9/chartex" xmlns:cx4="http://schemas.microsoft.com/office/drawing/2016/5/10/chartex" xmlns:cx5="http://schemas.microsoft.com/office/drawing/2016/5/11/chartex" xmlns:cx6="http://schemas.microsoft.com/office/drawing/2016/5/12/chartex" xmlns:cx7="http://schemas.microsoft.com/office/drawing/2016/5/13/chartex" xmlns:cx8="http://schemas.microsoft.com/office/drawing/2016/5/14/chartex" xmlns:mc="http://schemas.openxmlformats.org/markup-compatibility/2006" xmlns:aink="http://schemas.microsoft.com/office/drawing/2016/ink" xmlns:am3d="http://schemas.microsoft.com/office/drawing/2017/model3d" xmlns:o="urn:schemas-microsoft-com:office:office" xmlns:oel="http://schemas.microsoft.com/office/2019/extlst" xmlns:r="http://schemas.openxmlformats.org/officeDocument/2006/relationships" xmlns:m="http://schemas.openxmlformats.org/officeDocument/2006/math" xmlns:v="urn:schemas-microsoft-com:vml" xmlns:wp14="http://schemas.microsoft.com/office/word/2010/wordprocessingDrawing" xmlns:wp="http://schemas.openxmlformats.org/drawingml/2006/wordprocessingDrawing" xmlns:w10="urn:schemas-microsoft-com:office:word" xmlns:w="http://schemas.openxmlformats.org/wordprocessingml/2006/main" xmlns:w14="http://schemas.microsoft.com/office/word/2010/wordml" xmlns:w15="http://schemas.microsoft.com/office/word/2012/wordml" xmlns:w16cex="http://schemas.microsoft.com/office/word/2018/wordml/cex" xmlns:w16cid="http://schemas.microsoft.com/office/word/2016/wordml/cid" xmlns:w16="http://schemas.microsoft.com/office/word/2018/wordml" xmlns:w16du="http://schemas.microsoft.com/office/word/2023/wordml/word16du" xmlns:w16sdtdh="http://schemas.microsoft.com/office/word/2020/wordml/sdtdatahash" xmlns:w16sdtfl="http://schemas.microsoft.com/office/word/2024/wordml/sdtformatlock" xmlns:w16se="http://schemas.microsoft.com/office/word/2015/wordml/symex" xmlns:wpg="http://schemas.microsoft.com/office/word/2010/wordprocessingGroup" xmlns:wpi="http://schemas.microsoft.com/office/word/2010/wordprocessingInk" xmlns:wne="http://schemas.microsoft.com/office/word/2006/wordml" xmlns:wps="http://schemas.microsoft.com/office/word/2010/wordprocessingShape" mc:Ignorable="w14 w15 w16se w16cid w16 w16cex w16sdtdh w16sdtfl w16du wp14">
+<w:ftr xmlns:wpc="http://schemas.microsoft.com/office/word/2010/wordprocessingCanvas" xmlns:cx="http://schemas.microsoft.com/office/drawing/2014/chartex" xmlns:cx1="http://schemas.microsoft.com/office/drawing/2015/9/8/chartex" xmlns:cx2="http://schemas.microsoft.com/office/drawing/2015/10/21/chartex" xmlns:cx3="http://schemas.microsoft.com/office/drawing/2016/5/9/chartex" xmlns:cx4="http://schemas.microsoft.com/office/drawing/2016/5/10/chartex" xmlns:cx5="http://schemas.microsoft.com/office/drawing/2016/5/11/chartex" xmlns:cx6="http://schemas.microsoft.com/office/drawing/2016/5/12/chartex" xmlns:cx7="http://schemas.microsoft.com/office/drawing/2016/5/13/chartex" xmlns:cx8="http://schemas.microsoft.com/office/drawing/2016/5/14/chartex" xmlns:mc="http://schemas.openxmlformats.org/markup-compatibility/2006" xmlns:aink="http://schemas.microsoft.com/office/drawing/2016/ink" xmlns:am3d="http://schemas.microsoft.com/office/drawing/2017/model3d" xmlns:o="urn:schemas-microsoft-com:office:office" xmlns:oel="http://schemas.microsoft.com/office/2019/extlst" xmlns:r="http://schemas.openxmlformats.org/officeDocument/2006/relationships" xmlns:m="http://schemas.openxmlformats.org/officeDocument/2006/math" xmlns:v="urn:schemas-microsoft-com:vml" xmlns:wp14="http://schemas.microsoft.com/office/word/2010/wordprocessingDrawing" xmlns:wp="http://schemas.openxmlformats.org/drawingml/2006/wordprocessingDrawing" xmlns:w10="urn:schemas-microsoft-com:office:word" xmlns:w="http://schemas.openxmlformats.org/wordprocessingml/2006/main" xmlns:w14="http://schemas.microsoft.com/office/word/2010/wordml" xmlns:w15="http://schemas.microsoft.com/office/word/2012/wordml" xmlns:w16cei="http://schemas.microsoft.com/office/word/2026/wordml/cei" xmlns:w16cex="http://schemas.microsoft.com/office/word/2018/wordml/cex" xmlns:w16cid="http://schemas.microsoft.com/office/word/2016/wordml/cid" xmlns:w16="http://schemas.microsoft.com/office/word/2018/wordml" xmlns:w16du="http://schemas.microsoft.com/office/word/2023/wordml/word16du" xmlns:w16sdtdh="http://schemas.microsoft.com/office/word/2020/wordml/sdtdatahash" xmlns:w16sdtfl="http://schemas.microsoft.com/office/word/2024/wordml/sdtformatlock" xmlns:w16se="http://schemas.microsoft.com/office/word/2015/wordml/symex" xmlns:wpg="http://schemas.microsoft.com/office/word/2010/wordprocessingGroup" xmlns:wpi="http://schemas.microsoft.com/office/word/2010/wordprocessingInk" xmlns:wne="http://schemas.microsoft.com/office/word/2006/wordml" xmlns:wps="http://schemas.microsoft.com/office/word/2010/wordprocessingShape" mc:Ignorable="w14 w15 w16se w16cid w16 w16cex w16sdtdh w16sdtfl w16du wp14">
   <w:sdt>
     <w:sdtPr>
       <w:id w:val="114783488"/>
@@ -11551,7 +10682,7 @@
 </file>
 
 <file path=word/footnotes.xml><?xml version="1.0" encoding="utf-8"?>
-<w:footnotes xmlns:wpc="http://schemas.microsoft.com/office/word/2010/wordprocessingCanvas" xmlns:cx="http://schemas.microsoft.com/office/drawing/2014/chartex" xmlns:cx1="http://schemas.microsoft.com/office/drawing/2015/9/8/chartex" xmlns:cx2="http://schemas.microsoft.com/office/drawing/2015/10/21/chartex" xmlns:cx3="http://schemas.microsoft.com/office/drawing/2016/5/9/chartex" xmlns:cx4="http://schemas.microsoft.com/office/drawing/2016/5/10/chartex" xmlns:cx5="http://schemas.microsoft.com/office/drawing/2016/5/11/chartex" xmlns:cx6="http://schemas.microsoft.com/office/drawing/2016/5/12/chartex" xmlns:cx7="http://schemas.microsoft.com/office/drawing/2016/5/13/chartex" xmlns:cx8="http://schemas.microsoft.com/office/drawing/2016/5/14/chartex" xmlns:mc="http://schemas.openxmlformats.org/markup-compatibility/2006" xmlns:aink="http://schemas.microsoft.com/office/drawing/2016/ink" xmlns:am3d="http://schemas.microsoft.com/office/drawing/2017/model3d" xmlns:o="urn:schemas-microsoft-com:office:office" xmlns:oel="http://schemas.microsoft.com/office/2019/extlst" xmlns:r="http://schemas.openxmlformats.org/officeDocument/2006/relationships" xmlns:m="http://schemas.openxmlformats.org/officeDocument/2006/math" xmlns:v="urn:schemas-microsoft-com:vml" xmlns:wp14="http://schemas.microsoft.com/office/word/2010/wordprocessingDrawing" xmlns:wp="http://schemas.openxmlformats.org/drawingml/2006/wordprocessingDrawing" xmlns:w10="urn:schemas-microsoft-com:office:word" xmlns:w="http://schemas.openxmlformats.org/wordprocessingml/2006/main" xmlns:w14="http://schemas.microsoft.com/office/word/2010/wordml" xmlns:w15="http://schemas.microsoft.com/office/word/2012/wordml" xmlns:w16cex="http://schemas.microsoft.com/office/word/2018/wordml/cex" xmlns:w16cid="http://schemas.microsoft.com/office/word/2016/wordml/cid" xmlns:w16="http://schemas.microsoft.com/office/word/2018/wordml" xmlns:w16du="http://schemas.microsoft.com/office/word/2023/wordml/word16du" xmlns:w16sdtdh="http://schemas.microsoft.com/office/word/2020/wordml/sdtdatahash" xmlns:w16sdtfl="http://schemas.microsoft.com/office/word/2024/wordml/sdtformatlock" xmlns:w16se="http://schemas.microsoft.com/office/word/2015/wordml/symex" xmlns:wpg="http://schemas.microsoft.com/office/word/2010/wordprocessingGroup" xmlns:wpi="http://schemas.microsoft.com/office/word/2010/wordprocessingInk" xmlns:wne="http://schemas.microsoft.com/office/word/2006/wordml" xmlns:wps="http://schemas.microsoft.com/office/word/2010/wordprocessingShape" mc:Ignorable="w14 w15 w16se w16cid w16 w16cex w16sdtdh w16sdtfl w16du wp14">
+<w:footnotes xmlns:wpc="http://schemas.microsoft.com/office/word/2010/wordprocessingCanvas" xmlns:cx="http://schemas.microsoft.com/office/drawing/2014/chartex" xmlns:cx1="http://schemas.microsoft.com/office/drawing/2015/9/8/chartex" xmlns:cx2="http://schemas.microsoft.com/office/drawing/2015/10/21/chartex" xmlns:cx3="http://schemas.microsoft.com/office/drawing/2016/5/9/chartex" xmlns:cx4="http://schemas.microsoft.com/office/drawing/2016/5/10/chartex" xmlns:cx5="http://schemas.microsoft.com/office/drawing/2016/5/11/chartex" xmlns:cx6="http://schemas.microsoft.com/office/drawing/2016/5/12/chartex" xmlns:cx7="http://schemas.microsoft.com/office/drawing/2016/5/13/chartex" xmlns:cx8="http://schemas.microsoft.com/office/drawing/2016/5/14/chartex" xmlns:mc="http://schemas.openxmlformats.org/markup-compatibility/2006" xmlns:aink="http://schemas.microsoft.com/office/drawing/2016/ink" xmlns:am3d="http://schemas.microsoft.com/office/drawing/2017/model3d" xmlns:o="urn:schemas-microsoft-com:office:office" xmlns:oel="http://schemas.microsoft.com/office/2019/extlst" xmlns:r="http://schemas.openxmlformats.org/officeDocument/2006/relationships" xmlns:m="http://schemas.openxmlformats.org/officeDocument/2006/math" xmlns:v="urn:schemas-microsoft-com:vml" xmlns:wp14="http://schemas.microsoft.com/office/word/2010/wordprocessingDrawing" xmlns:wp="http://schemas.openxmlformats.org/drawingml/2006/wordprocessingDrawing" xmlns:w10="urn:schemas-microsoft-com:office:word" xmlns:w="http://schemas.openxmlformats.org/wordprocessingml/2006/main" xmlns:w14="http://schemas.microsoft.com/office/word/2010/wordml" xmlns:w15="http://schemas.microsoft.com/office/word/2012/wordml" xmlns:w16cei="http://schemas.microsoft.com/office/word/2026/wordml/cei" xmlns:w16cex="http://schemas.microsoft.com/office/word/2018/wordml/cex" xmlns:w16cid="http://schemas.microsoft.com/office/word/2016/wordml/cid" xmlns:w16="http://schemas.microsoft.com/office/word/2018/wordml" xmlns:w16du="http://schemas.microsoft.com/office/word/2023/wordml/word16du" xmlns:w16sdtdh="http://schemas.microsoft.com/office/word/2020/wordml/sdtdatahash" xmlns:w16sdtfl="http://schemas.microsoft.com/office/word/2024/wordml/sdtformatlock" xmlns:w16se="http://schemas.microsoft.com/office/word/2015/wordml/symex" xmlns:wpg="http://schemas.microsoft.com/office/word/2010/wordprocessingGroup" xmlns:wpi="http://schemas.microsoft.com/office/word/2010/wordprocessingInk" xmlns:wne="http://schemas.microsoft.com/office/word/2006/wordml" xmlns:wps="http://schemas.microsoft.com/office/word/2010/wordprocessingShape" mc:Ignorable="w14 w15 w16se w16cid w16 w16cex w16sdtdh w16sdtfl w16du wp14">
   <w:footnote w:type="separator" w:id="-1">
     <w:p>
       <w:pPr>
@@ -11576,7 +10707,7 @@
 </file>
 
 <file path=word/numbering.xml><?xml version="1.0" encoding="utf-8"?>
-<w:numbering xmlns:wpc="http://schemas.microsoft.com/office/word/2010/wordprocessingCanvas" xmlns:cx="http://schemas.microsoft.com/office/drawing/2014/chartex" xmlns:cx1="http://schemas.microsoft.com/office/drawing/2015/9/8/chartex" xmlns:cx2="http://schemas.microsoft.com/office/drawing/2015/10/21/chartex" xmlns:cx3="http://schemas.microsoft.com/office/drawing/2016/5/9/chartex" xmlns:cx4="http://schemas.microsoft.com/office/drawing/2016/5/10/chartex" xmlns:cx5="http://schemas.microsoft.com/office/drawing/2016/5/11/chartex" xmlns:cx6="http://schemas.microsoft.com/office/drawing/2016/5/12/chartex" xmlns:cx7="http://schemas.microsoft.com/office/drawing/2016/5/13/chartex" xmlns:cx8="http://schemas.microsoft.com/office/drawing/2016/5/14/chartex" xmlns:mc="http://schemas.openxmlformats.org/markup-compatibility/2006" xmlns:aink="http://schemas.microsoft.com/office/drawing/2016/ink" xmlns:am3d="http://schemas.microsoft.com/office/drawing/2017/model3d" xmlns:o="urn:schemas-microsoft-com:office:office" xmlns:oel="http://schemas.microsoft.com/office/2019/extlst" xmlns:r="http://schemas.openxmlformats.org/officeDocument/2006/relationships" xmlns:m="http://schemas.openxmlformats.org/officeDocument/2006/math" xmlns:v="urn:schemas-microsoft-com:vml" xmlns:wp14="http://schemas.microsoft.com/office/word/2010/wordprocessingDrawing" xmlns:wp="http://schemas.openxmlformats.org/drawingml/2006/wordprocessingDrawing" xmlns:w10="urn:schemas-microsoft-com:office:word" xmlns:w="http://schemas.openxmlformats.org/wordprocessingml/2006/main" xmlns:w14="http://schemas.microsoft.com/office/word/2010/wordml" xmlns:w15="http://schemas.microsoft.com/office/word/2012/wordml" xmlns:w16cex="http://schemas.microsoft.com/office/word/2018/wordml/cex" xmlns:w16cid="http://schemas.microsoft.com/office/word/2016/wordml/cid" xmlns:w16="http://schemas.microsoft.com/office/word/2018/wordml" xmlns:w16du="http://schemas.microsoft.com/office/word/2023/wordml/word16du" xmlns:w16sdtdh="http://schemas.microsoft.com/office/word/2020/wordml/sdtdatahash" xmlns:w16sdtfl="http://schemas.microsoft.com/office/word/2024/wordml/sdtformatlock" xmlns:w16se="http://schemas.microsoft.com/office/word/2015/wordml/symex" xmlns:wpg="http://schemas.microsoft.com/office/word/2010/wordprocessingGroup" xmlns:wpi="http://schemas.microsoft.com/office/word/2010/wordprocessingInk" xmlns:wne="http://schemas.microsoft.com/office/word/2006/wordml" xmlns:wps="http://schemas.microsoft.com/office/word/2010/wordprocessingShape" mc:Ignorable="w14 w15 w16se w16cid w16 w16cex w16sdtdh w16sdtfl w16du wp14">
+<w:numbering xmlns:wpc="http://schemas.microsoft.com/office/word/2010/wordprocessingCanvas" xmlns:cx="http://schemas.microsoft.com/office/drawing/2014/chartex" xmlns:cx1="http://schemas.microsoft.com/office/drawing/2015/9/8/chartex" xmlns:cx2="http://schemas.microsoft.com/office/drawing/2015/10/21/chartex" xmlns:cx3="http://schemas.microsoft.com/office/drawing/2016/5/9/chartex" xmlns:cx4="http://schemas.microsoft.com/office/drawing/2016/5/10/chartex" xmlns:cx5="http://schemas.microsoft.com/office/drawing/2016/5/11/chartex" xmlns:cx6="http://schemas.microsoft.com/office/drawing/2016/5/12/chartex" xmlns:cx7="http://schemas.microsoft.com/office/drawing/2016/5/13/chartex" xmlns:cx8="http://schemas.microsoft.com/office/drawing/2016/5/14/chartex" xmlns:mc="http://schemas.openxmlformats.org/markup-compatibility/2006" xmlns:aink="http://schemas.microsoft.com/office/drawing/2016/ink" xmlns:am3d="http://schemas.microsoft.com/office/drawing/2017/model3d" xmlns:o="urn:schemas-microsoft-com:office:office" xmlns:oel="http://schemas.microsoft.com/office/2019/extlst" xmlns:r="http://schemas.openxmlformats.org/officeDocument/2006/relationships" xmlns:m="http://schemas.openxmlformats.org/officeDocument/2006/math" xmlns:v="urn:schemas-microsoft-com:vml" xmlns:wp14="http://schemas.microsoft.com/office/word/2010/wordprocessingDrawing" xmlns:wp="http://schemas.openxmlformats.org/drawingml/2006/wordprocessingDrawing" xmlns:w10="urn:schemas-microsoft-com:office:word" xmlns:w="http://schemas.openxmlformats.org/wordprocessingml/2006/main" xmlns:w14="http://schemas.microsoft.com/office/word/2010/wordml" xmlns:w15="http://schemas.microsoft.com/office/word/2012/wordml" xmlns:w16cei="http://schemas.microsoft.com/office/word/2026/wordml/cei" xmlns:w16cex="http://schemas.microsoft.com/office/word/2018/wordml/cex" xmlns:w16cid="http://schemas.microsoft.com/office/word/2016/wordml/cid" xmlns:w16="http://schemas.microsoft.com/office/word/2018/wordml" xmlns:w16du="http://schemas.microsoft.com/office/word/2023/wordml/word16du" xmlns:w16sdtdh="http://schemas.microsoft.com/office/word/2020/wordml/sdtdatahash" xmlns:w16sdtfl="http://schemas.microsoft.com/office/word/2024/wordml/sdtformatlock" xmlns:w16se="http://schemas.microsoft.com/office/word/2015/wordml/symex" xmlns:wpg="http://schemas.microsoft.com/office/word/2010/wordprocessingGroup" xmlns:wpi="http://schemas.microsoft.com/office/word/2010/wordprocessingInk" xmlns:wne="http://schemas.microsoft.com/office/word/2006/wordml" xmlns:wps="http://schemas.microsoft.com/office/word/2010/wordprocessingShape" mc:Ignorable="w14 w15 w16se w16cid w16 w16cex w16sdtdh w16sdtfl w16du wp14">
   <w:numPicBullet w:numPicBulletId="0">
     <w:pict>
       <v:shapetype id="_x0000_t75" coordsize="21600,21600" o:spt="75" o:preferrelative="t" path="m@4@5l@4@11@9@11@9@5xe" filled="f" stroked="f">

</xml_diff>

<commit_message>
Rebuild Chapter 5 cartography and photo section
</commit_message>
<xml_diff>
--- a/public/chapter-5/Chapter5 Mécanisme de Stress.docx
+++ b/public/chapter-5/Chapter5 Mécanisme de Stress.docx
@@ -1,6 +1,6 @@
 
 <file path=word/document.xml><?xml version="1.0" encoding="utf-8"?>
-<w:document xmlns:wpc="http://schemas.microsoft.com/office/word/2010/wordprocessingCanvas" xmlns:cx="http://schemas.microsoft.com/office/drawing/2014/chartex" xmlns:cx1="http://schemas.microsoft.com/office/drawing/2015/9/8/chartex" xmlns:cx2="http://schemas.microsoft.com/office/drawing/2015/10/21/chartex" xmlns:cx3="http://schemas.microsoft.com/office/drawing/2016/5/9/chartex" xmlns:cx4="http://schemas.microsoft.com/office/drawing/2016/5/10/chartex" xmlns:cx5="http://schemas.microsoft.com/office/drawing/2016/5/11/chartex" xmlns:cx6="http://schemas.microsoft.com/office/drawing/2016/5/12/chartex" xmlns:cx7="http://schemas.microsoft.com/office/drawing/2016/5/13/chartex" xmlns:cx8="http://schemas.microsoft.com/office/drawing/2016/5/14/chartex" xmlns:mc="http://schemas.openxmlformats.org/markup-compatibility/2006" xmlns:aink="http://schemas.microsoft.com/office/drawing/2016/ink" xmlns:am3d="http://schemas.microsoft.com/office/drawing/2017/model3d" xmlns:o="urn:schemas-microsoft-com:office:office" xmlns:oel="http://schemas.microsoft.com/office/2019/extlst" xmlns:r="http://schemas.openxmlformats.org/officeDocument/2006/relationships" xmlns:m="http://schemas.openxmlformats.org/officeDocument/2006/math" xmlns:v="urn:schemas-microsoft-com:vml" xmlns:wp14="http://schemas.microsoft.com/office/word/2010/wordprocessingDrawing" xmlns:wp="http://schemas.openxmlformats.org/drawingml/2006/wordprocessingDrawing" xmlns:w10="urn:schemas-microsoft-com:office:word" xmlns:w="http://schemas.openxmlformats.org/wordprocessingml/2006/main" xmlns:w14="http://schemas.microsoft.com/office/word/2010/wordml" xmlns:w15="http://schemas.microsoft.com/office/word/2012/wordml" xmlns:w16cei="http://schemas.microsoft.com/office/word/2026/wordml/cei" xmlns:w16cex="http://schemas.microsoft.com/office/word/2018/wordml/cex" xmlns:w16cid="http://schemas.microsoft.com/office/word/2016/wordml/cid" xmlns:w16="http://schemas.microsoft.com/office/word/2018/wordml" xmlns:w16du="http://schemas.microsoft.com/office/word/2023/wordml/word16du" xmlns:w16sdtdh="http://schemas.microsoft.com/office/word/2020/wordml/sdtdatahash" xmlns:w16sdtfl="http://schemas.microsoft.com/office/word/2024/wordml/sdtformatlock" xmlns:w16se="http://schemas.microsoft.com/office/word/2015/wordml/symex" xmlns:wpg="http://schemas.microsoft.com/office/word/2010/wordprocessingGroup" xmlns:wpi="http://schemas.microsoft.com/office/word/2010/wordprocessingInk" xmlns:wne="http://schemas.microsoft.com/office/word/2006/wordml" xmlns:wps="http://schemas.microsoft.com/office/word/2010/wordprocessingShape" mc:Ignorable="w14 w15 w16se w16cid w16 w16cex w16sdtdh w16sdtfl w16du wp14">
+<w:document xmlns:wpc="http://schemas.microsoft.com/office/word/2010/wordprocessingCanvas" xmlns:cx="http://schemas.microsoft.com/office/drawing/2014/chartex" xmlns:cx1="http://schemas.microsoft.com/office/drawing/2015/9/8/chartex" xmlns:cx2="http://schemas.microsoft.com/office/drawing/2015/10/21/chartex" xmlns:cx3="http://schemas.microsoft.com/office/drawing/2016/5/9/chartex" xmlns:cx4="http://schemas.microsoft.com/office/drawing/2016/5/10/chartex" xmlns:cx5="http://schemas.microsoft.com/office/drawing/2016/5/11/chartex" xmlns:cx6="http://schemas.microsoft.com/office/drawing/2016/5/12/chartex" xmlns:cx7="http://schemas.microsoft.com/office/drawing/2016/5/13/chartex" xmlns:cx8="http://schemas.microsoft.com/office/drawing/2016/5/14/chartex" xmlns:mc="http://schemas.openxmlformats.org/markup-compatibility/2006" xmlns:aink="http://schemas.microsoft.com/office/drawing/2016/ink" xmlns:am3d="http://schemas.microsoft.com/office/drawing/2017/model3d" xmlns:o="urn:schemas-microsoft-com:office:office" xmlns:oel="http://schemas.microsoft.com/office/2019/extlst" xmlns:r="http://schemas.openxmlformats.org/officeDocument/2006/relationships" xmlns:m="http://schemas.openxmlformats.org/officeDocument/2006/math" xmlns:v="urn:schemas-microsoft-com:vml" xmlns:wp14="http://schemas.microsoft.com/office/word/2010/wordprocessingDrawing" xmlns:wp="http://schemas.openxmlformats.org/drawingml/2006/wordprocessingDrawing" xmlns:w10="urn:schemas-microsoft-com:office:word" xmlns:w="http://schemas.openxmlformats.org/wordprocessingml/2006/main" xmlns:w14="http://schemas.microsoft.com/office/word/2010/wordml" xmlns:w15="http://schemas.microsoft.com/office/word/2012/wordml" xmlns:w16cex="http://schemas.microsoft.com/office/word/2018/wordml/cex" xmlns:w16cid="http://schemas.microsoft.com/office/word/2016/wordml/cid" xmlns:w16="http://schemas.microsoft.com/office/word/2018/wordml" xmlns:w16du="http://schemas.microsoft.com/office/word/2023/wordml/word16du" xmlns:w16sdtdh="http://schemas.microsoft.com/office/word/2020/wordml/sdtdatahash" xmlns:w16sdtfl="http://schemas.microsoft.com/office/word/2024/wordml/sdtformatlock" xmlns:w16se="http://schemas.microsoft.com/office/word/2015/wordml/symex" xmlns:wpg="http://schemas.microsoft.com/office/word/2010/wordprocessingGroup" xmlns:wpi="http://schemas.microsoft.com/office/word/2010/wordprocessingInk" xmlns:wne="http://schemas.microsoft.com/office/word/2006/wordml" xmlns:wps="http://schemas.microsoft.com/office/word/2010/wordprocessingShape" mc:Ignorable="w14 w15 w16se w16cid w16 w16cex w16sdtdh w16sdtfl w16du wp14">
   <w:body>
     <w:p>
       <w:pPr>
@@ -9996,6 +9996,181 @@
     <w:p>
       <w:pPr>
         <w:pStyle w:val="ListParagraph"/>
+        <w:tabs>
+          <w:tab w:val="left" w:pos="1418"/>
+        </w:tabs>
+        <w:ind w:left="709"/>
+        <w:jc w:val="both"/>
+        <w:rPr>
+          <w:rFonts w:ascii="Times New Roman" w:hAnsi="Times New Roman" w:cs="Times New Roman"/>
+          <w:sz w:val="24"/>
+          <w:szCs w:val="24"/>
+        </w:rPr>
+      </w:pPr>
+      <w:r>
+        <w:rPr>
+          <w:rFonts w:ascii="Times New Roman" w:hAnsi="Times New Roman" w:cs="Times New Roman"/>
+          <w:sz w:val="24"/>
+          <w:szCs w:val="24"/>
+        </w:rPr>
+        <w:t xml:space="preserve">Dans la pratique ROP, la sollicitation douce des zones occipitales vise d’abord à apaiser le système avant un travail plus ciblé. Par l’intermédiaire des afférences cutanées, </w:t>
+      </w:r>
+      <w:proofErr w:type="spellStart"/>
+      <w:r>
+        <w:rPr>
+          <w:rFonts w:ascii="Times New Roman" w:hAnsi="Times New Roman" w:cs="Times New Roman"/>
+          <w:sz w:val="24"/>
+          <w:szCs w:val="24"/>
+        </w:rPr>
+        <w:t>myofasciales</w:t>
+      </w:r>
+      <w:proofErr w:type="spellEnd"/>
+      <w:r>
+        <w:rPr>
+          <w:rFonts w:ascii="Times New Roman" w:hAnsi="Times New Roman" w:cs="Times New Roman"/>
+          <w:sz w:val="24"/>
+          <w:szCs w:val="24"/>
+        </w:rPr>
+        <w:t xml:space="preserve"> et proprioceptives de la région C2–C3, elle peut contribuer à réduire l’hypervigilance, les tensions de protection, la surcharge nociceptive et l’agitation respiratoire ou émotionnelle. </w:t>
+      </w:r>
+    </w:p>
+    <w:p>
+      <w:pPr>
+        <w:pStyle w:val="ListParagraph"/>
+        <w:tabs>
+          <w:tab w:val="left" w:pos="1418"/>
+        </w:tabs>
+        <w:ind w:left="709"/>
+        <w:jc w:val="both"/>
+        <w:rPr>
+          <w:rFonts w:ascii="Times New Roman" w:hAnsi="Times New Roman" w:cs="Times New Roman"/>
+          <w:sz w:val="24"/>
+          <w:szCs w:val="24"/>
+        </w:rPr>
+      </w:pPr>
+    </w:p>
+    <w:p>
+      <w:pPr>
+        <w:pStyle w:val="ListParagraph"/>
+        <w:tabs>
+          <w:tab w:val="left" w:pos="1418"/>
+        </w:tabs>
+        <w:ind w:left="709"/>
+        <w:jc w:val="both"/>
+        <w:rPr>
+          <w:rFonts w:ascii="Times New Roman" w:hAnsi="Times New Roman" w:cs="Times New Roman"/>
+          <w:sz w:val="24"/>
+          <w:szCs w:val="24"/>
+        </w:rPr>
+      </w:pPr>
+      <w:r>
+        <w:rPr>
+          <w:rFonts w:ascii="Times New Roman" w:hAnsi="Times New Roman" w:cs="Times New Roman"/>
+          <w:sz w:val="24"/>
+          <w:szCs w:val="24"/>
+        </w:rPr>
+        <w:t xml:space="preserve">Les trois bandes </w:t>
+      </w:r>
+      <w:r>
+        <w:rPr>
+          <w:rFonts w:ascii="Times New Roman" w:hAnsi="Times New Roman" w:cs="Times New Roman"/>
+          <w:sz w:val="24"/>
+          <w:szCs w:val="24"/>
+        </w:rPr>
+        <w:t xml:space="preserve">- </w:t>
+      </w:r>
+      <w:r>
+        <w:rPr>
+          <w:rFonts w:ascii="Times New Roman" w:hAnsi="Times New Roman" w:cs="Times New Roman"/>
+          <w:sz w:val="24"/>
+          <w:szCs w:val="24"/>
+        </w:rPr>
+        <w:t xml:space="preserve">parasympathique, orthosympathique et structurelle </w:t>
+      </w:r>
+      <w:proofErr w:type="gramStart"/>
+      <w:r>
+        <w:rPr>
+          <w:rFonts w:ascii="Times New Roman" w:hAnsi="Times New Roman" w:cs="Times New Roman"/>
+          <w:sz w:val="24"/>
+          <w:szCs w:val="24"/>
+        </w:rPr>
+        <w:t xml:space="preserve">- </w:t>
+      </w:r>
+      <w:r>
+        <w:rPr>
+          <w:rFonts w:ascii="Times New Roman" w:hAnsi="Times New Roman" w:cs="Times New Roman"/>
+          <w:sz w:val="24"/>
+          <w:szCs w:val="24"/>
+        </w:rPr>
+        <w:t xml:space="preserve"> restent</w:t>
+      </w:r>
+      <w:proofErr w:type="gramEnd"/>
+      <w:r>
+        <w:rPr>
+          <w:rFonts w:ascii="Times New Roman" w:hAnsi="Times New Roman" w:cs="Times New Roman"/>
+          <w:sz w:val="24"/>
+          <w:szCs w:val="24"/>
+        </w:rPr>
+        <w:t xml:space="preserve"> des repères cliniques dont les qualités de palpation peuvent varier selon le niveau de stress et l’état d’adaptation du patient. </w:t>
+      </w:r>
+    </w:p>
+    <w:p>
+      <w:pPr>
+        <w:pStyle w:val="ListParagraph"/>
+        <w:tabs>
+          <w:tab w:val="left" w:pos="1418"/>
+        </w:tabs>
+        <w:ind w:left="709"/>
+        <w:jc w:val="both"/>
+        <w:rPr>
+          <w:rFonts w:ascii="Times New Roman" w:hAnsi="Times New Roman" w:cs="Times New Roman"/>
+          <w:sz w:val="24"/>
+          <w:szCs w:val="24"/>
+        </w:rPr>
+      </w:pPr>
+    </w:p>
+    <w:p>
+      <w:pPr>
+        <w:pStyle w:val="ListParagraph"/>
+        <w:tabs>
+          <w:tab w:val="left" w:pos="1418"/>
+        </w:tabs>
+        <w:ind w:left="709"/>
+        <w:jc w:val="both"/>
+        <w:rPr>
+          <w:rFonts w:ascii="Times New Roman" w:hAnsi="Times New Roman" w:cs="Times New Roman"/>
+          <w:sz w:val="24"/>
+          <w:szCs w:val="24"/>
+        </w:rPr>
+      </w:pPr>
+      <w:r>
+        <w:rPr>
+          <w:rFonts w:ascii="Times New Roman" w:hAnsi="Times New Roman" w:cs="Times New Roman"/>
+          <w:sz w:val="24"/>
+          <w:szCs w:val="24"/>
+        </w:rPr>
+        <w:t>L’objectif n’est pas de commander directement le système autonome, mais d’introduire une information sensorielle apaisante afin de rendre le patient plus disponible pour la suite du traitement, notamment le travail podal.</w:t>
+      </w:r>
+    </w:p>
+    <w:p>
+      <w:pPr>
+        <w:pStyle w:val="ListParagraph"/>
+        <w:tabs>
+          <w:tab w:val="left" w:pos="1418"/>
+        </w:tabs>
+        <w:ind w:left="709"/>
+        <w:jc w:val="both"/>
+        <w:rPr>
+          <w:rFonts w:ascii="Times New Roman" w:hAnsi="Times New Roman" w:cs="Times New Roman"/>
+          <w:b/>
+          <w:sz w:val="24"/>
+          <w:szCs w:val="24"/>
+        </w:rPr>
+      </w:pPr>
+    </w:p>
+    <w:p>
+      <w:pPr>
+        <w:pStyle w:val="ListParagraph"/>
         <w:numPr>
           <w:ilvl w:val="1"/>
           <w:numId w:val="7"/>
@@ -10353,10 +10528,157 @@
     </w:p>
     <w:p>
       <w:pPr>
+        <w:jc w:val="both"/>
+        <w:rPr>
+          <w:rFonts w:ascii="Times New Roman" w:hAnsi="Times New Roman" w:cs="Times New Roman"/>
+          <w:sz w:val="24"/>
+          <w:szCs w:val="24"/>
+        </w:rPr>
+      </w:pPr>
+    </w:p>
+    <w:p>
+      <w:pPr>
+        <w:pStyle w:val="ListParagraph"/>
+        <w:numPr>
+          <w:ilvl w:val="1"/>
+          <w:numId w:val="7"/>
+        </w:numPr>
+        <w:jc w:val="both"/>
+        <w:rPr>
+          <w:rFonts w:ascii="Times New Roman" w:hAnsi="Times New Roman" w:cs="Times New Roman"/>
+          <w:b/>
+          <w:sz w:val="24"/>
+          <w:szCs w:val="24"/>
+        </w:rPr>
+      </w:pPr>
+      <w:r>
+        <w:rPr>
+          <w:rFonts w:ascii="Times New Roman" w:hAnsi="Times New Roman" w:cs="Times New Roman"/>
+          <w:b/>
+          <w:sz w:val="24"/>
+          <w:szCs w:val="24"/>
+        </w:rPr>
+        <w:lastRenderedPageBreak/>
+        <w:t xml:space="preserve">Syndrome </w:t>
+      </w:r>
+      <w:r>
+        <w:rPr>
+          <w:rFonts w:ascii="Times New Roman" w:hAnsi="Times New Roman" w:cs="Times New Roman"/>
+          <w:b/>
+          <w:sz w:val="24"/>
+          <w:szCs w:val="24"/>
+        </w:rPr>
+        <w:t>locorégional</w:t>
+      </w:r>
+      <w:r>
+        <w:rPr>
+          <w:rFonts w:ascii="Times New Roman" w:hAnsi="Times New Roman" w:cs="Times New Roman"/>
+          <w:b/>
+          <w:sz w:val="24"/>
+          <w:szCs w:val="24"/>
+        </w:rPr>
+        <w:t> :</w:t>
+      </w:r>
+      <w:r>
+        <w:rPr>
+          <w:rFonts w:ascii="Times New Roman" w:hAnsi="Times New Roman" w:cs="Times New Roman"/>
+          <w:b/>
+          <w:sz w:val="24"/>
+          <w:szCs w:val="24"/>
+        </w:rPr>
+        <w:t xml:space="preserve"> </w:t>
+      </w:r>
+    </w:p>
+    <w:p>
+      <w:pPr>
+        <w:pStyle w:val="ListParagraph"/>
+        <w:ind w:left="1440"/>
+        <w:jc w:val="both"/>
+        <w:rPr>
+          <w:rFonts w:ascii="Times New Roman" w:hAnsi="Times New Roman" w:cs="Times New Roman"/>
+          <w:b/>
+          <w:color w:val="FF0000"/>
+          <w:sz w:val="24"/>
+          <w:szCs w:val="24"/>
+        </w:rPr>
+      </w:pPr>
+    </w:p>
+    <w:p>
+      <w:pPr>
+        <w:ind w:left="1080"/>
+        <w:jc w:val="both"/>
+        <w:rPr>
+          <w:rFonts w:ascii="Times New Roman" w:hAnsi="Times New Roman" w:cs="Times New Roman"/>
+          <w:sz w:val="24"/>
+          <w:szCs w:val="24"/>
+        </w:rPr>
+      </w:pPr>
+      <w:r>
+        <w:rPr>
+          <w:rFonts w:ascii="Times New Roman" w:hAnsi="Times New Roman" w:cs="Times New Roman"/>
+          <w:sz w:val="24"/>
+          <w:szCs w:val="24"/>
+        </w:rPr>
+        <w:t>C</w:t>
+      </w:r>
+      <w:r>
+        <w:rPr>
+          <w:rFonts w:ascii="Times New Roman" w:hAnsi="Times New Roman" w:cs="Times New Roman"/>
+          <w:sz w:val="24"/>
+          <w:szCs w:val="24"/>
+        </w:rPr>
+        <w:t>’est une</w:t>
+      </w:r>
+      <w:r>
+        <w:rPr>
+          <w:rFonts w:ascii="Times New Roman" w:hAnsi="Times New Roman" w:cs="Times New Roman"/>
+          <w:b/>
+          <w:sz w:val="24"/>
+          <w:szCs w:val="24"/>
+        </w:rPr>
+        <w:t xml:space="preserve"> </w:t>
+      </w:r>
+      <w:r>
+        <w:rPr>
+          <w:rFonts w:ascii="Times New Roman" w:hAnsi="Times New Roman" w:cs="Times New Roman"/>
+          <w:sz w:val="24"/>
+          <w:szCs w:val="24"/>
+        </w:rPr>
+        <w:t xml:space="preserve">compression mécanique locale du système nerveux somatique </w:t>
+      </w:r>
+      <w:proofErr w:type="gramStart"/>
+      <w:r>
+        <w:rPr>
+          <w:rFonts w:ascii="Times New Roman" w:hAnsi="Times New Roman" w:cs="Times New Roman"/>
+          <w:sz w:val="24"/>
+          <w:szCs w:val="24"/>
+        </w:rPr>
+        <w:t>ou  autonome</w:t>
+      </w:r>
+      <w:proofErr w:type="gramEnd"/>
+      <w:r>
+        <w:rPr>
+          <w:rFonts w:ascii="Times New Roman" w:hAnsi="Times New Roman" w:cs="Times New Roman"/>
+          <w:sz w:val="24"/>
+          <w:szCs w:val="24"/>
+        </w:rPr>
+        <w:t xml:space="preserve"> avec retentissement secondaire général.</w:t>
+      </w:r>
+      <w:r>
+        <w:rPr>
+          <w:rFonts w:ascii="Times New Roman" w:hAnsi="Times New Roman" w:cs="Times New Roman"/>
+          <w:sz w:val="24"/>
+          <w:szCs w:val="24"/>
+        </w:rPr>
+        <w:t xml:space="preserve"> </w:t>
+      </w:r>
+    </w:p>
+    <w:p>
+      <w:pPr>
         <w:pStyle w:val="ListParagraph"/>
         <w:numPr>
           <w:ilvl w:val="0"/>
-          <w:numId w:val="10"/>
+          <w:numId w:val="18"/>
         </w:numPr>
         <w:jc w:val="both"/>
         <w:rPr>
@@ -10367,83 +10689,6 @@
           <w:szCs w:val="24"/>
         </w:rPr>
       </w:pPr>
-      <w:r>
-        <w:rPr>
-          <w:rFonts w:ascii="Times New Roman" w:hAnsi="Times New Roman" w:cs="Times New Roman"/>
-          <w:b/>
-          <w:sz w:val="24"/>
-          <w:szCs w:val="24"/>
-        </w:rPr>
-        <w:t xml:space="preserve">Syndrome </w:t>
-      </w:r>
-      <w:r>
-        <w:rPr>
-          <w:rFonts w:ascii="Times New Roman" w:hAnsi="Times New Roman" w:cs="Times New Roman"/>
-          <w:b/>
-          <w:sz w:val="24"/>
-          <w:szCs w:val="24"/>
-        </w:rPr>
-        <w:t>locorégional</w:t>
-      </w:r>
-      <w:r>
-        <w:rPr>
-          <w:rFonts w:ascii="Times New Roman" w:hAnsi="Times New Roman" w:cs="Times New Roman"/>
-          <w:sz w:val="24"/>
-          <w:szCs w:val="24"/>
-        </w:rPr>
-        <w:t> :</w:t>
-      </w:r>
-      <w:r>
-        <w:rPr>
-          <w:rFonts w:ascii="Times New Roman" w:hAnsi="Times New Roman" w:cs="Times New Roman"/>
-          <w:sz w:val="24"/>
-          <w:szCs w:val="24"/>
-        </w:rPr>
-        <w:t xml:space="preserve"> c’est une</w:t>
-      </w:r>
-      <w:r>
-        <w:rPr>
-          <w:rFonts w:ascii="Times New Roman" w:hAnsi="Times New Roman" w:cs="Times New Roman"/>
-          <w:b/>
-          <w:sz w:val="24"/>
-          <w:szCs w:val="24"/>
-        </w:rPr>
-        <w:t xml:space="preserve"> </w:t>
-      </w:r>
-      <w:r>
-        <w:rPr>
-          <w:rFonts w:ascii="Times New Roman" w:hAnsi="Times New Roman" w:cs="Times New Roman"/>
-          <w:sz w:val="24"/>
-          <w:szCs w:val="24"/>
-        </w:rPr>
-        <w:t xml:space="preserve">compression mécanique locale du système nerveux somatique </w:t>
-      </w:r>
-      <w:proofErr w:type="gramStart"/>
-      <w:r>
-        <w:rPr>
-          <w:rFonts w:ascii="Times New Roman" w:hAnsi="Times New Roman" w:cs="Times New Roman"/>
-          <w:sz w:val="24"/>
-          <w:szCs w:val="24"/>
-        </w:rPr>
-        <w:t>ou  autonome</w:t>
-      </w:r>
-      <w:proofErr w:type="gramEnd"/>
-      <w:r>
-        <w:rPr>
-          <w:rFonts w:ascii="Times New Roman" w:hAnsi="Times New Roman" w:cs="Times New Roman"/>
-          <w:sz w:val="24"/>
-          <w:szCs w:val="24"/>
-        </w:rPr>
-        <w:t xml:space="preserve"> avec retentissement secondaire général.</w:t>
-      </w:r>
-      <w:r>
-        <w:rPr>
-          <w:rFonts w:ascii="Times New Roman" w:hAnsi="Times New Roman" w:cs="Times New Roman"/>
-          <w:sz w:val="24"/>
-          <w:szCs w:val="24"/>
-        </w:rPr>
-        <w:t xml:space="preserve"> </w:t>
-      </w:r>
       <w:r>
         <w:rPr>
           <w:rFonts w:ascii="Times New Roman" w:hAnsi="Times New Roman" w:cs="Times New Roman"/>
@@ -10528,10 +10773,13 @@
         <w:pStyle w:val="ListParagraph"/>
         <w:numPr>
           <w:ilvl w:val="0"/>
-          <w:numId w:val="10"/>
+          <w:numId w:val="18"/>
         </w:numPr>
-        <w:rPr>
-          <w:rFonts w:ascii="Times New Roman" w:hAnsi="Times New Roman" w:cs="Times New Roman"/>
+        <w:jc w:val="both"/>
+        <w:rPr>
+          <w:rFonts w:ascii="Times New Roman" w:hAnsi="Times New Roman" w:cs="Times New Roman"/>
+          <w:b/>
+          <w:color w:val="FF0000"/>
           <w:sz w:val="24"/>
           <w:szCs w:val="24"/>
         </w:rPr>
@@ -10609,7 +10857,7 @@
 </file>
 
 <file path=word/endnotes.xml><?xml version="1.0" encoding="utf-8"?>
-<w:endnotes xmlns:wpc="http://schemas.microsoft.com/office/word/2010/wordprocessingCanvas" xmlns:cx="http://schemas.microsoft.com/office/drawing/2014/chartex" xmlns:cx1="http://schemas.microsoft.com/office/drawing/2015/9/8/chartex" xmlns:cx2="http://schemas.microsoft.com/office/drawing/2015/10/21/chartex" xmlns:cx3="http://schemas.microsoft.com/office/drawing/2016/5/9/chartex" xmlns:cx4="http://schemas.microsoft.com/office/drawing/2016/5/10/chartex" xmlns:cx5="http://schemas.microsoft.com/office/drawing/2016/5/11/chartex" xmlns:cx6="http://schemas.microsoft.com/office/drawing/2016/5/12/chartex" xmlns:cx7="http://schemas.microsoft.com/office/drawing/2016/5/13/chartex" xmlns:cx8="http://schemas.microsoft.com/office/drawing/2016/5/14/chartex" xmlns:mc="http://schemas.openxmlformats.org/markup-compatibility/2006" xmlns:aink="http://schemas.microsoft.com/office/drawing/2016/ink" xmlns:am3d="http://schemas.microsoft.com/office/drawing/2017/model3d" xmlns:o="urn:schemas-microsoft-com:office:office" xmlns:oel="http://schemas.microsoft.com/office/2019/extlst" xmlns:r="http://schemas.openxmlformats.org/officeDocument/2006/relationships" xmlns:m="http://schemas.openxmlformats.org/officeDocument/2006/math" xmlns:v="urn:schemas-microsoft-com:vml" xmlns:wp14="http://schemas.microsoft.com/office/word/2010/wordprocessingDrawing" xmlns:wp="http://schemas.openxmlformats.org/drawingml/2006/wordprocessingDrawing" xmlns:w10="urn:schemas-microsoft-com:office:word" xmlns:w="http://schemas.openxmlformats.org/wordprocessingml/2006/main" xmlns:w14="http://schemas.microsoft.com/office/word/2010/wordml" xmlns:w15="http://schemas.microsoft.com/office/word/2012/wordml" xmlns:w16cei="http://schemas.microsoft.com/office/word/2026/wordml/cei" xmlns:w16cex="http://schemas.microsoft.com/office/word/2018/wordml/cex" xmlns:w16cid="http://schemas.microsoft.com/office/word/2016/wordml/cid" xmlns:w16="http://schemas.microsoft.com/office/word/2018/wordml" xmlns:w16du="http://schemas.microsoft.com/office/word/2023/wordml/word16du" xmlns:w16sdtdh="http://schemas.microsoft.com/office/word/2020/wordml/sdtdatahash" xmlns:w16sdtfl="http://schemas.microsoft.com/office/word/2024/wordml/sdtformatlock" xmlns:w16se="http://schemas.microsoft.com/office/word/2015/wordml/symex" xmlns:wpg="http://schemas.microsoft.com/office/word/2010/wordprocessingGroup" xmlns:wpi="http://schemas.microsoft.com/office/word/2010/wordprocessingInk" xmlns:wne="http://schemas.microsoft.com/office/word/2006/wordml" xmlns:wps="http://schemas.microsoft.com/office/word/2010/wordprocessingShape" mc:Ignorable="w14 w15 w16se w16cid w16 w16cex w16sdtdh w16sdtfl w16du wp14">
+<w:endnotes xmlns:wpc="http://schemas.microsoft.com/office/word/2010/wordprocessingCanvas" xmlns:cx="http://schemas.microsoft.com/office/drawing/2014/chartex" xmlns:cx1="http://schemas.microsoft.com/office/drawing/2015/9/8/chartex" xmlns:cx2="http://schemas.microsoft.com/office/drawing/2015/10/21/chartex" xmlns:cx3="http://schemas.microsoft.com/office/drawing/2016/5/9/chartex" xmlns:cx4="http://schemas.microsoft.com/office/drawing/2016/5/10/chartex" xmlns:cx5="http://schemas.microsoft.com/office/drawing/2016/5/11/chartex" xmlns:cx6="http://schemas.microsoft.com/office/drawing/2016/5/12/chartex" xmlns:cx7="http://schemas.microsoft.com/office/drawing/2016/5/13/chartex" xmlns:cx8="http://schemas.microsoft.com/office/drawing/2016/5/14/chartex" xmlns:mc="http://schemas.openxmlformats.org/markup-compatibility/2006" xmlns:aink="http://schemas.microsoft.com/office/drawing/2016/ink" xmlns:am3d="http://schemas.microsoft.com/office/drawing/2017/model3d" xmlns:o="urn:schemas-microsoft-com:office:office" xmlns:oel="http://schemas.microsoft.com/office/2019/extlst" xmlns:r="http://schemas.openxmlformats.org/officeDocument/2006/relationships" xmlns:m="http://schemas.openxmlformats.org/officeDocument/2006/math" xmlns:v="urn:schemas-microsoft-com:vml" xmlns:wp14="http://schemas.microsoft.com/office/word/2010/wordprocessingDrawing" xmlns:wp="http://schemas.openxmlformats.org/drawingml/2006/wordprocessingDrawing" xmlns:w10="urn:schemas-microsoft-com:office:word" xmlns:w="http://schemas.openxmlformats.org/wordprocessingml/2006/main" xmlns:w14="http://schemas.microsoft.com/office/word/2010/wordml" xmlns:w15="http://schemas.microsoft.com/office/word/2012/wordml" xmlns:w16cex="http://schemas.microsoft.com/office/word/2018/wordml/cex" xmlns:w16cid="http://schemas.microsoft.com/office/word/2016/wordml/cid" xmlns:w16="http://schemas.microsoft.com/office/word/2018/wordml" xmlns:w16du="http://schemas.microsoft.com/office/word/2023/wordml/word16du" xmlns:w16sdtdh="http://schemas.microsoft.com/office/word/2020/wordml/sdtdatahash" xmlns:w16sdtfl="http://schemas.microsoft.com/office/word/2024/wordml/sdtformatlock" xmlns:w16se="http://schemas.microsoft.com/office/word/2015/wordml/symex" xmlns:wpg="http://schemas.microsoft.com/office/word/2010/wordprocessingGroup" xmlns:wpi="http://schemas.microsoft.com/office/word/2010/wordprocessingInk" xmlns:wne="http://schemas.microsoft.com/office/word/2006/wordml" xmlns:wps="http://schemas.microsoft.com/office/word/2010/wordprocessingShape" mc:Ignorable="w14 w15 w16se w16cid w16 w16cex w16sdtdh w16sdtfl w16du wp14">
   <w:endnote w:type="separator" w:id="-1">
     <w:p>
       <w:pPr>
@@ -10634,7 +10882,7 @@
 </file>
 
 <file path=word/footer1.xml><?xml version="1.0" encoding="utf-8"?>
-<w:ftr xmlns:wpc="http://schemas.microsoft.com/office/word/2010/wordprocessingCanvas" xmlns:cx="http://schemas.microsoft.com/office/drawing/2014/chartex" xmlns:cx1="http://schemas.microsoft.com/office/drawing/2015/9/8/chartex" xmlns:cx2="http://schemas.microsoft.com/office/drawing/2015/10/21/chartex" xmlns:cx3="http://schemas.microsoft.com/office/drawing/2016/5/9/chartex" xmlns:cx4="http://schemas.microsoft.com/office/drawing/2016/5/10/chartex" xmlns:cx5="http://schemas.microsoft.com/office/drawing/2016/5/11/chartex" xmlns:cx6="http://schemas.microsoft.com/office/drawing/2016/5/12/chartex" xmlns:cx7="http://schemas.microsoft.com/office/drawing/2016/5/13/chartex" xmlns:cx8="http://schemas.microsoft.com/office/drawing/2016/5/14/chartex" xmlns:mc="http://schemas.openxmlformats.org/markup-compatibility/2006" xmlns:aink="http://schemas.microsoft.com/office/drawing/2016/ink" xmlns:am3d="http://schemas.microsoft.com/office/drawing/2017/model3d" xmlns:o="urn:schemas-microsoft-com:office:office" xmlns:oel="http://schemas.microsoft.com/office/2019/extlst" xmlns:r="http://schemas.openxmlformats.org/officeDocument/2006/relationships" xmlns:m="http://schemas.openxmlformats.org/officeDocument/2006/math" xmlns:v="urn:schemas-microsoft-com:vml" xmlns:wp14="http://schemas.microsoft.com/office/word/2010/wordprocessingDrawing" xmlns:wp="http://schemas.openxmlformats.org/drawingml/2006/wordprocessingDrawing" xmlns:w10="urn:schemas-microsoft-com:office:word" xmlns:w="http://schemas.openxmlformats.org/wordprocessingml/2006/main" xmlns:w14="http://schemas.microsoft.com/office/word/2010/wordml" xmlns:w15="http://schemas.microsoft.com/office/word/2012/wordml" xmlns:w16cei="http://schemas.microsoft.com/office/word/2026/wordml/cei" xmlns:w16cex="http://schemas.microsoft.com/office/word/2018/wordml/cex" xmlns:w16cid="http://schemas.microsoft.com/office/word/2016/wordml/cid" xmlns:w16="http://schemas.microsoft.com/office/word/2018/wordml" xmlns:w16du="http://schemas.microsoft.com/office/word/2023/wordml/word16du" xmlns:w16sdtdh="http://schemas.microsoft.com/office/word/2020/wordml/sdtdatahash" xmlns:w16sdtfl="http://schemas.microsoft.com/office/word/2024/wordml/sdtformatlock" xmlns:w16se="http://schemas.microsoft.com/office/word/2015/wordml/symex" xmlns:wpg="http://schemas.microsoft.com/office/word/2010/wordprocessingGroup" xmlns:wpi="http://schemas.microsoft.com/office/word/2010/wordprocessingInk" xmlns:wne="http://schemas.microsoft.com/office/word/2006/wordml" xmlns:wps="http://schemas.microsoft.com/office/word/2010/wordprocessingShape" mc:Ignorable="w14 w15 w16se w16cid w16 w16cex w16sdtdh w16sdtfl w16du wp14">
+<w:ftr xmlns:wpc="http://schemas.microsoft.com/office/word/2010/wordprocessingCanvas" xmlns:cx="http://schemas.microsoft.com/office/drawing/2014/chartex" xmlns:cx1="http://schemas.microsoft.com/office/drawing/2015/9/8/chartex" xmlns:cx2="http://schemas.microsoft.com/office/drawing/2015/10/21/chartex" xmlns:cx3="http://schemas.microsoft.com/office/drawing/2016/5/9/chartex" xmlns:cx4="http://schemas.microsoft.com/office/drawing/2016/5/10/chartex" xmlns:cx5="http://schemas.microsoft.com/office/drawing/2016/5/11/chartex" xmlns:cx6="http://schemas.microsoft.com/office/drawing/2016/5/12/chartex" xmlns:cx7="http://schemas.microsoft.com/office/drawing/2016/5/13/chartex" xmlns:cx8="http://schemas.microsoft.com/office/drawing/2016/5/14/chartex" xmlns:mc="http://schemas.openxmlformats.org/markup-compatibility/2006" xmlns:aink="http://schemas.microsoft.com/office/drawing/2016/ink" xmlns:am3d="http://schemas.microsoft.com/office/drawing/2017/model3d" xmlns:o="urn:schemas-microsoft-com:office:office" xmlns:oel="http://schemas.microsoft.com/office/2019/extlst" xmlns:r="http://schemas.openxmlformats.org/officeDocument/2006/relationships" xmlns:m="http://schemas.openxmlformats.org/officeDocument/2006/math" xmlns:v="urn:schemas-microsoft-com:vml" xmlns:wp14="http://schemas.microsoft.com/office/word/2010/wordprocessingDrawing" xmlns:wp="http://schemas.openxmlformats.org/drawingml/2006/wordprocessingDrawing" xmlns:w10="urn:schemas-microsoft-com:office:word" xmlns:w="http://schemas.openxmlformats.org/wordprocessingml/2006/main" xmlns:w14="http://schemas.microsoft.com/office/word/2010/wordml" xmlns:w15="http://schemas.microsoft.com/office/word/2012/wordml" xmlns:w16cex="http://schemas.microsoft.com/office/word/2018/wordml/cex" xmlns:w16cid="http://schemas.microsoft.com/office/word/2016/wordml/cid" xmlns:w16="http://schemas.microsoft.com/office/word/2018/wordml" xmlns:w16du="http://schemas.microsoft.com/office/word/2023/wordml/word16du" xmlns:w16sdtdh="http://schemas.microsoft.com/office/word/2020/wordml/sdtdatahash" xmlns:w16sdtfl="http://schemas.microsoft.com/office/word/2024/wordml/sdtformatlock" xmlns:w16se="http://schemas.microsoft.com/office/word/2015/wordml/symex" xmlns:wpg="http://schemas.microsoft.com/office/word/2010/wordprocessingGroup" xmlns:wpi="http://schemas.microsoft.com/office/word/2010/wordprocessingInk" xmlns:wne="http://schemas.microsoft.com/office/word/2006/wordml" xmlns:wps="http://schemas.microsoft.com/office/word/2010/wordprocessingShape" mc:Ignorable="w14 w15 w16se w16cid w16 w16cex w16sdtdh w16sdtfl w16du wp14">
   <w:sdt>
     <w:sdtPr>
       <w:id w:val="114783488"/>
@@ -10682,7 +10930,7 @@
 </file>
 
 <file path=word/footnotes.xml><?xml version="1.0" encoding="utf-8"?>
-<w:footnotes xmlns:wpc="http://schemas.microsoft.com/office/word/2010/wordprocessingCanvas" xmlns:cx="http://schemas.microsoft.com/office/drawing/2014/chartex" xmlns:cx1="http://schemas.microsoft.com/office/drawing/2015/9/8/chartex" xmlns:cx2="http://schemas.microsoft.com/office/drawing/2015/10/21/chartex" xmlns:cx3="http://schemas.microsoft.com/office/drawing/2016/5/9/chartex" xmlns:cx4="http://schemas.microsoft.com/office/drawing/2016/5/10/chartex" xmlns:cx5="http://schemas.microsoft.com/office/drawing/2016/5/11/chartex" xmlns:cx6="http://schemas.microsoft.com/office/drawing/2016/5/12/chartex" xmlns:cx7="http://schemas.microsoft.com/office/drawing/2016/5/13/chartex" xmlns:cx8="http://schemas.microsoft.com/office/drawing/2016/5/14/chartex" xmlns:mc="http://schemas.openxmlformats.org/markup-compatibility/2006" xmlns:aink="http://schemas.microsoft.com/office/drawing/2016/ink" xmlns:am3d="http://schemas.microsoft.com/office/drawing/2017/model3d" xmlns:o="urn:schemas-microsoft-com:office:office" xmlns:oel="http://schemas.microsoft.com/office/2019/extlst" xmlns:r="http://schemas.openxmlformats.org/officeDocument/2006/relationships" xmlns:m="http://schemas.openxmlformats.org/officeDocument/2006/math" xmlns:v="urn:schemas-microsoft-com:vml" xmlns:wp14="http://schemas.microsoft.com/office/word/2010/wordprocessingDrawing" xmlns:wp="http://schemas.openxmlformats.org/drawingml/2006/wordprocessingDrawing" xmlns:w10="urn:schemas-microsoft-com:office:word" xmlns:w="http://schemas.openxmlformats.org/wordprocessingml/2006/main" xmlns:w14="http://schemas.microsoft.com/office/word/2010/wordml" xmlns:w15="http://schemas.microsoft.com/office/word/2012/wordml" xmlns:w16cei="http://schemas.microsoft.com/office/word/2026/wordml/cei" xmlns:w16cex="http://schemas.microsoft.com/office/word/2018/wordml/cex" xmlns:w16cid="http://schemas.microsoft.com/office/word/2016/wordml/cid" xmlns:w16="http://schemas.microsoft.com/office/word/2018/wordml" xmlns:w16du="http://schemas.microsoft.com/office/word/2023/wordml/word16du" xmlns:w16sdtdh="http://schemas.microsoft.com/office/word/2020/wordml/sdtdatahash" xmlns:w16sdtfl="http://schemas.microsoft.com/office/word/2024/wordml/sdtformatlock" xmlns:w16se="http://schemas.microsoft.com/office/word/2015/wordml/symex" xmlns:wpg="http://schemas.microsoft.com/office/word/2010/wordprocessingGroup" xmlns:wpi="http://schemas.microsoft.com/office/word/2010/wordprocessingInk" xmlns:wne="http://schemas.microsoft.com/office/word/2006/wordml" xmlns:wps="http://schemas.microsoft.com/office/word/2010/wordprocessingShape" mc:Ignorable="w14 w15 w16se w16cid w16 w16cex w16sdtdh w16sdtfl w16du wp14">
+<w:footnotes xmlns:wpc="http://schemas.microsoft.com/office/word/2010/wordprocessingCanvas" xmlns:cx="http://schemas.microsoft.com/office/drawing/2014/chartex" xmlns:cx1="http://schemas.microsoft.com/office/drawing/2015/9/8/chartex" xmlns:cx2="http://schemas.microsoft.com/office/drawing/2015/10/21/chartex" xmlns:cx3="http://schemas.microsoft.com/office/drawing/2016/5/9/chartex" xmlns:cx4="http://schemas.microsoft.com/office/drawing/2016/5/10/chartex" xmlns:cx5="http://schemas.microsoft.com/office/drawing/2016/5/11/chartex" xmlns:cx6="http://schemas.microsoft.com/office/drawing/2016/5/12/chartex" xmlns:cx7="http://schemas.microsoft.com/office/drawing/2016/5/13/chartex" xmlns:cx8="http://schemas.microsoft.com/office/drawing/2016/5/14/chartex" xmlns:mc="http://schemas.openxmlformats.org/markup-compatibility/2006" xmlns:aink="http://schemas.microsoft.com/office/drawing/2016/ink" xmlns:am3d="http://schemas.microsoft.com/office/drawing/2017/model3d" xmlns:o="urn:schemas-microsoft-com:office:office" xmlns:oel="http://schemas.microsoft.com/office/2019/extlst" xmlns:r="http://schemas.openxmlformats.org/officeDocument/2006/relationships" xmlns:m="http://schemas.openxmlformats.org/officeDocument/2006/math" xmlns:v="urn:schemas-microsoft-com:vml" xmlns:wp14="http://schemas.microsoft.com/office/word/2010/wordprocessingDrawing" xmlns:wp="http://schemas.openxmlformats.org/drawingml/2006/wordprocessingDrawing" xmlns:w10="urn:schemas-microsoft-com:office:word" xmlns:w="http://schemas.openxmlformats.org/wordprocessingml/2006/main" xmlns:w14="http://schemas.microsoft.com/office/word/2010/wordml" xmlns:w15="http://schemas.microsoft.com/office/word/2012/wordml" xmlns:w16cex="http://schemas.microsoft.com/office/word/2018/wordml/cex" xmlns:w16cid="http://schemas.microsoft.com/office/word/2016/wordml/cid" xmlns:w16="http://schemas.microsoft.com/office/word/2018/wordml" xmlns:w16du="http://schemas.microsoft.com/office/word/2023/wordml/word16du" xmlns:w16sdtdh="http://schemas.microsoft.com/office/word/2020/wordml/sdtdatahash" xmlns:w16sdtfl="http://schemas.microsoft.com/office/word/2024/wordml/sdtformatlock" xmlns:w16se="http://schemas.microsoft.com/office/word/2015/wordml/symex" xmlns:wpg="http://schemas.microsoft.com/office/word/2010/wordprocessingGroup" xmlns:wpi="http://schemas.microsoft.com/office/word/2010/wordprocessingInk" xmlns:wne="http://schemas.microsoft.com/office/word/2006/wordml" xmlns:wps="http://schemas.microsoft.com/office/word/2010/wordprocessingShape" mc:Ignorable="w14 w15 w16se w16cid w16 w16cex w16sdtdh w16sdtfl w16du wp14">
   <w:footnote w:type="separator" w:id="-1">
     <w:p>
       <w:pPr>
@@ -10707,7 +10955,7 @@
 </file>
 
 <file path=word/numbering.xml><?xml version="1.0" encoding="utf-8"?>
-<w:numbering xmlns:wpc="http://schemas.microsoft.com/office/word/2010/wordprocessingCanvas" xmlns:cx="http://schemas.microsoft.com/office/drawing/2014/chartex" xmlns:cx1="http://schemas.microsoft.com/office/drawing/2015/9/8/chartex" xmlns:cx2="http://schemas.microsoft.com/office/drawing/2015/10/21/chartex" xmlns:cx3="http://schemas.microsoft.com/office/drawing/2016/5/9/chartex" xmlns:cx4="http://schemas.microsoft.com/office/drawing/2016/5/10/chartex" xmlns:cx5="http://schemas.microsoft.com/office/drawing/2016/5/11/chartex" xmlns:cx6="http://schemas.microsoft.com/office/drawing/2016/5/12/chartex" xmlns:cx7="http://schemas.microsoft.com/office/drawing/2016/5/13/chartex" xmlns:cx8="http://schemas.microsoft.com/office/drawing/2016/5/14/chartex" xmlns:mc="http://schemas.openxmlformats.org/markup-compatibility/2006" xmlns:aink="http://schemas.microsoft.com/office/drawing/2016/ink" xmlns:am3d="http://schemas.microsoft.com/office/drawing/2017/model3d" xmlns:o="urn:schemas-microsoft-com:office:office" xmlns:oel="http://schemas.microsoft.com/office/2019/extlst" xmlns:r="http://schemas.openxmlformats.org/officeDocument/2006/relationships" xmlns:m="http://schemas.openxmlformats.org/officeDocument/2006/math" xmlns:v="urn:schemas-microsoft-com:vml" xmlns:wp14="http://schemas.microsoft.com/office/word/2010/wordprocessingDrawing" xmlns:wp="http://schemas.openxmlformats.org/drawingml/2006/wordprocessingDrawing" xmlns:w10="urn:schemas-microsoft-com:office:word" xmlns:w="http://schemas.openxmlformats.org/wordprocessingml/2006/main" xmlns:w14="http://schemas.microsoft.com/office/word/2010/wordml" xmlns:w15="http://schemas.microsoft.com/office/word/2012/wordml" xmlns:w16cei="http://schemas.microsoft.com/office/word/2026/wordml/cei" xmlns:w16cex="http://schemas.microsoft.com/office/word/2018/wordml/cex" xmlns:w16cid="http://schemas.microsoft.com/office/word/2016/wordml/cid" xmlns:w16="http://schemas.microsoft.com/office/word/2018/wordml" xmlns:w16du="http://schemas.microsoft.com/office/word/2023/wordml/word16du" xmlns:w16sdtdh="http://schemas.microsoft.com/office/word/2020/wordml/sdtdatahash" xmlns:w16sdtfl="http://schemas.microsoft.com/office/word/2024/wordml/sdtformatlock" xmlns:w16se="http://schemas.microsoft.com/office/word/2015/wordml/symex" xmlns:wpg="http://schemas.microsoft.com/office/word/2010/wordprocessingGroup" xmlns:wpi="http://schemas.microsoft.com/office/word/2010/wordprocessingInk" xmlns:wne="http://schemas.microsoft.com/office/word/2006/wordml" xmlns:wps="http://schemas.microsoft.com/office/word/2010/wordprocessingShape" mc:Ignorable="w14 w15 w16se w16cid w16 w16cex w16sdtdh w16sdtfl w16du wp14">
+<w:numbering xmlns:wpc="http://schemas.microsoft.com/office/word/2010/wordprocessingCanvas" xmlns:cx="http://schemas.microsoft.com/office/drawing/2014/chartex" xmlns:cx1="http://schemas.microsoft.com/office/drawing/2015/9/8/chartex" xmlns:cx2="http://schemas.microsoft.com/office/drawing/2015/10/21/chartex" xmlns:cx3="http://schemas.microsoft.com/office/drawing/2016/5/9/chartex" xmlns:cx4="http://schemas.microsoft.com/office/drawing/2016/5/10/chartex" xmlns:cx5="http://schemas.microsoft.com/office/drawing/2016/5/11/chartex" xmlns:cx6="http://schemas.microsoft.com/office/drawing/2016/5/12/chartex" xmlns:cx7="http://schemas.microsoft.com/office/drawing/2016/5/13/chartex" xmlns:cx8="http://schemas.microsoft.com/office/drawing/2016/5/14/chartex" xmlns:mc="http://schemas.openxmlformats.org/markup-compatibility/2006" xmlns:aink="http://schemas.microsoft.com/office/drawing/2016/ink" xmlns:am3d="http://schemas.microsoft.com/office/drawing/2017/model3d" xmlns:o="urn:schemas-microsoft-com:office:office" xmlns:oel="http://schemas.microsoft.com/office/2019/extlst" xmlns:r="http://schemas.openxmlformats.org/officeDocument/2006/relationships" xmlns:m="http://schemas.openxmlformats.org/officeDocument/2006/math" xmlns:v="urn:schemas-microsoft-com:vml" xmlns:wp14="http://schemas.microsoft.com/office/word/2010/wordprocessingDrawing" xmlns:wp="http://schemas.openxmlformats.org/drawingml/2006/wordprocessingDrawing" xmlns:w10="urn:schemas-microsoft-com:office:word" xmlns:w="http://schemas.openxmlformats.org/wordprocessingml/2006/main" xmlns:w14="http://schemas.microsoft.com/office/word/2010/wordml" xmlns:w15="http://schemas.microsoft.com/office/word/2012/wordml" xmlns:w16cex="http://schemas.microsoft.com/office/word/2018/wordml/cex" xmlns:w16cid="http://schemas.microsoft.com/office/word/2016/wordml/cid" xmlns:w16="http://schemas.microsoft.com/office/word/2018/wordml" xmlns:w16du="http://schemas.microsoft.com/office/word/2023/wordml/word16du" xmlns:w16sdtdh="http://schemas.microsoft.com/office/word/2020/wordml/sdtdatahash" xmlns:w16sdtfl="http://schemas.microsoft.com/office/word/2024/wordml/sdtformatlock" xmlns:w16se="http://schemas.microsoft.com/office/word/2015/wordml/symex" xmlns:wpg="http://schemas.microsoft.com/office/word/2010/wordprocessingGroup" xmlns:wpi="http://schemas.microsoft.com/office/word/2010/wordprocessingInk" xmlns:wne="http://schemas.microsoft.com/office/word/2006/wordml" xmlns:wps="http://schemas.microsoft.com/office/word/2010/wordprocessingShape" mc:Ignorable="w14 w15 w16se w16cid w16 w16cex w16sdtdh w16sdtfl w16du wp14">
   <w:numPicBullet w:numPicBulletId="0">
     <w:pict>
       <v:shapetype id="_x0000_t75" coordsize="21600,21600" o:spt="75" o:preferrelative="t" path="m@4@5l@4@11@9@11@9@5xe" filled="f" stroked="f">
@@ -11303,6 +11551,119 @@
     </w:lvl>
   </w:abstractNum>
   <w:abstractNum w:abstractNumId="5" w15:restartNumberingAfterBreak="0">
+    <w:nsid w:val="1F3E4D54"/>
+    <w:multiLevelType w:val="hybridMultilevel"/>
+    <w:tmpl w:val="B600CA88"/>
+    <w:lvl w:ilvl="0" w:tplc="04090001">
+      <w:start w:val="1"/>
+      <w:numFmt w:val="bullet"/>
+      <w:lvlText w:val=""/>
+      <w:lvlJc w:val="left"/>
+      <w:pPr>
+        <w:ind w:left="1800" w:hanging="360"/>
+      </w:pPr>
+      <w:rPr>
+        <w:rFonts w:ascii="Symbol" w:hAnsi="Symbol" w:hint="default"/>
+      </w:rPr>
+    </w:lvl>
+    <w:lvl w:ilvl="1" w:tplc="04090003" w:tentative="1">
+      <w:start w:val="1"/>
+      <w:numFmt w:val="bullet"/>
+      <w:lvlText w:val="o"/>
+      <w:lvlJc w:val="left"/>
+      <w:pPr>
+        <w:ind w:left="2520" w:hanging="360"/>
+      </w:pPr>
+      <w:rPr>
+        <w:rFonts w:ascii="Courier New" w:hAnsi="Courier New" w:cs="Courier New" w:hint="default"/>
+      </w:rPr>
+    </w:lvl>
+    <w:lvl w:ilvl="2" w:tplc="04090005" w:tentative="1">
+      <w:start w:val="1"/>
+      <w:numFmt w:val="bullet"/>
+      <w:lvlText w:val=""/>
+      <w:lvlJc w:val="left"/>
+      <w:pPr>
+        <w:ind w:left="3240" w:hanging="360"/>
+      </w:pPr>
+      <w:rPr>
+        <w:rFonts w:ascii="Wingdings" w:hAnsi="Wingdings" w:hint="default"/>
+      </w:rPr>
+    </w:lvl>
+    <w:lvl w:ilvl="3" w:tplc="04090001" w:tentative="1">
+      <w:start w:val="1"/>
+      <w:numFmt w:val="bullet"/>
+      <w:lvlText w:val=""/>
+      <w:lvlJc w:val="left"/>
+      <w:pPr>
+        <w:ind w:left="3960" w:hanging="360"/>
+      </w:pPr>
+      <w:rPr>
+        <w:rFonts w:ascii="Symbol" w:hAnsi="Symbol" w:hint="default"/>
+      </w:rPr>
+    </w:lvl>
+    <w:lvl w:ilvl="4" w:tplc="04090003" w:tentative="1">
+      <w:start w:val="1"/>
+      <w:numFmt w:val="bullet"/>
+      <w:lvlText w:val="o"/>
+      <w:lvlJc w:val="left"/>
+      <w:pPr>
+        <w:ind w:left="4680" w:hanging="360"/>
+      </w:pPr>
+      <w:rPr>
+        <w:rFonts w:ascii="Courier New" w:hAnsi="Courier New" w:cs="Courier New" w:hint="default"/>
+      </w:rPr>
+    </w:lvl>
+    <w:lvl w:ilvl="5" w:tplc="04090005" w:tentative="1">
+      <w:start w:val="1"/>
+      <w:numFmt w:val="bullet"/>
+      <w:lvlText w:val=""/>
+      <w:lvlJc w:val="left"/>
+      <w:pPr>
+        <w:ind w:left="5400" w:hanging="360"/>
+      </w:pPr>
+      <w:rPr>
+        <w:rFonts w:ascii="Wingdings" w:hAnsi="Wingdings" w:hint="default"/>
+      </w:rPr>
+    </w:lvl>
+    <w:lvl w:ilvl="6" w:tplc="04090001" w:tentative="1">
+      <w:start w:val="1"/>
+      <w:numFmt w:val="bullet"/>
+      <w:lvlText w:val=""/>
+      <w:lvlJc w:val="left"/>
+      <w:pPr>
+        <w:ind w:left="6120" w:hanging="360"/>
+      </w:pPr>
+      <w:rPr>
+        <w:rFonts w:ascii="Symbol" w:hAnsi="Symbol" w:hint="default"/>
+      </w:rPr>
+    </w:lvl>
+    <w:lvl w:ilvl="7" w:tplc="04090003" w:tentative="1">
+      <w:start w:val="1"/>
+      <w:numFmt w:val="bullet"/>
+      <w:lvlText w:val="o"/>
+      <w:lvlJc w:val="left"/>
+      <w:pPr>
+        <w:ind w:left="6840" w:hanging="360"/>
+      </w:pPr>
+      <w:rPr>
+        <w:rFonts w:ascii="Courier New" w:hAnsi="Courier New" w:cs="Courier New" w:hint="default"/>
+      </w:rPr>
+    </w:lvl>
+    <w:lvl w:ilvl="8" w:tplc="04090005" w:tentative="1">
+      <w:start w:val="1"/>
+      <w:numFmt w:val="bullet"/>
+      <w:lvlText w:val=""/>
+      <w:lvlJc w:val="left"/>
+      <w:pPr>
+        <w:ind w:left="7560" w:hanging="360"/>
+      </w:pPr>
+      <w:rPr>
+        <w:rFonts w:ascii="Wingdings" w:hAnsi="Wingdings" w:hint="default"/>
+      </w:rPr>
+    </w:lvl>
+  </w:abstractNum>
+  <w:abstractNum w:abstractNumId="6" w15:restartNumberingAfterBreak="0">
     <w:nsid w:val="216676CF"/>
     <w:multiLevelType w:val="hybridMultilevel"/>
     <w:tmpl w:val="858CED58"/>
@@ -11415,7 +11776,7 @@
       </w:rPr>
     </w:lvl>
   </w:abstractNum>
-  <w:abstractNum w:abstractNumId="6" w15:restartNumberingAfterBreak="0">
+  <w:abstractNum w:abstractNumId="7" w15:restartNumberingAfterBreak="0">
     <w:nsid w:val="23650642"/>
     <w:multiLevelType w:val="hybridMultilevel"/>
     <w:tmpl w:val="1EA89E6E"/>
@@ -11528,7 +11889,7 @@
       </w:rPr>
     </w:lvl>
   </w:abstractNum>
-  <w:abstractNum w:abstractNumId="7" w15:restartNumberingAfterBreak="0">
+  <w:abstractNum w:abstractNumId="8" w15:restartNumberingAfterBreak="0">
     <w:nsid w:val="2373206C"/>
     <w:multiLevelType w:val="hybridMultilevel"/>
     <w:tmpl w:val="4A446D6A"/>
@@ -11617,7 +11978,7 @@
       </w:pPr>
     </w:lvl>
   </w:abstractNum>
-  <w:abstractNum w:abstractNumId="8" w15:restartNumberingAfterBreak="0">
+  <w:abstractNum w:abstractNumId="9" w15:restartNumberingAfterBreak="0">
     <w:nsid w:val="25DB7E06"/>
     <w:multiLevelType w:val="hybridMultilevel"/>
     <w:tmpl w:val="82A8EC66"/>
@@ -11729,7 +12090,7 @@
       </w:rPr>
     </w:lvl>
   </w:abstractNum>
-  <w:abstractNum w:abstractNumId="9" w15:restartNumberingAfterBreak="0">
+  <w:abstractNum w:abstractNumId="10" w15:restartNumberingAfterBreak="0">
     <w:nsid w:val="3A0A52F0"/>
     <w:multiLevelType w:val="hybridMultilevel"/>
     <w:tmpl w:val="22E2A1C2"/>
@@ -11842,7 +12203,7 @@
       </w:rPr>
     </w:lvl>
   </w:abstractNum>
-  <w:abstractNum w:abstractNumId="10" w15:restartNumberingAfterBreak="0">
+  <w:abstractNum w:abstractNumId="11" w15:restartNumberingAfterBreak="0">
     <w:nsid w:val="45D36ED2"/>
     <w:multiLevelType w:val="hybridMultilevel"/>
     <w:tmpl w:val="9E04766A"/>
@@ -11955,7 +12316,7 @@
       </w:rPr>
     </w:lvl>
   </w:abstractNum>
-  <w:abstractNum w:abstractNumId="11" w15:restartNumberingAfterBreak="0">
+  <w:abstractNum w:abstractNumId="12" w15:restartNumberingAfterBreak="0">
     <w:nsid w:val="4B4C5FDB"/>
     <w:multiLevelType w:val="hybridMultilevel"/>
     <w:tmpl w:val="FDE25A4C"/>
@@ -12068,7 +12429,7 @@
       </w:rPr>
     </w:lvl>
   </w:abstractNum>
-  <w:abstractNum w:abstractNumId="12" w15:restartNumberingAfterBreak="0">
+  <w:abstractNum w:abstractNumId="13" w15:restartNumberingAfterBreak="0">
     <w:nsid w:val="4EC35CC4"/>
     <w:multiLevelType w:val="hybridMultilevel"/>
     <w:tmpl w:val="D31C7CC8"/>
@@ -12181,7 +12542,7 @@
       </w:rPr>
     </w:lvl>
   </w:abstractNum>
-  <w:abstractNum w:abstractNumId="13" w15:restartNumberingAfterBreak="0">
+  <w:abstractNum w:abstractNumId="14" w15:restartNumberingAfterBreak="0">
     <w:nsid w:val="57157B15"/>
     <w:multiLevelType w:val="hybridMultilevel"/>
     <w:tmpl w:val="A8483EB0"/>
@@ -12293,7 +12654,7 @@
       </w:rPr>
     </w:lvl>
   </w:abstractNum>
-  <w:abstractNum w:abstractNumId="14" w15:restartNumberingAfterBreak="0">
+  <w:abstractNum w:abstractNumId="15" w15:restartNumberingAfterBreak="0">
     <w:nsid w:val="6CF70148"/>
     <w:multiLevelType w:val="hybridMultilevel"/>
     <w:tmpl w:val="584CF40C"/>
@@ -12379,7 +12740,7 @@
       </w:pPr>
     </w:lvl>
   </w:abstractNum>
-  <w:abstractNum w:abstractNumId="15" w15:restartNumberingAfterBreak="0">
+  <w:abstractNum w:abstractNumId="16" w15:restartNumberingAfterBreak="0">
     <w:nsid w:val="6FE4579D"/>
     <w:multiLevelType w:val="hybridMultilevel"/>
     <w:tmpl w:val="B9848F5E"/>
@@ -12492,7 +12853,7 @@
       </w:rPr>
     </w:lvl>
   </w:abstractNum>
-  <w:abstractNum w:abstractNumId="16" w15:restartNumberingAfterBreak="0">
+  <w:abstractNum w:abstractNumId="17" w15:restartNumberingAfterBreak="0">
     <w:nsid w:val="7B511AED"/>
     <w:multiLevelType w:val="hybridMultilevel"/>
     <w:tmpl w:val="910876F4"/>
@@ -12583,55 +12944,58 @@
     </w:lvl>
   </w:abstractNum>
   <w:num w:numId="1" w16cid:durableId="1439522893">
-    <w:abstractNumId w:val="16"/>
+    <w:abstractNumId w:val="17"/>
   </w:num>
   <w:num w:numId="2" w16cid:durableId="316691248">
     <w:abstractNumId w:val="4"/>
   </w:num>
   <w:num w:numId="3" w16cid:durableId="4941123">
-    <w:abstractNumId w:val="6"/>
+    <w:abstractNumId w:val="7"/>
   </w:num>
   <w:num w:numId="4" w16cid:durableId="497774062">
+    <w:abstractNumId w:val="12"/>
+  </w:num>
+  <w:num w:numId="5" w16cid:durableId="1650598952">
     <w:abstractNumId w:val="11"/>
   </w:num>
-  <w:num w:numId="5" w16cid:durableId="1650598952">
-    <w:abstractNumId w:val="10"/>
-  </w:num>
   <w:num w:numId="6" w16cid:durableId="27487615">
-    <w:abstractNumId w:val="8"/>
+    <w:abstractNumId w:val="9"/>
   </w:num>
   <w:num w:numId="7" w16cid:durableId="1889755862">
     <w:abstractNumId w:val="0"/>
   </w:num>
   <w:num w:numId="8" w16cid:durableId="667826156">
-    <w:abstractNumId w:val="12"/>
+    <w:abstractNumId w:val="13"/>
   </w:num>
   <w:num w:numId="9" w16cid:durableId="96681281">
     <w:abstractNumId w:val="2"/>
   </w:num>
   <w:num w:numId="10" w16cid:durableId="1080518888">
-    <w:abstractNumId w:val="15"/>
+    <w:abstractNumId w:val="16"/>
   </w:num>
   <w:num w:numId="11" w16cid:durableId="1319578008">
-    <w:abstractNumId w:val="13"/>
+    <w:abstractNumId w:val="14"/>
   </w:num>
   <w:num w:numId="12" w16cid:durableId="1028531969">
     <w:abstractNumId w:val="3"/>
   </w:num>
   <w:num w:numId="13" w16cid:durableId="1503425626">
-    <w:abstractNumId w:val="14"/>
+    <w:abstractNumId w:val="15"/>
   </w:num>
   <w:num w:numId="14" w16cid:durableId="101995605">
-    <w:abstractNumId w:val="5"/>
+    <w:abstractNumId w:val="6"/>
   </w:num>
   <w:num w:numId="15" w16cid:durableId="1035689452">
-    <w:abstractNumId w:val="7"/>
+    <w:abstractNumId w:val="8"/>
   </w:num>
   <w:num w:numId="16" w16cid:durableId="1911957453">
     <w:abstractNumId w:val="1"/>
   </w:num>
   <w:num w:numId="17" w16cid:durableId="547257785">
-    <w:abstractNumId w:val="9"/>
+    <w:abstractNumId w:val="10"/>
+  </w:num>
+  <w:num w:numId="18" w16cid:durableId="2082633386">
+    <w:abstractNumId w:val="5"/>
   </w:num>
 </w:numbering>
 </file>
@@ -13062,7 +13426,6 @@
   <w:style w:type="character" w:default="1" w:styleId="DefaultParagraphFont">
     <w:name w:val="Default Paragraph Font"/>
     <w:uiPriority w:val="1"/>
-    <w:semiHidden/>
     <w:unhideWhenUsed/>
   </w:style>
   <w:style w:type="table" w:default="1" w:styleId="TableNormal">

</xml_diff>

<commit_message>
Correct hypoglossal nerve numbering in Chapter 5
</commit_message>
<xml_diff>
--- a/public/chapter-5/Chapter5 Mécanisme de Stress.docx
+++ b/public/chapter-5/Chapter5 Mécanisme de Stress.docx
@@ -651,33 +651,15 @@
           <w:sz w:val="24"/>
           <w:szCs w:val="24"/>
         </w:rPr>
-        <w:t xml:space="preserve"> dans un contexte </w:t>
-      </w:r>
-      <w:proofErr w:type="gramStart"/>
-      <w:r>
-        <w:rPr>
-          <w:rFonts w:ascii="Times New Roman" w:hAnsi="Times New Roman" w:cs="Times New Roman"/>
-          <w:sz w:val="24"/>
-          <w:szCs w:val="24"/>
-        </w:rPr>
-        <w:t>changeant.</w:t>
-      </w:r>
-      <w:r>
-        <w:rPr>
-          <w:rFonts w:ascii="Times New Roman" w:hAnsi="Times New Roman" w:cs="Times New Roman"/>
-          <w:sz w:val="24"/>
-          <w:szCs w:val="24"/>
-        </w:rPr>
-        <w:t>.</w:t>
-      </w:r>
-      <w:proofErr w:type="gramEnd"/>
-      <w:r>
-        <w:rPr>
-          <w:rFonts w:ascii="Times New Roman" w:hAnsi="Times New Roman" w:cs="Times New Roman"/>
-          <w:sz w:val="24"/>
-          <w:szCs w:val="24"/>
-        </w:rPr>
-        <w:t xml:space="preserve"> </w:t>
+        <w:t xml:space="preserve"> dans un contexte changeant.</w:t>
+      </w:r>
+      <w:r>
+        <w:rPr>
+          <w:rFonts w:ascii="Times New Roman" w:hAnsi="Times New Roman" w:cs="Times New Roman"/>
+          <w:sz w:val="24"/>
+          <w:szCs w:val="24"/>
+        </w:rPr>
+        <w:t xml:space="preserve">. </w:t>
       </w:r>
     </w:p>
     <w:p>
@@ -836,16 +818,7 @@
           <w:sz w:val="24"/>
           <w:szCs w:val="24"/>
         </w:rPr>
-        <w:t xml:space="preserve">C’est pourquoi, ce chapitre sera consacré au rôle du </w:t>
-      </w:r>
-      <w:proofErr w:type="gramStart"/>
-      <w:r>
-        <w:rPr>
-          <w:rFonts w:ascii="Times New Roman" w:hAnsi="Times New Roman" w:cs="Times New Roman"/>
-          <w:sz w:val="24"/>
-          <w:szCs w:val="24"/>
-        </w:rPr>
-        <w:t xml:space="preserve">SNA  </w:t>
+        <w:t xml:space="preserve">C’est pourquoi, ce chapitre sera consacré au rôle du SNA  </w:t>
       </w:r>
       <w:r>
         <w:rPr>
@@ -857,7 +830,6 @@
         </w:rPr>
         <w:t>(</w:t>
       </w:r>
-      <w:proofErr w:type="gramEnd"/>
       <w:r>
         <w:rPr>
           <w:rFonts w:ascii="Times New Roman" w:hAnsi="Times New Roman" w:cs="Times New Roman"/>
@@ -1153,7 +1125,6 @@
         </w:rPr>
         <w:t xml:space="preserve"> et </w:t>
       </w:r>
-      <w:proofErr w:type="gramStart"/>
       <w:r>
         <w:rPr>
           <w:rFonts w:ascii="Times New Roman" w:hAnsi="Times New Roman" w:cs="Times New Roman"/>
@@ -1168,16 +1139,7 @@
           <w:sz w:val="24"/>
           <w:szCs w:val="24"/>
         </w:rPr>
-        <w:t xml:space="preserve"> d’une</w:t>
-      </w:r>
-      <w:proofErr w:type="gramEnd"/>
-      <w:r>
-        <w:rPr>
-          <w:rFonts w:ascii="Times New Roman" w:hAnsi="Times New Roman" w:cs="Times New Roman"/>
-          <w:sz w:val="24"/>
-          <w:szCs w:val="24"/>
-        </w:rPr>
-        <w:t xml:space="preserve"> diminution des capacités d’adaptation</w:t>
+        <w:t xml:space="preserve"> d’une diminution des capacités d’adaptation</w:t>
       </w:r>
       <w:r>
         <w:rPr>
@@ -1248,21 +1210,12 @@
           <w:highlight w:val="yellow"/>
         </w:rPr>
       </w:pPr>
-      <w:proofErr w:type="spellStart"/>
       <w:r>
         <w:rPr>
           <w:color w:val="auto"/>
           <w:highlight w:val="yellow"/>
         </w:rPr>
-        <w:t>Stresseurs</w:t>
-      </w:r>
-      <w:proofErr w:type="spellEnd"/>
-      <w:r>
-        <w:rPr>
-          <w:color w:val="auto"/>
-          <w:highlight w:val="yellow"/>
-        </w:rPr>
-        <w:t> </w:t>
+        <w:t>Stresseurs </w:t>
       </w:r>
     </w:p>
     <w:p>
@@ -1297,43 +1250,7 @@
           <w:sz w:val="24"/>
           <w:szCs w:val="24"/>
         </w:rPr>
-        <w:t xml:space="preserve">e stress et </w:t>
-      </w:r>
-      <w:proofErr w:type="spellStart"/>
-      <w:r>
-        <w:rPr>
-          <w:rFonts w:ascii="Times New Roman" w:hAnsi="Times New Roman" w:cs="Times New Roman"/>
-          <w:sz w:val="24"/>
-          <w:szCs w:val="24"/>
-        </w:rPr>
-        <w:t>stresseur</w:t>
-      </w:r>
-      <w:proofErr w:type="spellEnd"/>
-      <w:r>
-        <w:rPr>
-          <w:rFonts w:ascii="Times New Roman" w:hAnsi="Times New Roman" w:cs="Times New Roman"/>
-          <w:sz w:val="24"/>
-          <w:szCs w:val="24"/>
-        </w:rPr>
-        <w:t xml:space="preserve">. Le </w:t>
-      </w:r>
-      <w:proofErr w:type="spellStart"/>
-      <w:r>
-        <w:rPr>
-          <w:rFonts w:ascii="Times New Roman" w:hAnsi="Times New Roman" w:cs="Times New Roman"/>
-          <w:sz w:val="24"/>
-          <w:szCs w:val="24"/>
-        </w:rPr>
-        <w:t>stresseur</w:t>
-      </w:r>
-      <w:proofErr w:type="spellEnd"/>
-      <w:r>
-        <w:rPr>
-          <w:rFonts w:ascii="Times New Roman" w:hAnsi="Times New Roman" w:cs="Times New Roman"/>
-          <w:sz w:val="24"/>
-          <w:szCs w:val="24"/>
-        </w:rPr>
-        <w:t xml:space="preserve"> ou agent stressant</w:t>
+        <w:t>e stress et stresseur. Le stresseur ou agent stressant</w:t>
       </w:r>
       <w:r>
         <w:rPr>
@@ -1375,25 +1292,7 @@
           <w:sz w:val="24"/>
           <w:szCs w:val="24"/>
         </w:rPr>
-        <w:t xml:space="preserve"> : les </w:t>
-      </w:r>
-      <w:proofErr w:type="spellStart"/>
-      <w:r>
-        <w:rPr>
-          <w:rFonts w:ascii="Times New Roman" w:hAnsi="Times New Roman" w:cs="Times New Roman"/>
-          <w:sz w:val="24"/>
-          <w:szCs w:val="24"/>
-        </w:rPr>
-        <w:t>stresseurs</w:t>
-      </w:r>
-      <w:proofErr w:type="spellEnd"/>
-      <w:r>
-        <w:rPr>
-          <w:rFonts w:ascii="Times New Roman" w:hAnsi="Times New Roman" w:cs="Times New Roman"/>
-          <w:sz w:val="24"/>
-          <w:szCs w:val="24"/>
-        </w:rPr>
-        <w:t xml:space="preserve"> sont des stimuli exacerbant la fonctionnalité habituelle de base d’un individu et mettant en marche</w:t>
+        <w:t> : les stresseurs sont des stimuli exacerbant la fonctionnalité habituelle de base d’un individu et mettant en marche</w:t>
       </w:r>
       <w:r>
         <w:rPr>
@@ -1487,19 +1386,8 @@
           <w:sz w:val="24"/>
           <w:szCs w:val="24"/>
         </w:rPr>
-        <w:t xml:space="preserve"> </w:t>
-      </w:r>
-      <w:proofErr w:type="spellStart"/>
-      <w:r>
-        <w:rPr>
-          <w:rFonts w:ascii="Times New Roman" w:hAnsi="Times New Roman" w:cs="Times New Roman"/>
-          <w:i/>
-          <w:sz w:val="24"/>
-          <w:szCs w:val="24"/>
-        </w:rPr>
-        <w:t>distress</w:t>
-      </w:r>
-      <w:proofErr w:type="spellEnd"/>
+        <w:t xml:space="preserve"> distress</w:t>
+      </w:r>
       <w:r>
         <w:rPr>
           <w:rFonts w:ascii="Times New Roman" w:hAnsi="Times New Roman" w:cs="Times New Roman"/>
@@ -1900,19 +1788,8 @@
           <w:sz w:val="24"/>
           <w:szCs w:val="24"/>
         </w:rPr>
-        <w:t xml:space="preserve">ypes de </w:t>
-      </w:r>
-      <w:proofErr w:type="spellStart"/>
-      <w:r>
-        <w:rPr>
-          <w:rFonts w:ascii="Times New Roman" w:hAnsi="Times New Roman" w:cs="Times New Roman"/>
-          <w:b/>
-          <w:sz w:val="24"/>
-          <w:szCs w:val="24"/>
-        </w:rPr>
-        <w:t>stresseurs</w:t>
-      </w:r>
-      <w:proofErr w:type="spellEnd"/>
+        <w:t>ypes de stresseurs</w:t>
+      </w:r>
       <w:r>
         <w:rPr>
           <w:rFonts w:ascii="Times New Roman" w:hAnsi="Times New Roman" w:cs="Times New Roman"/>
@@ -1935,25 +1812,7 @@
           <w:sz w:val="24"/>
           <w:szCs w:val="24"/>
         </w:rPr>
-        <w:t xml:space="preserve"> les </w:t>
-      </w:r>
-      <w:proofErr w:type="spellStart"/>
-      <w:r>
-        <w:rPr>
-          <w:rFonts w:ascii="Times New Roman" w:hAnsi="Times New Roman" w:cs="Times New Roman"/>
-          <w:sz w:val="24"/>
-          <w:szCs w:val="24"/>
-        </w:rPr>
-        <w:t>stresseurs</w:t>
-      </w:r>
-      <w:proofErr w:type="spellEnd"/>
-      <w:r>
-        <w:rPr>
-          <w:rFonts w:ascii="Times New Roman" w:hAnsi="Times New Roman" w:cs="Times New Roman"/>
-          <w:sz w:val="24"/>
-          <w:szCs w:val="24"/>
-        </w:rPr>
-        <w:t xml:space="preserve"> phys</w:t>
+        <w:t xml:space="preserve"> les stresseurs phys</w:t>
       </w:r>
       <w:r>
         <w:rPr>
@@ -1971,23 +1830,13 @@
         </w:rPr>
         <w:t xml:space="preserve">, les </w:t>
       </w:r>
-      <w:proofErr w:type="spellStart"/>
-      <w:r>
-        <w:rPr>
-          <w:rFonts w:ascii="Times New Roman" w:hAnsi="Times New Roman" w:cs="Times New Roman"/>
-          <w:sz w:val="24"/>
-          <w:szCs w:val="24"/>
-        </w:rPr>
-        <w:t>stresseurs</w:t>
-      </w:r>
-      <w:proofErr w:type="spellEnd"/>
-      <w:r>
-        <w:rPr>
-          <w:rFonts w:ascii="Times New Roman" w:hAnsi="Times New Roman" w:cs="Times New Roman"/>
-          <w:sz w:val="24"/>
-          <w:szCs w:val="24"/>
-        </w:rPr>
-        <w:t xml:space="preserve"> biochimiques agissent</w:t>
+      <w:r>
+        <w:rPr>
+          <w:rFonts w:ascii="Times New Roman" w:hAnsi="Times New Roman" w:cs="Times New Roman"/>
+          <w:sz w:val="24"/>
+          <w:szCs w:val="24"/>
+        </w:rPr>
+        <w:t>stresseurs biochimiques agissent</w:t>
       </w:r>
       <w:r>
         <w:rPr>
@@ -2023,51 +1872,22 @@
           <w:szCs w:val="24"/>
         </w:rPr>
       </w:pPr>
-      <w:proofErr w:type="spellStart"/>
-      <w:r>
-        <w:rPr>
-          <w:rFonts w:ascii="Times New Roman" w:hAnsi="Times New Roman" w:cs="Times New Roman"/>
-          <w:b/>
-          <w:sz w:val="24"/>
-          <w:szCs w:val="24"/>
-        </w:rPr>
-        <w:t>Stresseurs</w:t>
-      </w:r>
-      <w:proofErr w:type="spellEnd"/>
-      <w:r>
-        <w:rPr>
-          <w:rFonts w:ascii="Times New Roman" w:hAnsi="Times New Roman" w:cs="Times New Roman"/>
-          <w:b/>
-          <w:sz w:val="24"/>
-          <w:szCs w:val="24"/>
-        </w:rPr>
-        <w:t xml:space="preserve"> physiques</w:t>
-      </w:r>
-      <w:r>
-        <w:rPr>
-          <w:rFonts w:ascii="Times New Roman" w:hAnsi="Times New Roman" w:cs="Times New Roman"/>
-          <w:sz w:val="24"/>
-          <w:szCs w:val="24"/>
-        </w:rPr>
-        <w:t xml:space="preserve"> : accidents, </w:t>
-      </w:r>
-      <w:proofErr w:type="spellStart"/>
-      <w:r>
-        <w:rPr>
-          <w:rFonts w:ascii="Times New Roman" w:hAnsi="Times New Roman" w:cs="Times New Roman"/>
-          <w:sz w:val="24"/>
-          <w:szCs w:val="24"/>
-        </w:rPr>
-        <w:t>whiplashs</w:t>
-      </w:r>
-      <w:proofErr w:type="spellEnd"/>
-      <w:r>
-        <w:rPr>
-          <w:rFonts w:ascii="Times New Roman" w:hAnsi="Times New Roman" w:cs="Times New Roman"/>
-          <w:sz w:val="24"/>
-          <w:szCs w:val="24"/>
-        </w:rPr>
-        <w:t xml:space="preserve"> (type coup du lapin), excès d’activité physique ou sportive jusqu’à l’épuisement ou à l’inverse insuffisante, conditions de naissance, rythme de vie effréné, manque de sommeil, agressions sensorielles – bruit, odeur, lumière, douleur intense ou chronique, dégoût nauséeux des aliments – pollution de l’air, climats extrêmes, etc</w:t>
+      <w:r>
+        <w:rPr>
+          <w:rFonts w:ascii="Times New Roman" w:hAnsi="Times New Roman" w:cs="Times New Roman"/>
+          <w:b/>
+          <w:sz w:val="24"/>
+          <w:szCs w:val="24"/>
+        </w:rPr>
+        <w:t>Stresseurs physiques</w:t>
+      </w:r>
+      <w:r>
+        <w:rPr>
+          <w:rFonts w:ascii="Times New Roman" w:hAnsi="Times New Roman" w:cs="Times New Roman"/>
+          <w:sz w:val="24"/>
+          <w:szCs w:val="24"/>
+        </w:rPr>
+        <w:t> : accidents, whiplashs (type coup du lapin), excès d’activité physique ou sportive jusqu’à l’épuisement ou à l’inverse insuffisante, conditions de naissance, rythme de vie effréné, manque de sommeil, agressions sensorielles – bruit, odeur, lumière, douleur intense ou chronique, dégoût nauséeux des aliments – pollution de l’air, climats extrêmes, etc</w:t>
       </w:r>
       <w:r>
         <w:rPr>
@@ -2095,25 +1915,14 @@
           <w:szCs w:val="24"/>
         </w:rPr>
       </w:pPr>
-      <w:proofErr w:type="spellStart"/>
-      <w:r>
-        <w:rPr>
-          <w:rFonts w:ascii="Times New Roman" w:hAnsi="Times New Roman" w:cs="Times New Roman"/>
-          <w:b/>
-          <w:sz w:val="24"/>
-          <w:szCs w:val="24"/>
-        </w:rPr>
-        <w:t>Stresseurs</w:t>
-      </w:r>
-      <w:proofErr w:type="spellEnd"/>
-      <w:r>
-        <w:rPr>
-          <w:rFonts w:ascii="Times New Roman" w:hAnsi="Times New Roman" w:cs="Times New Roman"/>
-          <w:b/>
-          <w:sz w:val="24"/>
-          <w:szCs w:val="24"/>
-        </w:rPr>
-        <w:t xml:space="preserve"> émotionnels, psychologiques et sociaux</w:t>
+      <w:r>
+        <w:rPr>
+          <w:rFonts w:ascii="Times New Roman" w:hAnsi="Times New Roman" w:cs="Times New Roman"/>
+          <w:b/>
+          <w:sz w:val="24"/>
+          <w:szCs w:val="24"/>
+        </w:rPr>
+        <w:t>Stresseurs émotionnels, psychologiques et sociaux</w:t>
       </w:r>
       <w:r>
         <w:rPr>
@@ -2137,25 +1946,7 @@
           <w:sz w:val="24"/>
           <w:szCs w:val="24"/>
         </w:rPr>
-        <w:t xml:space="preserve">figurent parmi les </w:t>
-      </w:r>
-      <w:proofErr w:type="spellStart"/>
-      <w:r>
-        <w:rPr>
-          <w:rFonts w:ascii="Times New Roman" w:hAnsi="Times New Roman" w:cs="Times New Roman"/>
-          <w:sz w:val="24"/>
-          <w:szCs w:val="24"/>
-        </w:rPr>
-        <w:t>stresseurs</w:t>
-      </w:r>
-      <w:proofErr w:type="spellEnd"/>
-      <w:r>
-        <w:rPr>
-          <w:rFonts w:ascii="Times New Roman" w:hAnsi="Times New Roman" w:cs="Times New Roman"/>
-          <w:sz w:val="24"/>
-          <w:szCs w:val="24"/>
-        </w:rPr>
-        <w:t xml:space="preserve"> pouvant avoir un impact majeur sur la santé</w:t>
+        <w:t>figurent parmi les stresseurs pouvant avoir un impact majeur sur la santé</w:t>
       </w:r>
       <w:r>
         <w:rPr>
@@ -2211,25 +2002,7 @@
           <w:sz w:val="24"/>
           <w:szCs w:val="24"/>
         </w:rPr>
-        <w:t xml:space="preserve"> Les </w:t>
-      </w:r>
-      <w:proofErr w:type="spellStart"/>
-      <w:r>
-        <w:rPr>
-          <w:rFonts w:ascii="Times New Roman" w:hAnsi="Times New Roman" w:cs="Times New Roman"/>
-          <w:sz w:val="24"/>
-          <w:szCs w:val="24"/>
-        </w:rPr>
-        <w:t>stresseurs</w:t>
-      </w:r>
-      <w:proofErr w:type="spellEnd"/>
-      <w:r>
-        <w:rPr>
-          <w:rFonts w:ascii="Times New Roman" w:hAnsi="Times New Roman" w:cs="Times New Roman"/>
-          <w:sz w:val="24"/>
-          <w:szCs w:val="24"/>
-        </w:rPr>
-        <w:t xml:space="preserve"> les plus destructeurs, sur le plan émotionnel et psychologique, sont les abus</w:t>
+        <w:t xml:space="preserve"> Les stresseurs les plus destructeurs, sur le plan émotionnel et psychologique, sont les abus</w:t>
       </w:r>
       <w:r>
         <w:rPr>
@@ -2279,25 +2052,14 @@
           <w:szCs w:val="24"/>
         </w:rPr>
       </w:pPr>
-      <w:proofErr w:type="spellStart"/>
-      <w:r>
-        <w:rPr>
-          <w:rFonts w:ascii="Times New Roman" w:hAnsi="Times New Roman" w:cs="Times New Roman"/>
-          <w:b/>
-          <w:sz w:val="24"/>
-          <w:szCs w:val="24"/>
-        </w:rPr>
-        <w:t>Stresseurs</w:t>
-      </w:r>
-      <w:proofErr w:type="spellEnd"/>
-      <w:r>
-        <w:rPr>
-          <w:rFonts w:ascii="Times New Roman" w:hAnsi="Times New Roman" w:cs="Times New Roman"/>
-          <w:b/>
-          <w:sz w:val="24"/>
-          <w:szCs w:val="24"/>
-        </w:rPr>
-        <w:t xml:space="preserve"> biochimiques : </w:t>
+      <w:r>
+        <w:rPr>
+          <w:rFonts w:ascii="Times New Roman" w:hAnsi="Times New Roman" w:cs="Times New Roman"/>
+          <w:b/>
+          <w:sz w:val="24"/>
+          <w:szCs w:val="24"/>
+        </w:rPr>
+        <w:t xml:space="preserve">Stresseurs biochimiques : </w:t>
       </w:r>
       <w:r>
         <w:rPr>
@@ -2427,16 +2189,7 @@
           <w:sz w:val="24"/>
           <w:szCs w:val="24"/>
         </w:rPr>
-        <w:t xml:space="preserve">ce n’est pas seulement la nature du </w:t>
-      </w:r>
-      <w:proofErr w:type="spellStart"/>
-      <w:r>
-        <w:rPr>
-          <w:rFonts w:ascii="Times New Roman" w:hAnsi="Times New Roman" w:cs="Times New Roman"/>
-          <w:sz w:val="24"/>
-          <w:szCs w:val="24"/>
-        </w:rPr>
-        <w:t>st</w:t>
+        <w:t>ce n’est pas seulement la nature du st</w:t>
       </w:r>
       <w:r>
         <w:rPr>
@@ -2452,16 +2205,7 @@
           <w:sz w:val="24"/>
           <w:szCs w:val="24"/>
         </w:rPr>
-        <w:t>esseur</w:t>
-      </w:r>
-      <w:proofErr w:type="spellEnd"/>
-      <w:r>
-        <w:rPr>
-          <w:rFonts w:ascii="Times New Roman" w:hAnsi="Times New Roman" w:cs="Times New Roman"/>
-          <w:sz w:val="24"/>
-          <w:szCs w:val="24"/>
-        </w:rPr>
-        <w:t xml:space="preserve"> qui importe, mais aussi</w:t>
+        <w:t>esseur qui importe, mais aussi</w:t>
       </w:r>
       <w:r>
         <w:rPr>
@@ -2526,16 +2270,7 @@
           <w:sz w:val="24"/>
           <w:szCs w:val="24"/>
         </w:rPr>
-        <w:t xml:space="preserve">s, ce qui importe, c’est la </w:t>
-      </w:r>
-      <w:proofErr w:type="gramStart"/>
-      <w:r>
-        <w:rPr>
-          <w:rFonts w:ascii="Times New Roman" w:hAnsi="Times New Roman" w:cs="Times New Roman"/>
-          <w:sz w:val="24"/>
-          <w:szCs w:val="24"/>
-        </w:rPr>
-        <w:t>manière</w:t>
+        <w:t>s, ce qui importe, c’est la manière</w:t>
       </w:r>
       <w:r>
         <w:rPr>
@@ -2551,16 +2286,7 @@
           <w:sz w:val="24"/>
           <w:szCs w:val="24"/>
         </w:rPr>
-        <w:t xml:space="preserve"> dont</w:t>
-      </w:r>
-      <w:proofErr w:type="gramEnd"/>
-      <w:r>
-        <w:rPr>
-          <w:rFonts w:ascii="Times New Roman" w:hAnsi="Times New Roman" w:cs="Times New Roman"/>
-          <w:sz w:val="24"/>
-          <w:szCs w:val="24"/>
-        </w:rPr>
-        <w:t xml:space="preserve"> </w:t>
+        <w:t xml:space="preserve"> dont </w:t>
       </w:r>
       <w:r>
         <w:rPr>
@@ -2576,25 +2302,7 @@
           <w:sz w:val="24"/>
           <w:szCs w:val="24"/>
         </w:rPr>
-        <w:t xml:space="preserve">ute les </w:t>
-      </w:r>
-      <w:proofErr w:type="spellStart"/>
-      <w:r>
-        <w:rPr>
-          <w:rFonts w:ascii="Times New Roman" w:hAnsi="Times New Roman" w:cs="Times New Roman"/>
-          <w:sz w:val="24"/>
-          <w:szCs w:val="24"/>
-        </w:rPr>
-        <w:t>stresseurs</w:t>
-      </w:r>
-      <w:proofErr w:type="spellEnd"/>
-      <w:r>
-        <w:rPr>
-          <w:rFonts w:ascii="Times New Roman" w:hAnsi="Times New Roman" w:cs="Times New Roman"/>
-          <w:sz w:val="24"/>
-          <w:szCs w:val="24"/>
-        </w:rPr>
-        <w:t xml:space="preserve"> sur les grands systèmes qui participent au maintien</w:t>
+        <w:t>ute les stresseurs sur les grands systèmes qui participent au maintien</w:t>
       </w:r>
       <w:r>
         <w:rPr>
@@ -2717,51 +2425,15 @@
           <w:sz w:val="24"/>
           <w:szCs w:val="24"/>
         </w:rPr>
-        <w:t xml:space="preserve"> Quand l’intensité, la durée, la fréquence, l’urgence et l’inattendu des </w:t>
-      </w:r>
-      <w:proofErr w:type="spellStart"/>
-      <w:r>
-        <w:rPr>
-          <w:rFonts w:ascii="Times New Roman" w:hAnsi="Times New Roman" w:cs="Times New Roman"/>
-          <w:sz w:val="24"/>
-          <w:szCs w:val="24"/>
-        </w:rPr>
-        <w:t>stresseurs</w:t>
-      </w:r>
-      <w:proofErr w:type="spellEnd"/>
-      <w:r>
-        <w:rPr>
-          <w:rFonts w:ascii="Times New Roman" w:hAnsi="Times New Roman" w:cs="Times New Roman"/>
-          <w:sz w:val="24"/>
-          <w:szCs w:val="24"/>
-        </w:rPr>
-        <w:t xml:space="preserve"> s’accumulent, ils finissent avec le temps par fragiliser l’individu avec les effets délétères sur la santé. </w:t>
-      </w:r>
-      <w:r>
-        <w:rPr>
-          <w:rFonts w:ascii="Times New Roman" w:hAnsi="Times New Roman" w:cs="Times New Roman"/>
-          <w:sz w:val="24"/>
-          <w:szCs w:val="24"/>
-        </w:rPr>
-        <w:t xml:space="preserve">Sa vulnérabilité face aux </w:t>
-      </w:r>
-      <w:proofErr w:type="spellStart"/>
-      <w:r>
-        <w:rPr>
-          <w:rFonts w:ascii="Times New Roman" w:hAnsi="Times New Roman" w:cs="Times New Roman"/>
-          <w:sz w:val="24"/>
-          <w:szCs w:val="24"/>
-        </w:rPr>
-        <w:t>stresseurs</w:t>
-      </w:r>
-      <w:proofErr w:type="spellEnd"/>
-      <w:r>
-        <w:rPr>
-          <w:rFonts w:ascii="Times New Roman" w:hAnsi="Times New Roman" w:cs="Times New Roman"/>
-          <w:sz w:val="24"/>
-          <w:szCs w:val="24"/>
-        </w:rPr>
-        <w:t xml:space="preserve"> augmente. </w:t>
+        <w:t xml:space="preserve"> Quand l’intensité, la durée, la fréquence, l’urgence et l’inattendu des stresseurs s’accumulent, ils finissent avec le temps par fragiliser l’individu avec les effets délétères sur la santé. </w:t>
+      </w:r>
+      <w:r>
+        <w:rPr>
+          <w:rFonts w:ascii="Times New Roman" w:hAnsi="Times New Roman" w:cs="Times New Roman"/>
+          <w:sz w:val="24"/>
+          <w:szCs w:val="24"/>
+        </w:rPr>
+        <w:t xml:space="preserve">Sa vulnérabilité face aux stresseurs augmente. </w:t>
       </w:r>
       <w:r>
         <w:rPr>
@@ -2841,19 +2513,8 @@
           <w:sz w:val="24"/>
           <w:szCs w:val="24"/>
         </w:rPr>
-        <w:t xml:space="preserve"> des </w:t>
-      </w:r>
-      <w:proofErr w:type="spellStart"/>
-      <w:r>
-        <w:rPr>
-          <w:rFonts w:ascii="Times New Roman" w:hAnsi="Times New Roman" w:cs="Times New Roman"/>
-          <w:b/>
-          <w:sz w:val="24"/>
-          <w:szCs w:val="24"/>
-        </w:rPr>
-        <w:t>stresseurs</w:t>
-      </w:r>
-      <w:proofErr w:type="spellEnd"/>
+        <w:t xml:space="preserve"> des stresseurs</w:t>
+      </w:r>
       <w:r>
         <w:rPr>
           <w:rFonts w:ascii="Times New Roman" w:hAnsi="Times New Roman" w:cs="Times New Roman"/>
@@ -2878,25 +2539,7 @@
           <w:sz w:val="24"/>
           <w:szCs w:val="24"/>
         </w:rPr>
-        <w:t xml:space="preserve"> les trois types de </w:t>
-      </w:r>
-      <w:proofErr w:type="spellStart"/>
-      <w:r>
-        <w:rPr>
-          <w:rFonts w:ascii="Times New Roman" w:hAnsi="Times New Roman" w:cs="Times New Roman"/>
-          <w:sz w:val="24"/>
-          <w:szCs w:val="24"/>
-        </w:rPr>
-        <w:t>stresseurs</w:t>
-      </w:r>
-      <w:proofErr w:type="spellEnd"/>
-      <w:r>
-        <w:rPr>
-          <w:rFonts w:ascii="Times New Roman" w:hAnsi="Times New Roman" w:cs="Times New Roman"/>
-          <w:sz w:val="24"/>
-          <w:szCs w:val="24"/>
-        </w:rPr>
-        <w:t xml:space="preserve"> – physiques, émotionnels et biochimiques – interagissent entre eux</w:t>
+        <w:t xml:space="preserve"> les trois types de stresseurs – physiques, émotionnels et biochimiques – interagissent entre eux</w:t>
       </w:r>
       <w:r>
         <w:rPr>
@@ -2996,33 +2639,15 @@
           <w:sz w:val="24"/>
           <w:szCs w:val="24"/>
         </w:rPr>
-        <w:t xml:space="preserve"> Cette trilogie de </w:t>
-      </w:r>
-      <w:proofErr w:type="spellStart"/>
-      <w:r>
-        <w:rPr>
-          <w:rFonts w:ascii="Times New Roman" w:hAnsi="Times New Roman" w:cs="Times New Roman"/>
-          <w:sz w:val="24"/>
-          <w:szCs w:val="24"/>
-        </w:rPr>
-        <w:t>stres</w:t>
-      </w:r>
-      <w:r>
-        <w:rPr>
-          <w:rFonts w:ascii="Times New Roman" w:hAnsi="Times New Roman" w:cs="Times New Roman"/>
-          <w:sz w:val="24"/>
-          <w:szCs w:val="24"/>
-        </w:rPr>
-        <w:t>seurs</w:t>
-      </w:r>
-      <w:proofErr w:type="spellEnd"/>
-      <w:r>
-        <w:rPr>
-          <w:rFonts w:ascii="Times New Roman" w:hAnsi="Times New Roman" w:cs="Times New Roman"/>
-          <w:sz w:val="24"/>
-          <w:szCs w:val="24"/>
-        </w:rPr>
-        <w:t xml:space="preserve"> enfonce peut contribuer à l’installation</w:t>
+        <w:t xml:space="preserve"> Cette trilogie de stres</w:t>
+      </w:r>
+      <w:r>
+        <w:rPr>
+          <w:rFonts w:ascii="Times New Roman" w:hAnsi="Times New Roman" w:cs="Times New Roman"/>
+          <w:sz w:val="24"/>
+          <w:szCs w:val="24"/>
+        </w:rPr>
+        <w:t>seurs enfonce peut contribuer à l’installation</w:t>
       </w:r>
       <w:r>
         <w:rPr>
@@ -3344,8 +2969,6 @@
           <w:szCs w:val="24"/>
         </w:rPr>
       </w:pPr>
-      <w:proofErr w:type="spellStart"/>
-      <w:proofErr w:type="gramStart"/>
       <w:r>
         <w:rPr>
           <w:rFonts w:ascii="Times New Roman" w:hAnsi="Times New Roman" w:cs="Times New Roman"/>
@@ -3354,8 +2977,6 @@
         </w:rPr>
         <w:t>rs</w:t>
       </w:r>
-      <w:proofErr w:type="spellEnd"/>
-      <w:proofErr w:type="gramEnd"/>
     </w:p>
     <w:p>
       <w:pPr>
@@ -3466,27 +3087,7 @@
           <w:sz w:val="24"/>
           <w:szCs w:val="24"/>
         </w:rPr>
-        <w:t xml:space="preserve"> réaction immédiate aux </w:t>
-      </w:r>
-      <w:proofErr w:type="spellStart"/>
-      <w:r>
-        <w:rPr>
-          <w:rFonts w:ascii="Times New Roman" w:hAnsi="Times New Roman" w:cs="Times New Roman"/>
-          <w:b/>
-          <w:sz w:val="24"/>
-          <w:szCs w:val="24"/>
-        </w:rPr>
-        <w:t>stresseurs</w:t>
-      </w:r>
-      <w:proofErr w:type="spellEnd"/>
-      <w:r>
-        <w:rPr>
-          <w:rFonts w:ascii="Times New Roman" w:hAnsi="Times New Roman" w:cs="Times New Roman"/>
-          <w:b/>
-          <w:sz w:val="24"/>
-          <w:szCs w:val="24"/>
-        </w:rPr>
-        <w:t xml:space="preserve">, </w:t>
+        <w:t xml:space="preserve"> réaction immédiate aux stresseurs, </w:t>
       </w:r>
       <w:r>
         <w:rPr>
@@ -3921,45 +3522,14 @@
         </w:rPr>
         <w:t xml:space="preserve">axe </w:t>
       </w:r>
-      <w:proofErr w:type="spellStart"/>
-      <w:r>
-        <w:rPr>
-          <w:rFonts w:ascii="Times New Roman" w:hAnsi="Times New Roman" w:cs="Times New Roman"/>
-          <w:b/>
-          <w:sz w:val="24"/>
-          <w:szCs w:val="24"/>
-        </w:rPr>
-        <w:t>sympathico</w:t>
-      </w:r>
-      <w:proofErr w:type="spellEnd"/>
-      <w:r>
-        <w:rPr>
-          <w:rFonts w:ascii="Times New Roman" w:hAnsi="Times New Roman" w:cs="Times New Roman"/>
-          <w:b/>
-          <w:sz w:val="24"/>
-          <w:szCs w:val="24"/>
-        </w:rPr>
-        <w:t>-</w:t>
-      </w:r>
-      <w:proofErr w:type="spellStart"/>
-      <w:r>
-        <w:rPr>
-          <w:rFonts w:ascii="Times New Roman" w:hAnsi="Times New Roman" w:cs="Times New Roman"/>
-          <w:b/>
-          <w:sz w:val="24"/>
-          <w:szCs w:val="24"/>
-        </w:rPr>
-        <w:t>adrénalo</w:t>
-      </w:r>
-      <w:proofErr w:type="spellEnd"/>
-      <w:r>
-        <w:rPr>
-          <w:rFonts w:ascii="Times New Roman" w:hAnsi="Times New Roman" w:cs="Times New Roman"/>
-          <w:b/>
-          <w:sz w:val="24"/>
-          <w:szCs w:val="24"/>
-        </w:rPr>
-        <w:t>-surrénalien (SAM)</w:t>
+      <w:r>
+        <w:rPr>
+          <w:rFonts w:ascii="Times New Roman" w:hAnsi="Times New Roman" w:cs="Times New Roman"/>
+          <w:b/>
+          <w:sz w:val="24"/>
+          <w:szCs w:val="24"/>
+        </w:rPr>
+        <w:t>sympathico-adrénalo-surrénalien (SAM)</w:t>
       </w:r>
       <w:r>
         <w:rPr>
@@ -4227,153 +3797,75 @@
           <w:sz w:val="24"/>
           <w:szCs w:val="24"/>
         </w:rPr>
+        <w:t xml:space="preserve"> normotonie. D</w:t>
+      </w:r>
+      <w:r>
+        <w:rPr>
+          <w:rFonts w:ascii="Times New Roman" w:hAnsi="Times New Roman" w:cs="Times New Roman"/>
+          <w:sz w:val="24"/>
+          <w:szCs w:val="24"/>
+        </w:rPr>
+        <w:t>ans le c</w:t>
+      </w:r>
+      <w:r>
+        <w:rPr>
+          <w:rFonts w:ascii="Times New Roman" w:hAnsi="Times New Roman" w:cs="Times New Roman"/>
+          <w:sz w:val="24"/>
+          <w:szCs w:val="24"/>
+        </w:rPr>
+        <w:t>as contraire, l’hypothalamus met</w:t>
+      </w:r>
+      <w:r>
+        <w:rPr>
+          <w:rFonts w:ascii="Times New Roman" w:hAnsi="Times New Roman" w:cs="Times New Roman"/>
+          <w:sz w:val="24"/>
+          <w:szCs w:val="24"/>
+        </w:rPr>
+        <w:t xml:space="preserve"> en place, dans un se</w:t>
+      </w:r>
+      <w:r>
+        <w:rPr>
+          <w:rFonts w:ascii="Times New Roman" w:hAnsi="Times New Roman" w:cs="Times New Roman"/>
+          <w:sz w:val="24"/>
+          <w:szCs w:val="24"/>
+        </w:rPr>
+        <w:t xml:space="preserve">cond temps, </w:t>
+      </w:r>
+      <w:r>
+        <w:rPr>
+          <w:rFonts w:ascii="Times New Roman" w:hAnsi="Times New Roman" w:cs="Times New Roman"/>
+          <w:b/>
+          <w:sz w:val="24"/>
+          <w:szCs w:val="24"/>
+        </w:rPr>
+        <w:t>l’axe hormonal hypo</w:t>
+      </w:r>
+      <w:r>
+        <w:rPr>
+          <w:rFonts w:ascii="Times New Roman" w:hAnsi="Times New Roman" w:cs="Times New Roman"/>
+          <w:b/>
+          <w:sz w:val="24"/>
+          <w:szCs w:val="24"/>
+        </w:rPr>
+        <w:t>thalamo-hypophyso-surrénalien (</w:t>
+      </w:r>
+      <w:r>
+        <w:rPr>
+          <w:rFonts w:ascii="Times New Roman" w:hAnsi="Times New Roman" w:cs="Times New Roman"/>
+          <w:b/>
+          <w:sz w:val="24"/>
+          <w:szCs w:val="24"/>
+        </w:rPr>
         <w:t xml:space="preserve"> </w:t>
       </w:r>
-      <w:proofErr w:type="spellStart"/>
-      <w:r>
-        <w:rPr>
-          <w:rFonts w:ascii="Times New Roman" w:hAnsi="Times New Roman" w:cs="Times New Roman"/>
-          <w:sz w:val="24"/>
-          <w:szCs w:val="24"/>
-        </w:rPr>
-        <w:t>normotonie</w:t>
-      </w:r>
-      <w:proofErr w:type="spellEnd"/>
-      <w:r>
-        <w:rPr>
-          <w:rFonts w:ascii="Times New Roman" w:hAnsi="Times New Roman" w:cs="Times New Roman"/>
-          <w:sz w:val="24"/>
-          <w:szCs w:val="24"/>
-        </w:rPr>
-        <w:t>. D</w:t>
-      </w:r>
-      <w:r>
-        <w:rPr>
-          <w:rFonts w:ascii="Times New Roman" w:hAnsi="Times New Roman" w:cs="Times New Roman"/>
-          <w:sz w:val="24"/>
-          <w:szCs w:val="24"/>
-        </w:rPr>
-        <w:t>ans le c</w:t>
-      </w:r>
-      <w:r>
-        <w:rPr>
-          <w:rFonts w:ascii="Times New Roman" w:hAnsi="Times New Roman" w:cs="Times New Roman"/>
-          <w:sz w:val="24"/>
-          <w:szCs w:val="24"/>
-        </w:rPr>
-        <w:t>as contraire, l’hypothalamus met</w:t>
-      </w:r>
-      <w:r>
-        <w:rPr>
-          <w:rFonts w:ascii="Times New Roman" w:hAnsi="Times New Roman" w:cs="Times New Roman"/>
-          <w:sz w:val="24"/>
-          <w:szCs w:val="24"/>
-        </w:rPr>
-        <w:t xml:space="preserve"> en place, dans un se</w:t>
-      </w:r>
-      <w:r>
-        <w:rPr>
-          <w:rFonts w:ascii="Times New Roman" w:hAnsi="Times New Roman" w:cs="Times New Roman"/>
-          <w:sz w:val="24"/>
-          <w:szCs w:val="24"/>
-        </w:rPr>
-        <w:t xml:space="preserve">cond temps, </w:t>
-      </w:r>
-      <w:r>
-        <w:rPr>
-          <w:rFonts w:ascii="Times New Roman" w:hAnsi="Times New Roman" w:cs="Times New Roman"/>
-          <w:b/>
-          <w:sz w:val="24"/>
-          <w:szCs w:val="24"/>
-        </w:rPr>
-        <w:t xml:space="preserve">l’axe hormonal </w:t>
-      </w:r>
-      <w:proofErr w:type="spellStart"/>
-      <w:r>
-        <w:rPr>
-          <w:rFonts w:ascii="Times New Roman" w:hAnsi="Times New Roman" w:cs="Times New Roman"/>
-          <w:b/>
-          <w:sz w:val="24"/>
-          <w:szCs w:val="24"/>
-        </w:rPr>
-        <w:t>hypo</w:t>
-      </w:r>
-      <w:r>
-        <w:rPr>
-          <w:rFonts w:ascii="Times New Roman" w:hAnsi="Times New Roman" w:cs="Times New Roman"/>
-          <w:b/>
-          <w:sz w:val="24"/>
-          <w:szCs w:val="24"/>
-        </w:rPr>
-        <w:t>thalamo</w:t>
-      </w:r>
-      <w:proofErr w:type="spellEnd"/>
-      <w:r>
-        <w:rPr>
-          <w:rFonts w:ascii="Times New Roman" w:hAnsi="Times New Roman" w:cs="Times New Roman"/>
-          <w:b/>
-          <w:sz w:val="24"/>
-          <w:szCs w:val="24"/>
-        </w:rPr>
-        <w:t>-</w:t>
-      </w:r>
-      <w:proofErr w:type="spellStart"/>
-      <w:r>
-        <w:rPr>
-          <w:rFonts w:ascii="Times New Roman" w:hAnsi="Times New Roman" w:cs="Times New Roman"/>
-          <w:b/>
-          <w:sz w:val="24"/>
-          <w:szCs w:val="24"/>
-        </w:rPr>
-        <w:t>hypophyso</w:t>
-      </w:r>
-      <w:proofErr w:type="spellEnd"/>
-      <w:r>
-        <w:rPr>
-          <w:rFonts w:ascii="Times New Roman" w:hAnsi="Times New Roman" w:cs="Times New Roman"/>
-          <w:b/>
-          <w:sz w:val="24"/>
-          <w:szCs w:val="24"/>
-        </w:rPr>
-        <w:t xml:space="preserve">-surrénalien </w:t>
-      </w:r>
-      <w:proofErr w:type="gramStart"/>
-      <w:r>
-        <w:rPr>
-          <w:rFonts w:ascii="Times New Roman" w:hAnsi="Times New Roman" w:cs="Times New Roman"/>
-          <w:b/>
-          <w:sz w:val="24"/>
-          <w:szCs w:val="24"/>
-        </w:rPr>
-        <w:t>(</w:t>
-      </w:r>
-      <w:r>
-        <w:rPr>
-          <w:rFonts w:ascii="Times New Roman" w:hAnsi="Times New Roman" w:cs="Times New Roman"/>
-          <w:b/>
-          <w:sz w:val="24"/>
-          <w:szCs w:val="24"/>
-        </w:rPr>
-        <w:t xml:space="preserve"> </w:t>
-      </w:r>
-      <w:r>
-        <w:rPr>
-          <w:rFonts w:ascii="Times New Roman" w:hAnsi="Times New Roman" w:cs="Times New Roman"/>
-          <w:b/>
-          <w:sz w:val="24"/>
-          <w:szCs w:val="24"/>
-        </w:rPr>
-        <w:t>HHS</w:t>
-      </w:r>
-      <w:proofErr w:type="gramEnd"/>
-      <w:r>
-        <w:rPr>
-          <w:rFonts w:ascii="Times New Roman" w:hAnsi="Times New Roman" w:cs="Times New Roman"/>
-          <w:b/>
-          <w:sz w:val="24"/>
-          <w:szCs w:val="24"/>
-        </w:rPr>
-        <w:t>)</w:t>
+      <w:r>
+        <w:rPr>
+          <w:rFonts w:ascii="Times New Roman" w:hAnsi="Times New Roman" w:cs="Times New Roman"/>
+          <w:b/>
+          <w:sz w:val="24"/>
+          <w:szCs w:val="24"/>
+        </w:rPr>
+        <w:t>HHS)</w:t>
       </w:r>
       <w:r>
         <w:rPr>
@@ -4601,25 +4093,7 @@
           <w:sz w:val="24"/>
           <w:szCs w:val="24"/>
         </w:rPr>
-        <w:t xml:space="preserve"> </w:t>
-      </w:r>
-      <w:proofErr w:type="gramStart"/>
-      <w:r>
-        <w:rPr>
-          <w:rFonts w:ascii="Times New Roman" w:hAnsi="Times New Roman" w:cs="Times New Roman"/>
-          <w:sz w:val="24"/>
-          <w:szCs w:val="24"/>
-        </w:rPr>
-        <w:t>et</w:t>
-      </w:r>
-      <w:proofErr w:type="gramEnd"/>
-      <w:r>
-        <w:rPr>
-          <w:rFonts w:ascii="Times New Roman" w:hAnsi="Times New Roman" w:cs="Times New Roman"/>
-          <w:sz w:val="24"/>
-          <w:szCs w:val="24"/>
-        </w:rPr>
-        <w:t xml:space="preserve"> module la réponse immunitaire</w:t>
+        <w:t xml:space="preserve"> et module la réponse immunitaire</w:t>
       </w:r>
       <w:r>
         <w:t>.</w:t>
@@ -4784,51 +4258,15 @@
           <w:sz w:val="24"/>
           <w:szCs w:val="24"/>
         </w:rPr>
-        <w:t xml:space="preserve"> une action </w:t>
-      </w:r>
-      <w:proofErr w:type="spellStart"/>
-      <w:r>
-        <w:rPr>
-          <w:rFonts w:ascii="Times New Roman" w:hAnsi="Times New Roman" w:cs="Times New Roman"/>
-          <w:sz w:val="24"/>
-          <w:szCs w:val="24"/>
-        </w:rPr>
-        <w:t>anti-</w:t>
-      </w:r>
-      <w:proofErr w:type="gramStart"/>
-      <w:r>
-        <w:rPr>
-          <w:rFonts w:ascii="Times New Roman" w:hAnsi="Times New Roman" w:cs="Times New Roman"/>
-          <w:sz w:val="24"/>
-          <w:szCs w:val="24"/>
-        </w:rPr>
-        <w:t>vieillissem</w:t>
-      </w:r>
-      <w:r>
-        <w:rPr>
-          <w:rFonts w:ascii="Times New Roman" w:hAnsi="Times New Roman" w:cs="Times New Roman"/>
-          <w:sz w:val="24"/>
-          <w:szCs w:val="24"/>
-        </w:rPr>
-        <w:t>ent</w:t>
-      </w:r>
-      <w:proofErr w:type="spellEnd"/>
-      <w:r>
-        <w:rPr>
-          <w:rFonts w:ascii="Times New Roman" w:hAnsi="Times New Roman" w:cs="Times New Roman"/>
-          <w:sz w:val="24"/>
-          <w:szCs w:val="24"/>
-        </w:rPr>
-        <w:t xml:space="preserve">  et</w:t>
-      </w:r>
-      <w:proofErr w:type="gramEnd"/>
-      <w:r>
-        <w:rPr>
-          <w:rFonts w:ascii="Times New Roman" w:hAnsi="Times New Roman" w:cs="Times New Roman"/>
-          <w:sz w:val="24"/>
-          <w:szCs w:val="24"/>
-        </w:rPr>
-        <w:t xml:space="preserve"> anti-inflammatoire et</w:t>
+        <w:t xml:space="preserve"> une action anti-vieillissem</w:t>
+      </w:r>
+      <w:r>
+        <w:rPr>
+          <w:rFonts w:ascii="Times New Roman" w:hAnsi="Times New Roman" w:cs="Times New Roman"/>
+          <w:sz w:val="24"/>
+          <w:szCs w:val="24"/>
+        </w:rPr>
+        <w:t>ent  et anti-inflammatoire et</w:t>
       </w:r>
       <w:r>
         <w:rPr>
@@ -4909,16 +4347,7 @@
           <w:sz w:val="24"/>
           <w:szCs w:val="24"/>
         </w:rPr>
-        <w:t xml:space="preserve"> </w:t>
-      </w:r>
-      <w:proofErr w:type="gramStart"/>
-      <w:r>
-        <w:rPr>
-          <w:rFonts w:ascii="Times New Roman" w:hAnsi="Times New Roman" w:cs="Times New Roman"/>
-          <w:sz w:val="24"/>
-          <w:szCs w:val="24"/>
-        </w:rPr>
-        <w:t>l’</w:t>
+        <w:t xml:space="preserve"> l’</w:t>
       </w:r>
       <w:r>
         <w:rPr>
@@ -4934,16 +4363,7 @@
           <w:sz w:val="24"/>
           <w:szCs w:val="24"/>
         </w:rPr>
-        <w:t>e,  l’hypothalamus</w:t>
-      </w:r>
-      <w:proofErr w:type="gramEnd"/>
-      <w:r>
-        <w:rPr>
-          <w:rFonts w:ascii="Times New Roman" w:hAnsi="Times New Roman" w:cs="Times New Roman"/>
-          <w:sz w:val="24"/>
-          <w:szCs w:val="24"/>
-        </w:rPr>
-        <w:t xml:space="preserve"> et</w:t>
+        <w:t>e,  l’hypothalamus et</w:t>
       </w:r>
       <w:r>
         <w:rPr>
@@ -5320,33 +4740,15 @@
           <w:sz w:val="24"/>
           <w:szCs w:val="24"/>
         </w:rPr>
-        <w:t xml:space="preserve"> ainsi qu’une prédisposition </w:t>
-      </w:r>
-      <w:proofErr w:type="gramStart"/>
-      <w:r>
-        <w:rPr>
-          <w:rFonts w:ascii="Times New Roman" w:hAnsi="Times New Roman" w:cs="Times New Roman"/>
-          <w:sz w:val="24"/>
-          <w:szCs w:val="24"/>
-        </w:rPr>
-        <w:t xml:space="preserve">accrue </w:t>
-      </w:r>
-      <w:r>
-        <w:rPr>
-          <w:rFonts w:ascii="Times New Roman" w:hAnsi="Times New Roman" w:cs="Times New Roman"/>
-          <w:sz w:val="24"/>
-          <w:szCs w:val="24"/>
-        </w:rPr>
-        <w:t xml:space="preserve"> aux</w:t>
-      </w:r>
-      <w:proofErr w:type="gramEnd"/>
-      <w:r>
-        <w:rPr>
-          <w:rFonts w:ascii="Times New Roman" w:hAnsi="Times New Roman" w:cs="Times New Roman"/>
-          <w:sz w:val="24"/>
-          <w:szCs w:val="24"/>
-        </w:rPr>
-        <w:t xml:space="preserve"> infections. </w:t>
+        <w:t xml:space="preserve"> ainsi qu’une prédisposition accrue </w:t>
+      </w:r>
+      <w:r>
+        <w:rPr>
+          <w:rFonts w:ascii="Times New Roman" w:hAnsi="Times New Roman" w:cs="Times New Roman"/>
+          <w:sz w:val="24"/>
+          <w:szCs w:val="24"/>
+        </w:rPr>
+        <w:t xml:space="preserve"> aux infections. </w:t>
       </w:r>
     </w:p>
     <w:p>
@@ -5697,33 +5099,15 @@
           <w:sz w:val="24"/>
           <w:szCs w:val="24"/>
         </w:rPr>
-        <w:t xml:space="preserve"> à </w:t>
-      </w:r>
-      <w:proofErr w:type="gramStart"/>
-      <w:r>
-        <w:rPr>
-          <w:rFonts w:ascii="Times New Roman" w:hAnsi="Times New Roman" w:cs="Times New Roman"/>
-          <w:sz w:val="24"/>
-          <w:szCs w:val="24"/>
-        </w:rPr>
-        <w:t xml:space="preserve">l’organisme </w:t>
-      </w:r>
-      <w:r>
-        <w:rPr>
-          <w:rFonts w:ascii="Times New Roman" w:hAnsi="Times New Roman" w:cs="Times New Roman"/>
-          <w:sz w:val="24"/>
-          <w:szCs w:val="24"/>
-        </w:rPr>
-        <w:t xml:space="preserve"> la</w:t>
-      </w:r>
-      <w:proofErr w:type="gramEnd"/>
-      <w:r>
-        <w:rPr>
-          <w:rFonts w:ascii="Times New Roman" w:hAnsi="Times New Roman" w:cs="Times New Roman"/>
-          <w:sz w:val="24"/>
-          <w:szCs w:val="24"/>
-        </w:rPr>
-        <w:t xml:space="preserve"> possibilité</w:t>
+        <w:t xml:space="preserve"> à l’organisme </w:t>
+      </w:r>
+      <w:r>
+        <w:rPr>
+          <w:rFonts w:ascii="Times New Roman" w:hAnsi="Times New Roman" w:cs="Times New Roman"/>
+          <w:sz w:val="24"/>
+          <w:szCs w:val="24"/>
+        </w:rPr>
+        <w:t xml:space="preserve"> la possibilité</w:t>
       </w:r>
       <w:r>
         <w:rPr>
@@ -5809,59 +5193,23 @@
           <w:sz w:val="24"/>
           <w:szCs w:val="24"/>
         </w:rPr>
-        <w:t xml:space="preserve"> Notre technique de massage en </w:t>
-      </w:r>
-      <w:proofErr w:type="gramStart"/>
-      <w:r>
-        <w:rPr>
-          <w:rFonts w:ascii="Times New Roman" w:hAnsi="Times New Roman" w:cs="Times New Roman"/>
-          <w:sz w:val="24"/>
-          <w:szCs w:val="24"/>
-        </w:rPr>
-        <w:t xml:space="preserve">ROP </w:t>
-      </w:r>
-      <w:r>
-        <w:rPr>
-          <w:rFonts w:ascii="Times New Roman" w:hAnsi="Times New Roman" w:cs="Times New Roman"/>
-          <w:sz w:val="24"/>
-          <w:szCs w:val="24"/>
-        </w:rPr>
-        <w:t xml:space="preserve"> qu’on</w:t>
-      </w:r>
-      <w:proofErr w:type="gramEnd"/>
-      <w:r>
-        <w:rPr>
-          <w:rFonts w:ascii="Times New Roman" w:hAnsi="Times New Roman" w:cs="Times New Roman"/>
-          <w:sz w:val="24"/>
-          <w:szCs w:val="24"/>
-        </w:rPr>
-        <w:t xml:space="preserve"> peut</w:t>
-      </w:r>
-      <w:r>
-        <w:rPr>
-          <w:rFonts w:ascii="Times New Roman" w:hAnsi="Times New Roman" w:cs="Times New Roman"/>
-          <w:sz w:val="24"/>
-          <w:szCs w:val="24"/>
-        </w:rPr>
-        <w:t xml:space="preserve"> décomposer en trois temps – 1.  </w:t>
-      </w:r>
-      <w:proofErr w:type="gramStart"/>
-      <w:r>
-        <w:rPr>
-          <w:rFonts w:ascii="Times New Roman" w:hAnsi="Times New Roman" w:cs="Times New Roman"/>
-          <w:sz w:val="24"/>
-          <w:szCs w:val="24"/>
-        </w:rPr>
-        <w:t>diagnostic</w:t>
-      </w:r>
-      <w:proofErr w:type="gramEnd"/>
-      <w:r>
-        <w:rPr>
-          <w:rFonts w:ascii="Times New Roman" w:hAnsi="Times New Roman" w:cs="Times New Roman"/>
-          <w:sz w:val="24"/>
-          <w:szCs w:val="24"/>
-        </w:rPr>
-        <w:t xml:space="preserve"> tissulaire, 2.  sollicitation de la zone, 3. </w:t>
+        <w:t xml:space="preserve"> Notre technique de massage en ROP </w:t>
+      </w:r>
+      <w:r>
+        <w:rPr>
+          <w:rFonts w:ascii="Times New Roman" w:hAnsi="Times New Roman" w:cs="Times New Roman"/>
+          <w:sz w:val="24"/>
+          <w:szCs w:val="24"/>
+        </w:rPr>
+        <w:t xml:space="preserve"> qu’on peut</w:t>
+      </w:r>
+      <w:r>
+        <w:rPr>
+          <w:rFonts w:ascii="Times New Roman" w:hAnsi="Times New Roman" w:cs="Times New Roman"/>
+          <w:sz w:val="24"/>
+          <w:szCs w:val="24"/>
+        </w:rPr>
+        <w:t xml:space="preserve"> décomposer en trois temps – 1.  diagnostic tissulaire, 2.  sollicitation de la zone, 3. </w:t>
       </w:r>
       <w:r>
         <w:rPr>
@@ -5903,16 +5251,7 @@
           <w:sz w:val="24"/>
           <w:szCs w:val="24"/>
         </w:rPr>
-        <w:t xml:space="preserve"> est conforme </w:t>
-      </w:r>
-      <w:proofErr w:type="gramStart"/>
-      <w:r>
-        <w:rPr>
-          <w:rFonts w:ascii="Times New Roman" w:hAnsi="Times New Roman" w:cs="Times New Roman"/>
-          <w:sz w:val="24"/>
-          <w:szCs w:val="24"/>
-        </w:rPr>
-        <w:t xml:space="preserve">à </w:t>
+        <w:t xml:space="preserve"> est conforme à </w:t>
       </w:r>
       <w:r>
         <w:rPr>
@@ -5928,16 +5267,7 @@
           <w:sz w:val="24"/>
           <w:szCs w:val="24"/>
         </w:rPr>
-        <w:t>cette</w:t>
-      </w:r>
-      <w:proofErr w:type="gramEnd"/>
-      <w:r>
-        <w:rPr>
-          <w:rFonts w:ascii="Times New Roman" w:hAnsi="Times New Roman" w:cs="Times New Roman"/>
-          <w:sz w:val="24"/>
-          <w:szCs w:val="24"/>
-        </w:rPr>
-        <w:t xml:space="preserve"> règle</w:t>
+        <w:t>cette règle</w:t>
       </w:r>
       <w:r>
         <w:rPr>
@@ -5961,25 +5291,7 @@
           <w:sz w:val="24"/>
           <w:szCs w:val="24"/>
         </w:rPr>
-        <w:t xml:space="preserve"> par le fondateur de l’ostéopathie, le Dr A.T. Still : « sent le, </w:t>
-      </w:r>
-      <w:proofErr w:type="gramStart"/>
-      <w:r>
-        <w:rPr>
-          <w:rFonts w:ascii="Times New Roman" w:hAnsi="Times New Roman" w:cs="Times New Roman"/>
-          <w:sz w:val="24"/>
-          <w:szCs w:val="24"/>
-        </w:rPr>
-        <w:t>touche le</w:t>
-      </w:r>
-      <w:proofErr w:type="gramEnd"/>
-      <w:r>
-        <w:rPr>
-          <w:rFonts w:ascii="Times New Roman" w:hAnsi="Times New Roman" w:cs="Times New Roman"/>
-          <w:sz w:val="24"/>
-          <w:szCs w:val="24"/>
-        </w:rPr>
-        <w:t xml:space="preserve"> et laisse faire ».</w:t>
+        <w:t xml:space="preserve"> par le fondateur de l’ostéopathie, le Dr A.T. Still : « sent le, touche le et laisse faire ».</w:t>
       </w:r>
     </w:p>
     <w:p>
@@ -6073,25 +5385,7 @@
           <w:sz w:val="24"/>
           <w:szCs w:val="24"/>
         </w:rPr>
-        <w:t xml:space="preserve"> des </w:t>
-      </w:r>
-      <w:proofErr w:type="spellStart"/>
-      <w:r>
-        <w:rPr>
-          <w:rFonts w:ascii="Times New Roman" w:hAnsi="Times New Roman" w:cs="Times New Roman"/>
-          <w:sz w:val="24"/>
-          <w:szCs w:val="24"/>
-        </w:rPr>
-        <w:t>stresseurs</w:t>
-      </w:r>
-      <w:proofErr w:type="spellEnd"/>
-      <w:r>
-        <w:rPr>
-          <w:rFonts w:ascii="Times New Roman" w:hAnsi="Times New Roman" w:cs="Times New Roman"/>
-          <w:sz w:val="24"/>
-          <w:szCs w:val="24"/>
-        </w:rPr>
-        <w:t xml:space="preserve"> persistants, à moyen ou long terme. Le système sympathique est toujours présent mais moins actif que da</w:t>
+        <w:t xml:space="preserve"> des stresseurs persistants, à moyen ou long terme. Le système sympathique est toujours présent mais moins actif que da</w:t>
       </w:r>
       <w:r>
         <w:rPr>
@@ -6277,51 +5571,15 @@
           <w:sz w:val="24"/>
           <w:szCs w:val="24"/>
         </w:rPr>
-        <w:t xml:space="preserve"> l’hippocampe, l’axe </w:t>
-      </w:r>
-      <w:proofErr w:type="spellStart"/>
-      <w:r>
-        <w:rPr>
-          <w:rFonts w:ascii="Times New Roman" w:hAnsi="Times New Roman" w:cs="Times New Roman"/>
-          <w:sz w:val="24"/>
-          <w:szCs w:val="24"/>
-        </w:rPr>
-        <w:t>hypotha</w:t>
-      </w:r>
-      <w:r>
-        <w:rPr>
-          <w:rFonts w:ascii="Times New Roman" w:hAnsi="Times New Roman" w:cs="Times New Roman"/>
-          <w:sz w:val="24"/>
-          <w:szCs w:val="24"/>
-        </w:rPr>
-        <w:t>lamo</w:t>
-      </w:r>
-      <w:proofErr w:type="spellEnd"/>
-      <w:r>
-        <w:rPr>
-          <w:rFonts w:ascii="Times New Roman" w:hAnsi="Times New Roman" w:cs="Times New Roman"/>
-          <w:sz w:val="24"/>
-          <w:szCs w:val="24"/>
-        </w:rPr>
-        <w:t>-</w:t>
-      </w:r>
-      <w:proofErr w:type="spellStart"/>
-      <w:r>
-        <w:rPr>
-          <w:rFonts w:ascii="Times New Roman" w:hAnsi="Times New Roman" w:cs="Times New Roman"/>
-          <w:sz w:val="24"/>
-          <w:szCs w:val="24"/>
-        </w:rPr>
-        <w:t>hypophyso</w:t>
-      </w:r>
-      <w:proofErr w:type="spellEnd"/>
-      <w:r>
-        <w:rPr>
-          <w:rFonts w:ascii="Times New Roman" w:hAnsi="Times New Roman" w:cs="Times New Roman"/>
-          <w:sz w:val="24"/>
-          <w:szCs w:val="24"/>
-        </w:rPr>
-        <w:t>-surrénalien</w:t>
+        <w:t xml:space="preserve"> l’hippocampe, l’axe hypotha</w:t>
+      </w:r>
+      <w:r>
+        <w:rPr>
+          <w:rFonts w:ascii="Times New Roman" w:hAnsi="Times New Roman" w:cs="Times New Roman"/>
+          <w:sz w:val="24"/>
+          <w:szCs w:val="24"/>
+        </w:rPr>
+        <w:t>lamo-hypophyso-surrénalien</w:t>
       </w:r>
       <w:r>
         <w:rPr>
@@ -6887,16 +6145,7 @@
           <w:sz w:val="24"/>
           <w:szCs w:val="24"/>
         </w:rPr>
-        <w:t xml:space="preserve">tachycardie, nervosité, </w:t>
-      </w:r>
-      <w:proofErr w:type="gramStart"/>
-      <w:r>
-        <w:rPr>
-          <w:rFonts w:ascii="Times New Roman" w:hAnsi="Times New Roman" w:cs="Times New Roman"/>
-          <w:sz w:val="24"/>
-          <w:szCs w:val="24"/>
-        </w:rPr>
-        <w:t>tremblemen</w:t>
+        <w:t>tachycardie, nervosité, tremblemen</w:t>
       </w:r>
       <w:r>
         <w:rPr>
@@ -6912,16 +6161,7 @@
           <w:sz w:val="24"/>
           <w:szCs w:val="24"/>
         </w:rPr>
-        <w:t xml:space="preserve"> thermophobie</w:t>
-      </w:r>
-      <w:proofErr w:type="gramEnd"/>
-      <w:r>
-        <w:rPr>
-          <w:rFonts w:ascii="Times New Roman" w:hAnsi="Times New Roman" w:cs="Times New Roman"/>
-          <w:sz w:val="24"/>
-          <w:szCs w:val="24"/>
-        </w:rPr>
-        <w:t>, sueur profuse</w:t>
+        <w:t xml:space="preserve"> thermophobie, sueur profuse</w:t>
       </w:r>
       <w:r>
         <w:rPr>
@@ -6994,33 +6234,15 @@
           <w:sz w:val="24"/>
           <w:szCs w:val="24"/>
         </w:rPr>
-        <w:t xml:space="preserve"> </w:t>
-      </w:r>
-      <w:proofErr w:type="gramStart"/>
-      <w:r>
-        <w:rPr>
-          <w:rFonts w:ascii="Times New Roman" w:hAnsi="Times New Roman" w:cs="Times New Roman"/>
-          <w:sz w:val="24"/>
-          <w:szCs w:val="24"/>
-        </w:rPr>
-        <w:t xml:space="preserve">des </w:t>
-      </w:r>
-      <w:r>
-        <w:rPr>
-          <w:rFonts w:ascii="Times New Roman" w:hAnsi="Times New Roman" w:cs="Times New Roman"/>
-          <w:sz w:val="24"/>
-          <w:szCs w:val="24"/>
-        </w:rPr>
-        <w:t>dysménorrhée</w:t>
-      </w:r>
-      <w:proofErr w:type="gramEnd"/>
-      <w:r>
-        <w:rPr>
-          <w:rFonts w:ascii="Times New Roman" w:hAnsi="Times New Roman" w:cs="Times New Roman"/>
-          <w:sz w:val="24"/>
-          <w:szCs w:val="24"/>
-        </w:rPr>
-        <w:t xml:space="preserve">, </w:t>
+        <w:t xml:space="preserve"> des </w:t>
+      </w:r>
+      <w:r>
+        <w:rPr>
+          <w:rFonts w:ascii="Times New Roman" w:hAnsi="Times New Roman" w:cs="Times New Roman"/>
+          <w:sz w:val="24"/>
+          <w:szCs w:val="24"/>
+        </w:rPr>
+        <w:t xml:space="preserve">dysménorrhée, </w:t>
       </w:r>
       <w:r>
         <w:rPr>
@@ -7044,33 +6266,15 @@
           <w:sz w:val="24"/>
           <w:szCs w:val="24"/>
         </w:rPr>
-        <w:t xml:space="preserve"> ou </w:t>
-      </w:r>
-      <w:proofErr w:type="gramStart"/>
-      <w:r>
-        <w:rPr>
-          <w:rFonts w:ascii="Times New Roman" w:hAnsi="Times New Roman" w:cs="Times New Roman"/>
-          <w:sz w:val="24"/>
-          <w:szCs w:val="24"/>
-        </w:rPr>
-        <w:t xml:space="preserve">une </w:t>
-      </w:r>
-      <w:r>
-        <w:rPr>
-          <w:rFonts w:ascii="Times New Roman" w:hAnsi="Times New Roman" w:cs="Times New Roman"/>
-          <w:sz w:val="24"/>
-          <w:szCs w:val="24"/>
-        </w:rPr>
-        <w:t xml:space="preserve"> andropause</w:t>
-      </w:r>
-      <w:proofErr w:type="gramEnd"/>
-      <w:r>
-        <w:rPr>
-          <w:rFonts w:ascii="Times New Roman" w:hAnsi="Times New Roman" w:cs="Times New Roman"/>
-          <w:sz w:val="24"/>
-          <w:szCs w:val="24"/>
-        </w:rPr>
-        <w:t xml:space="preserve"> précoces.</w:t>
+        <w:t xml:space="preserve"> ou une </w:t>
+      </w:r>
+      <w:r>
+        <w:rPr>
+          <w:rFonts w:ascii="Times New Roman" w:hAnsi="Times New Roman" w:cs="Times New Roman"/>
+          <w:sz w:val="24"/>
+          <w:szCs w:val="24"/>
+        </w:rPr>
+        <w:t xml:space="preserve"> andropause précoces.</w:t>
       </w:r>
     </w:p>
     <w:p>
@@ -7088,70 +6292,22 @@
           <w:szCs w:val="24"/>
         </w:rPr>
       </w:pPr>
-      <w:proofErr w:type="gramStart"/>
-      <w:r>
-        <w:rPr>
-          <w:rFonts w:ascii="Times New Roman" w:hAnsi="Times New Roman" w:cs="Times New Roman"/>
-          <w:b/>
-          <w:sz w:val="24"/>
-          <w:szCs w:val="24"/>
-        </w:rPr>
-        <w:t>Différentiation  entre</w:t>
-      </w:r>
-      <w:proofErr w:type="gramEnd"/>
-      <w:r>
-        <w:rPr>
-          <w:rFonts w:ascii="Times New Roman" w:hAnsi="Times New Roman" w:cs="Times New Roman"/>
-          <w:b/>
-          <w:sz w:val="24"/>
-          <w:szCs w:val="24"/>
-        </w:rPr>
-        <w:t xml:space="preserve"> stress aigu et stress </w:t>
-      </w:r>
-      <w:proofErr w:type="gramStart"/>
-      <w:r>
-        <w:rPr>
-          <w:rFonts w:ascii="Times New Roman" w:hAnsi="Times New Roman" w:cs="Times New Roman"/>
-          <w:b/>
-          <w:sz w:val="24"/>
-          <w:szCs w:val="24"/>
-        </w:rPr>
-        <w:t xml:space="preserve">chronique </w:t>
-      </w:r>
-      <w:r>
-        <w:rPr>
-          <w:rFonts w:ascii="Times New Roman" w:hAnsi="Times New Roman" w:cs="Times New Roman"/>
-          <w:sz w:val="24"/>
-          <w:szCs w:val="24"/>
-        </w:rPr>
-        <w:t xml:space="preserve"> le</w:t>
-      </w:r>
-      <w:proofErr w:type="gramEnd"/>
-      <w:r>
-        <w:rPr>
-          <w:rFonts w:ascii="Times New Roman" w:hAnsi="Times New Roman" w:cs="Times New Roman"/>
-          <w:sz w:val="24"/>
-          <w:szCs w:val="24"/>
-        </w:rPr>
-        <w:t xml:space="preserve"> stress aigu est à la </w:t>
-      </w:r>
-      <w:proofErr w:type="gramStart"/>
-      <w:r>
-        <w:rPr>
-          <w:rFonts w:ascii="Times New Roman" w:hAnsi="Times New Roman" w:cs="Times New Roman"/>
-          <w:sz w:val="24"/>
-          <w:szCs w:val="24"/>
-        </w:rPr>
-        <w:t>fois  stimulant</w:t>
-      </w:r>
-      <w:proofErr w:type="gramEnd"/>
-      <w:r>
-        <w:rPr>
-          <w:rFonts w:ascii="Times New Roman" w:hAnsi="Times New Roman" w:cs="Times New Roman"/>
-          <w:sz w:val="24"/>
-          <w:szCs w:val="24"/>
-        </w:rPr>
-        <w:t xml:space="preserve"> et </w:t>
+      <w:r>
+        <w:rPr>
+          <w:rFonts w:ascii="Times New Roman" w:hAnsi="Times New Roman" w:cs="Times New Roman"/>
+          <w:b/>
+          <w:sz w:val="24"/>
+          <w:szCs w:val="24"/>
+        </w:rPr>
+        <w:t xml:space="preserve">Différentiation  entre stress aigu et stress chronique </w:t>
+      </w:r>
+      <w:r>
+        <w:rPr>
+          <w:rFonts w:ascii="Times New Roman" w:hAnsi="Times New Roman" w:cs="Times New Roman"/>
+          <w:sz w:val="24"/>
+          <w:szCs w:val="24"/>
+        </w:rPr>
+        <w:t xml:space="preserve"> le stress aigu est à la fois  stimulant et </w:t>
       </w:r>
       <w:r>
         <w:rPr>
@@ -7216,33 +6372,15 @@
           <w:sz w:val="24"/>
           <w:szCs w:val="24"/>
         </w:rPr>
-        <w:t xml:space="preserve">des effets </w:t>
-      </w:r>
-      <w:proofErr w:type="gramStart"/>
-      <w:r>
-        <w:rPr>
-          <w:rFonts w:ascii="Times New Roman" w:hAnsi="Times New Roman" w:cs="Times New Roman"/>
-          <w:sz w:val="24"/>
-          <w:szCs w:val="24"/>
-        </w:rPr>
-        <w:t>dé</w:t>
-      </w:r>
-      <w:r>
-        <w:rPr>
-          <w:rFonts w:ascii="Times New Roman" w:hAnsi="Times New Roman" w:cs="Times New Roman"/>
-          <w:sz w:val="24"/>
-          <w:szCs w:val="24"/>
-        </w:rPr>
-        <w:t>létères  sur</w:t>
-      </w:r>
-      <w:proofErr w:type="gramEnd"/>
-      <w:r>
-        <w:rPr>
-          <w:rFonts w:ascii="Times New Roman" w:hAnsi="Times New Roman" w:cs="Times New Roman"/>
-          <w:sz w:val="24"/>
-          <w:szCs w:val="24"/>
-        </w:rPr>
-        <w:t xml:space="preserve"> la santé physique et mentale :</w:t>
+        <w:t>des effets dé</w:t>
+      </w:r>
+      <w:r>
+        <w:rPr>
+          <w:rFonts w:ascii="Times New Roman" w:hAnsi="Times New Roman" w:cs="Times New Roman"/>
+          <w:sz w:val="24"/>
+          <w:szCs w:val="24"/>
+        </w:rPr>
+        <w:t>létères  sur la santé physique et mentale :</w:t>
       </w:r>
     </w:p>
     <w:p>
@@ -7297,33 +6435,15 @@
           <w:sz w:val="24"/>
           <w:szCs w:val="24"/>
         </w:rPr>
-        <w:t xml:space="preserve"> d’hypertension </w:t>
-      </w:r>
-      <w:proofErr w:type="gramStart"/>
-      <w:r>
-        <w:rPr>
-          <w:rFonts w:ascii="Times New Roman" w:hAnsi="Times New Roman" w:cs="Times New Roman"/>
-          <w:sz w:val="24"/>
-          <w:szCs w:val="24"/>
-        </w:rPr>
-        <w:t>artérielle </w:t>
-      </w:r>
-      <w:r>
-        <w:rPr>
-          <w:rFonts w:ascii="Times New Roman" w:hAnsi="Times New Roman" w:cs="Times New Roman"/>
-          <w:sz w:val="24"/>
-          <w:szCs w:val="24"/>
-        </w:rPr>
-        <w:t xml:space="preserve"> à</w:t>
-      </w:r>
-      <w:proofErr w:type="gramEnd"/>
-      <w:r>
-        <w:rPr>
-          <w:rFonts w:ascii="Times New Roman" w:hAnsi="Times New Roman" w:cs="Times New Roman"/>
-          <w:sz w:val="24"/>
-          <w:szCs w:val="24"/>
-        </w:rPr>
-        <w:t xml:space="preserve"> l’origine de</w:t>
+        <w:t xml:space="preserve"> d’hypertension artérielle </w:t>
+      </w:r>
+      <w:r>
+        <w:rPr>
+          <w:rFonts w:ascii="Times New Roman" w:hAnsi="Times New Roman" w:cs="Times New Roman"/>
+          <w:sz w:val="24"/>
+          <w:szCs w:val="24"/>
+        </w:rPr>
+        <w:t xml:space="preserve"> à l’origine de</w:t>
       </w:r>
       <w:r>
         <w:rPr>
@@ -7775,16 +6895,7 @@
           <w:sz w:val="24"/>
           <w:szCs w:val="24"/>
         </w:rPr>
-        <w:t>ent pas être ressenties</w:t>
-      </w:r>
-      <w:proofErr w:type="gramStart"/>
-      <w:r>
-        <w:rPr>
-          <w:rFonts w:ascii="Times New Roman" w:hAnsi="Times New Roman" w:cs="Times New Roman"/>
-          <w:sz w:val="24"/>
-          <w:szCs w:val="24"/>
-        </w:rPr>
-        <w:t xml:space="preserve">  </w:t>
+        <w:t xml:space="preserve">ent pas être ressenties  </w:t>
       </w:r>
       <w:r>
         <w:rPr>
@@ -7802,7 +6913,6 @@
         </w:rPr>
         <w:t>(</w:t>
       </w:r>
-      <w:proofErr w:type="gramEnd"/>
       <w:r>
         <w:rPr>
           <w:rFonts w:ascii="Times New Roman" w:hAnsi="Times New Roman" w:cs="Times New Roman"/>
@@ -8496,25 +7606,7 @@
           <w:sz w:val="24"/>
           <w:szCs w:val="24"/>
         </w:rPr>
-        <w:t xml:space="preserve">ose, colopathies fonctionnelles, </w:t>
-      </w:r>
-      <w:proofErr w:type="spellStart"/>
-      <w:r>
-        <w:rPr>
-          <w:rFonts w:ascii="Times New Roman" w:hAnsi="Times New Roman" w:cs="Times New Roman"/>
-          <w:sz w:val="24"/>
-          <w:szCs w:val="24"/>
-        </w:rPr>
-        <w:t>colon</w:t>
-      </w:r>
-      <w:proofErr w:type="spellEnd"/>
-      <w:r>
-        <w:rPr>
-          <w:rFonts w:ascii="Times New Roman" w:hAnsi="Times New Roman" w:cs="Times New Roman"/>
-          <w:sz w:val="24"/>
-          <w:szCs w:val="24"/>
-        </w:rPr>
-        <w:t xml:space="preserve"> irritable</w:t>
+        <w:t>ose, colopathies fonctionnelles, colon irritable</w:t>
       </w:r>
       <w:r>
         <w:rPr>
@@ -8684,25 +7776,7 @@
           <w:sz w:val="24"/>
           <w:szCs w:val="24"/>
         </w:rPr>
-        <w:t xml:space="preserve">être à bout de </w:t>
-      </w:r>
-      <w:proofErr w:type="gramStart"/>
-      <w:r>
-        <w:rPr>
-          <w:rFonts w:ascii="Times New Roman" w:hAnsi="Times New Roman" w:cs="Times New Roman"/>
-          <w:sz w:val="24"/>
-          <w:szCs w:val="24"/>
-        </w:rPr>
-        <w:t>souffle,  sont</w:t>
-      </w:r>
-      <w:proofErr w:type="gramEnd"/>
-      <w:r>
-        <w:rPr>
-          <w:rFonts w:ascii="Times New Roman" w:hAnsi="Times New Roman" w:cs="Times New Roman"/>
-          <w:sz w:val="24"/>
-          <w:szCs w:val="24"/>
-        </w:rPr>
-        <w:t xml:space="preserve"> des altérations de la respiration, retrouvées dans l’anxiété et la dépression.</w:t>
+        <w:t>être à bout de souffle,  sont des altérations de la respiration, retrouvées dans l’anxiété et la dépression.</w:t>
       </w:r>
     </w:p>
     <w:p>
@@ -8864,25 +7938,7 @@
           <w:sz w:val="24"/>
           <w:szCs w:val="24"/>
         </w:rPr>
-        <w:t xml:space="preserve">peuvent </w:t>
-      </w:r>
-      <w:proofErr w:type="gramStart"/>
-      <w:r>
-        <w:rPr>
-          <w:rFonts w:ascii="Times New Roman" w:hAnsi="Times New Roman" w:cs="Times New Roman"/>
-          <w:sz w:val="24"/>
-          <w:szCs w:val="24"/>
-        </w:rPr>
-        <w:t>toutefois  s’intégrer</w:t>
-      </w:r>
-      <w:proofErr w:type="gramEnd"/>
-      <w:r>
-        <w:rPr>
-          <w:rFonts w:ascii="Times New Roman" w:hAnsi="Times New Roman" w:cs="Times New Roman"/>
-          <w:sz w:val="24"/>
-          <w:szCs w:val="24"/>
-        </w:rPr>
-        <w:t xml:space="preserve">  aux traitements</w:t>
+        <w:t>peuvent toutefois  s’intégrer  aux traitements</w:t>
       </w:r>
       <w:r>
         <w:rPr>
@@ -9012,25 +8068,7 @@
           <w:sz w:val="24"/>
           <w:szCs w:val="24"/>
         </w:rPr>
-        <w:t xml:space="preserve">de solliciter les organes </w:t>
-      </w:r>
-      <w:proofErr w:type="spellStart"/>
-      <w:r>
-        <w:rPr>
-          <w:rFonts w:ascii="Times New Roman" w:hAnsi="Times New Roman" w:cs="Times New Roman"/>
-          <w:sz w:val="24"/>
-          <w:szCs w:val="24"/>
-        </w:rPr>
-        <w:t>émonctoriels</w:t>
-      </w:r>
-      <w:proofErr w:type="spellEnd"/>
-      <w:r>
-        <w:rPr>
-          <w:rFonts w:ascii="Times New Roman" w:hAnsi="Times New Roman" w:cs="Times New Roman"/>
-          <w:sz w:val="24"/>
-          <w:szCs w:val="24"/>
-        </w:rPr>
-        <w:t xml:space="preserve"> chargés d’éliminés la toxicité à long term</w:t>
+        <w:t>de solliciter les organes émonctoriels chargés d’éliminés la toxicité à long term</w:t>
       </w:r>
       <w:r>
         <w:rPr>
@@ -9283,25 +8321,7 @@
           <w:sz w:val="24"/>
           <w:szCs w:val="24"/>
         </w:rPr>
-        <w:t xml:space="preserve"> </w:t>
-      </w:r>
-      <w:proofErr w:type="gramStart"/>
-      <w:r>
-        <w:rPr>
-          <w:rFonts w:ascii="Times New Roman" w:hAnsi="Times New Roman" w:cs="Times New Roman"/>
-          <w:sz w:val="24"/>
-          <w:szCs w:val="24"/>
-        </w:rPr>
-        <w:t>correctement  et</w:t>
-      </w:r>
-      <w:proofErr w:type="gramEnd"/>
-      <w:r>
-        <w:rPr>
-          <w:rFonts w:ascii="Times New Roman" w:hAnsi="Times New Roman" w:cs="Times New Roman"/>
-          <w:sz w:val="24"/>
-          <w:szCs w:val="24"/>
-        </w:rPr>
-        <w:t xml:space="preserve"> d</w:t>
+        <w:t xml:space="preserve"> correctement  et d</w:t>
       </w:r>
       <w:r>
         <w:rPr>
@@ -9435,25 +8455,7 @@
           <w:sz w:val="24"/>
           <w:szCs w:val="24"/>
         </w:rPr>
-        <w:t xml:space="preserve">, </w:t>
-      </w:r>
-      <w:proofErr w:type="gramStart"/>
-      <w:r>
-        <w:rPr>
-          <w:rFonts w:ascii="Times New Roman" w:hAnsi="Times New Roman" w:cs="Times New Roman"/>
-          <w:sz w:val="24"/>
-          <w:szCs w:val="24"/>
-        </w:rPr>
-        <w:t>insuffisance  surrénalienne</w:t>
-      </w:r>
-      <w:proofErr w:type="gramEnd"/>
-      <w:r>
-        <w:rPr>
-          <w:rFonts w:ascii="Times New Roman" w:hAnsi="Times New Roman" w:cs="Times New Roman"/>
-          <w:sz w:val="24"/>
-          <w:szCs w:val="24"/>
-        </w:rPr>
-        <w:t>,</w:t>
+        <w:t>, insuffisance  surrénalienne,</w:t>
       </w:r>
       <w:r>
         <w:rPr>
@@ -10013,25 +9015,7 @@
           <w:sz w:val="24"/>
           <w:szCs w:val="24"/>
         </w:rPr>
-        <w:t xml:space="preserve">Dans la pratique ROP, la sollicitation douce des zones occipitales vise d’abord à apaiser le système avant un travail plus ciblé. Par l’intermédiaire des afférences cutanées, </w:t>
-      </w:r>
-      <w:proofErr w:type="spellStart"/>
-      <w:r>
-        <w:rPr>
-          <w:rFonts w:ascii="Times New Roman" w:hAnsi="Times New Roman" w:cs="Times New Roman"/>
-          <w:sz w:val="24"/>
-          <w:szCs w:val="24"/>
-        </w:rPr>
-        <w:t>myofasciales</w:t>
-      </w:r>
-      <w:proofErr w:type="spellEnd"/>
-      <w:r>
-        <w:rPr>
-          <w:rFonts w:ascii="Times New Roman" w:hAnsi="Times New Roman" w:cs="Times New Roman"/>
-          <w:sz w:val="24"/>
-          <w:szCs w:val="24"/>
-        </w:rPr>
-        <w:t xml:space="preserve"> et proprioceptives de la région C2–C3, elle peut contribuer à réduire l’hypervigilance, les tensions de protection, la surcharge nociceptive et l’agitation respiratoire ou émotionnelle. </w:t>
+        <w:t xml:space="preserve">Dans la pratique ROP, la sollicitation douce des zones occipitales vise d’abord à apaiser le système avant un travail plus ciblé. Par l’intermédiaire des afférences cutanées, myofasciales et proprioceptives de la région C2–C3, elle peut contribuer à réduire l’hypervigilance, les tensions de protection, la surcharge nociceptive et l’agitation respiratoire ou émotionnelle. </w:t>
       </w:r>
     </w:p>
     <w:p>
@@ -10087,7 +9071,6 @@
         </w:rPr>
         <w:t xml:space="preserve">parasympathique, orthosympathique et structurelle </w:t>
       </w:r>
-      <w:proofErr w:type="gramStart"/>
       <w:r>
         <w:rPr>
           <w:rFonts w:ascii="Times New Roman" w:hAnsi="Times New Roman" w:cs="Times New Roman"/>
@@ -10102,16 +9085,7 @@
           <w:sz w:val="24"/>
           <w:szCs w:val="24"/>
         </w:rPr>
-        <w:t xml:space="preserve"> restent</w:t>
-      </w:r>
-      <w:proofErr w:type="gramEnd"/>
-      <w:r>
-        <w:rPr>
-          <w:rFonts w:ascii="Times New Roman" w:hAnsi="Times New Roman" w:cs="Times New Roman"/>
-          <w:sz w:val="24"/>
-          <w:szCs w:val="24"/>
-        </w:rPr>
-        <w:t xml:space="preserve"> des repères cliniques dont les qualités de palpation peuvent varier selon le niveau de stress et l’état d’adaptation du patient. </w:t>
+        <w:t xml:space="preserve"> restent des repères cliniques dont les qualités de palpation peuvent varier selon le niveau de stress et l’état d’adaptation du patient. </w:t>
       </w:r>
     </w:p>
     <w:p>
@@ -10274,7 +9248,23 @@
           <w:sz w:val="24"/>
           <w:szCs w:val="24"/>
         </w:rPr>
-        <w:t>ague X, Hypoglosse XI, C2 et C3</w:t>
+        <w:t>ague X, Hypoglosse X</w:t>
+      </w:r>
+      <w:r>
+        <w:rPr>
+          <w:rFonts w:ascii="Times New Roman" w:hAnsi="Times New Roman" w:cs="Times New Roman"/>
+          <w:sz w:val="24"/>
+          <w:szCs w:val="24"/>
+        </w:rPr>
+        <w:t>I</w:t>
+      </w:r>
+      <w:r>
+        <w:rPr>
+          <w:rFonts w:ascii="Times New Roman" w:hAnsi="Times New Roman" w:cs="Times New Roman"/>
+          <w:sz w:val="24"/>
+          <w:szCs w:val="24"/>
+        </w:rPr>
+        <w:t>I, C2 et C3</w:t>
       </w:r>
       <w:r>
         <w:rPr>
@@ -10504,19 +9494,8 @@
           <w:sz w:val="24"/>
           <w:szCs w:val="24"/>
         </w:rPr>
-        <w:t xml:space="preserve">Triangle de </w:t>
-      </w:r>
-      <w:proofErr w:type="spellStart"/>
-      <w:r>
-        <w:rPr>
-          <w:rFonts w:ascii="Times New Roman" w:hAnsi="Times New Roman" w:cs="Times New Roman"/>
-          <w:b/>
-          <w:sz w:val="24"/>
-          <w:szCs w:val="24"/>
-        </w:rPr>
-        <w:t>Sédillot</w:t>
-      </w:r>
-      <w:proofErr w:type="spellEnd"/>
+        <w:t>Triangle de Sédillot</w:t>
+      </w:r>
       <w:r>
         <w:rPr>
           <w:rFonts w:ascii="Times New Roman" w:hAnsi="Times New Roman" w:cs="Times New Roman"/>
@@ -10644,25 +9623,7 @@
           <w:sz w:val="24"/>
           <w:szCs w:val="24"/>
         </w:rPr>
-        <w:t xml:space="preserve">compression mécanique locale du système nerveux somatique </w:t>
-      </w:r>
-      <w:proofErr w:type="gramStart"/>
-      <w:r>
-        <w:rPr>
-          <w:rFonts w:ascii="Times New Roman" w:hAnsi="Times New Roman" w:cs="Times New Roman"/>
-          <w:sz w:val="24"/>
-          <w:szCs w:val="24"/>
-        </w:rPr>
-        <w:t>ou  autonome</w:t>
-      </w:r>
-      <w:proofErr w:type="gramEnd"/>
-      <w:r>
-        <w:rPr>
-          <w:rFonts w:ascii="Times New Roman" w:hAnsi="Times New Roman" w:cs="Times New Roman"/>
-          <w:sz w:val="24"/>
-          <w:szCs w:val="24"/>
-        </w:rPr>
-        <w:t xml:space="preserve"> avec retentissement secondaire général.</w:t>
+        <w:t>compression mécanique locale du système nerveux somatique ou  autonome avec retentissement secondaire général.</w:t>
       </w:r>
       <w:r>
         <w:rPr>
@@ -10721,25 +9682,7 @@
           <w:sz w:val="24"/>
           <w:szCs w:val="24"/>
         </w:rPr>
-        <w:t xml:space="preserve"> d’un nerf. (</w:t>
-      </w:r>
-      <w:proofErr w:type="gramStart"/>
-      <w:r>
-        <w:rPr>
-          <w:rFonts w:ascii="Times New Roman" w:hAnsi="Times New Roman" w:cs="Times New Roman"/>
-          <w:sz w:val="24"/>
-          <w:szCs w:val="24"/>
-        </w:rPr>
-        <w:t>ex</w:t>
-      </w:r>
-      <w:proofErr w:type="gramEnd"/>
-      <w:r>
-        <w:rPr>
-          <w:rFonts w:ascii="Times New Roman" w:hAnsi="Times New Roman" w:cs="Times New Roman"/>
-          <w:sz w:val="24"/>
-          <w:szCs w:val="24"/>
-        </w:rPr>
-        <w:t xml:space="preserve"> : compression traumatique du ganglion cervical inférieur par blocage C7/D1/1ère côte. Conséquence : facilitation sympathiqu</w:t>
+        <w:t xml:space="preserve"> d’un nerf. (ex : compression traumatique du ganglion cervical inférieur par blocage C7/D1/1ère côte. Conséquence : facilitation sympathiqu</w:t>
       </w:r>
       <w:r>
         <w:rPr>
@@ -13426,6 +12369,7 @@
   <w:style w:type="character" w:default="1" w:styleId="DefaultParagraphFont">
     <w:name w:val="Default Paragraph Font"/>
     <w:uiPriority w:val="1"/>
+    <w:semiHidden/>
     <w:unhideWhenUsed/>
   </w:style>
   <w:style w:type="table" w:default="1" w:styleId="TableNormal">

</xml_diff>